<commit_message>
Adicionando selecao de tipo de pessoa, mascara dinamica e padronizacao de cores
Co-authored-by: Cursor <cursoragent@cursor.com>
</commit_message>
<xml_diff>
--- a/Prompt.docx
+++ b/Prompt.docx
@@ -7,7 +7,7 @@
       <w:r>
         <w:t xml:space="preserve">Acesso Notebook: </w:t>
       </w:r>
-      <w:hyperlink r:id="rId4" w:history="1">
+      <w:hyperlink r:id="rId5" w:history="1">
         <w:r>
           <w:rPr>
             <w:rStyle w:val="Hyperlink"/>
@@ -20,7 +20,7 @@
       <w:r>
         <w:t xml:space="preserve">Acesso Celular: </w:t>
       </w:r>
-      <w:hyperlink r:id="rId5" w:history="1">
+      <w:hyperlink r:id="rId6" w:history="1">
         <w:r>
           <w:rPr>
             <w:rStyle w:val="Hyperlink"/>
@@ -39,31 +39,61 @@
     </w:p>
     <w:p>
       <w:r>
+        <w:t>GitHub (e executar no Cursos)</w:t>
+      </w:r>
+    </w:p>
+    <w:p>
+      <w:r>
+        <w:t xml:space="preserve">git remote add origin </w:t>
+      </w:r>
+      <w:r>
+        <w:t>https://github.com/iandreao/gigaeletro.git</w:t>
+      </w:r>
+    </w:p>
+    <w:p>
+      <w:r>
+        <w:t>git push -u origin main</w:t>
+      </w:r>
+    </w:p>
+    <w:p>
+      <w:r>
+        <w:t>git config --global user.email "</w:t>
+      </w:r>
+      <w:r>
+        <w:t>iandreao1308@gmail</w:t>
+      </w:r>
+      <w:r>
+        <w:t>.com"</w:t>
+      </w:r>
+    </w:p>
+    <w:p>
+      <w:r>
+        <w:t xml:space="preserve">Link acesso: </w:t>
+      </w:r>
+      <w:hyperlink r:id="rId7" w:history="1">
+        <w:r>
+          <w:rPr>
+            <w:rStyle w:val="Hyperlink"/>
+          </w:rPr>
+          <w:t>https://gigaeletro.vercel.app/</w:t>
+        </w:r>
+      </w:hyperlink>
+    </w:p>
+    <w:p/>
+    <w:p>
+      <w:r>
         <w:t>CRIAR SITEGIGAELETRO</w:t>
       </w:r>
     </w:p>
     <w:p>
       <w:r>
-        <w:t xml:space="preserve">Nome da empresa: </w:t>
-      </w:r>
-      <w:proofErr w:type="spellStart"/>
-      <w:r>
-        <w:t>Gigaeletro</w:t>
-      </w:r>
-      <w:proofErr w:type="spellEnd"/>
-      <w:r>
-        <w:t xml:space="preserve"> Comércio de Material Elétrico Ltda</w:t>
-      </w:r>
-    </w:p>
-    <w:p>
-      <w:r>
-        <w:t xml:space="preserve">Nome de Fantasia: </w:t>
-      </w:r>
-      <w:proofErr w:type="spellStart"/>
-      <w:r>
-        <w:t>Gigaeletro</w:t>
-      </w:r>
-      <w:proofErr w:type="spellEnd"/>
+        <w:t>Nome da empresa: Gigaeletro Comércio de Material Elétrico Ltda</w:t>
+      </w:r>
+    </w:p>
+    <w:p>
+      <w:r>
+        <w:t>Nome de Fantasia: Gigaeletro</w:t>
+      </w:r>
     </w:p>
     <w:p>
       <w:r>
@@ -117,7 +147,7 @@
                     </pic:cNvPicPr>
                   </pic:nvPicPr>
                   <pic:blipFill>
-                    <a:blip r:embed="rId6" cstate="print">
+                    <a:blip r:embed="rId8" cstate="print">
                       <a:extLst>
                         <a:ext uri="{28A0092B-C50C-407E-A947-70E740481C1C}">
                           <a14:useLocalDpi xmlns:a14="http://schemas.microsoft.com/office/drawing/2010/main" val="0"/>
@@ -160,134 +190,316 @@
     <w:p/>
     <w:p>
       <w:r>
-        <w:t>CONTEXTO DE RETOMADA - PROJETO GIGAELETRO</w:t>
+        <w:t>CONTEXTO DE RETOMADA - SITE GIGAELETRO (PRODUÇÃO VERCEL)</w:t>
       </w:r>
     </w:p>
     <w:p/>
     <w:p>
       <w:r>
-        <w:t>1. O que já foi feito e validado:</w:t>
-      </w:r>
-    </w:p>
-    <w:p>
-      <w:r>
-        <w:t>- O catálogo público está rodando localmente (porta 8765) com 5.476 produtos carregados da planilha.</w:t>
-      </w:r>
-    </w:p>
-    <w:p>
-      <w:r>
-        <w:t>- O layout foi otimizado para linhas horizontais compactas (sem a tarja verde), exibindo Nome, Preço, Código e Estoque de forma leve.</w:t>
-      </w:r>
-    </w:p>
-    <w:p>
-      <w:r>
-        <w:t>- A inclusão no orçamento foi travada exclusivamente no botão "+ Adicionar" da direita (o clique no nome foi removido).</w:t>
-      </w:r>
-    </w:p>
-    <w:p>
-      <w:r>
-        <w:t>- O painel lateral de orçamento (</w:t>
-      </w:r>
-      <w:proofErr w:type="spellStart"/>
-      <w:r>
-        <w:t>Sidebar</w:t>
-      </w:r>
-      <w:proofErr w:type="spellEnd"/>
-      <w:r>
-        <w:t xml:space="preserve">) está fixo na direita exibindo Código, Nome, </w:t>
-      </w:r>
-      <w:proofErr w:type="spellStart"/>
-      <w:r>
-        <w:t>Qtd</w:t>
-      </w:r>
-      <w:proofErr w:type="spellEnd"/>
-      <w:r>
-        <w:t xml:space="preserve"> (editável), Preço Unitário e Valor Total por item em tempo real.</w:t>
-      </w:r>
-    </w:p>
-    <w:p>
-      <w:r>
-        <w:t>- A Área Restrita (/admin-estoque) está protegida por pop-up com a senha "GigaAdmin2026".</w:t>
-      </w:r>
-    </w:p>
+        <w:t>1. Status Atual do Projeto:</w:t>
+      </w:r>
+    </w:p>
+    <w:p>
+      <w:r>
+        <w:t>- O site está 100% publicado e online na Vercel através do link: gigaeletro.vercel.app.</w:t>
+      </w:r>
+    </w:p>
+    <w:p>
+      <w:r>
+        <w:t>- A navegação, o catálogo com 5.476 itens e o painel de "Seu orçamento" lateral estão funcionando no computador e no celular.</w:t>
+      </w:r>
+    </w:p>
+    <w:p/>
     <w:p>
       <w:r>
         <w:lastRenderedPageBreak/>
-        <w:t>- Configurada a lógica de "Substituição Total": ao subir um novo Excel/CSV, o banco limpa 100% dos dados antigos e mostra o retângulo amarelo de auditoria apenas após o sucesso. O botão "Sair" limpa a tela e desvia para a Home pública.</w:t>
+        <w:t>2. Próximos Ajustes Planejados (Para quando retornar):</w:t>
+      </w:r>
+    </w:p>
+    <w:p>
+      <w:r>
+        <w:t>- Revisar a experiência de uso prática e responsiva diretamente no celular.</w:t>
+      </w:r>
+    </w:p>
+    <w:p>
+      <w:r>
+        <w:t>- Refinar ou testar o comportamento do upload da planilha (.csv) na Área Restrita dentro do ambiente da Vercel (gravação temporária em /tmp).</w:t>
+      </w:r>
+    </w:p>
+    <w:p>
+      <w:r>
+        <w:t>- Ajustar qualquer detalhe fino de cores, botões ou o comportamento final do envio do pedido para o WhatsApp.</w:t>
       </w:r>
     </w:p>
     <w:p/>
     <w:p>
       <w:r>
-        <w:t>2. Decisão Estratégica Tomada:</w:t>
-      </w:r>
-    </w:p>
-    <w:p>
-      <w:r>
-        <w:t xml:space="preserve">- Rejeitamos links locais para o celular. Vamos seguir pelo caminho mais profissional: </w:t>
-      </w:r>
-      <w:proofErr w:type="spellStart"/>
-      <w:r>
-        <w:t>Deploy</w:t>
-      </w:r>
-      <w:proofErr w:type="spellEnd"/>
-      <w:r>
-        <w:t xml:space="preserve"> Definitivo na Nuvem utilizando a plataforma RENDER integrada ao GITHUB (gratuito e estável 24h).</w:t>
-      </w:r>
-    </w:p>
-    <w:p>
-      <w:r>
-        <w:t>- O Cursor já foi instruído a preparar o 'requirements.txt' e ajustar a porta dinâmica no 'servidor.py'.</w:t>
+        <w:t>Retomando os trabalhos</w:t>
+      </w:r>
+      <w:r>
+        <w:t>, peço avaliar e opinar sobre as seguintes propostas de ajustes:</w:t>
+      </w:r>
+    </w:p>
+    <w:p>
+      <w:r>
+        <w:t>COR PREDOMINANTE DO SITE:</w:t>
+      </w:r>
+    </w:p>
+    <w:p>
+      <w:r>
+        <w:t xml:space="preserve">1) A cor predominante da Gigaeletro é o amarelo. Colocar um fundo amarelo com contorno suave na cor preta imaginamos que ficará muito bom – vamos testar. </w:t>
+      </w:r>
+    </w:p>
+    <w:p>
+      <w:r>
+        <w:t>IDENTIFICAÇÃO DO CLIENTE:</w:t>
+      </w:r>
+    </w:p>
+    <w:p>
+      <w:r>
+        <w:t>2) A identificação do cliente na geração do orçamento é necessária para alimentar o sistema gestor. Criar campos para informar: Nome; CPF/CNPF, Endereço; Número; Bairro; Cidade; Estado e CEP - (se CPF, validar se é válido; se CNPJ, acessar a Receita Federal e já trazer o endereço); e Telefone</w:t>
+      </w:r>
+      <w:r>
+        <w:t>.</w:t>
+      </w:r>
+    </w:p>
+    <w:p>
+      <w:r>
+        <w:t>GERAR ARQUIVO PDF:</w:t>
+      </w:r>
+    </w:p>
+    <w:p>
+      <w:r>
+        <w:t xml:space="preserve">3) </w:t>
+      </w:r>
+      <w:r>
+        <w:t>O envio do orçamento no</w:t>
+      </w:r>
+      <w:r>
+        <w:t xml:space="preserve"> Whatsapp </w:t>
+      </w:r>
+      <w:r>
+        <w:t>não traz uma boa visualização, inclusive, tem a facilidade de ser alterada. Ao enviar o orçamento, gerar arquivo PDF e enviar via whatsapp em anexo, com a seguintes mensagem:</w:t>
+      </w:r>
+    </w:p>
+    <w:p>
+      <w:r>
+        <w:t>Olá!!</w:t>
+      </w:r>
+    </w:p>
+    <w:p>
+      <w:r>
+        <w:t>Segue orçamento no valor de R$ zzz.zzy,yy, cujos itens estão listados no anexo.</w:t>
+      </w:r>
+    </w:p>
+    <w:p>
+      <w:r>
+        <w:t xml:space="preserve">Aguardamos o retorno. Desde já agradecemos a atenção de sempre. </w:t>
       </w:r>
     </w:p>
     <w:p/>
     <w:p>
       <w:r>
-        <w:t>3. Próximos Passos para Amanhã:</w:t>
-      </w:r>
-    </w:p>
-    <w:p>
-      <w:r>
-        <w:t xml:space="preserve">- Validar se o Cursor estruturou corretamente os arquivos para o </w:t>
-      </w:r>
-      <w:proofErr w:type="spellStart"/>
-      <w:r>
-        <w:t>deploy</w:t>
-      </w:r>
-      <w:proofErr w:type="spellEnd"/>
-      <w:r>
-        <w:t xml:space="preserve"> (requirements.txt e as variáveis de ambiente no servidor.py).</w:t>
-      </w:r>
-    </w:p>
-    <w:p>
-      <w:r>
-        <w:t>- Fazer o '</w:t>
-      </w:r>
-      <w:proofErr w:type="spellStart"/>
-      <w:r>
-        <w:t>git</w:t>
-      </w:r>
-      <w:proofErr w:type="spellEnd"/>
-      <w:r>
-        <w:t xml:space="preserve"> </w:t>
-      </w:r>
-      <w:proofErr w:type="spellStart"/>
-      <w:r>
-        <w:t>push</w:t>
-      </w:r>
-      <w:proofErr w:type="spellEnd"/>
-      <w:r>
-        <w:t>' do código atualizado para o repositório do GitHub.</w:t>
-      </w:r>
-    </w:p>
-    <w:p>
-      <w:r>
-        <w:t>- Criar a conta no Render.com e conectar o repositório para gerar o link público final 'https://gigaeletro.onrender.com'.</w:t>
-      </w:r>
-    </w:p>
-    <w:p>
-      <w:r>
-        <w:t>- Testar o comportamento do upload da planilha e o envio do orçamento para o WhatsApp diretamente pela tela do celular.</w:t>
+        <w:t>Fulano de Tal</w:t>
+      </w:r>
+      <w:r>
+        <w:t xml:space="preserve"> – Contato: (xx)xxxxx-xxxx</w:t>
+      </w:r>
+    </w:p>
+    <w:p>
+      <w:r>
+        <w:t>Leiaute do Pedido de Orçamento.</w:t>
+      </w:r>
+    </w:p>
+    <w:p>
+      <w:r>
+        <w:lastRenderedPageBreak/>
+        <w:drawing>
+          <wp:inline distT="0" distB="0" distL="0" distR="0" wp14:anchorId="7817BC4A" wp14:editId="3066F77F">
+            <wp:extent cx="5400040" cy="3644900"/>
+            <wp:effectExtent l="0" t="0" r="0" b="0"/>
+            <wp:docPr id="515555239" name="Imagem 1"/>
+            <wp:cNvGraphicFramePr>
+              <a:graphicFrameLocks xmlns:a="http://schemas.openxmlformats.org/drawingml/2006/main" noChangeAspect="1"/>
+            </wp:cNvGraphicFramePr>
+            <a:graphic xmlns:a="http://schemas.openxmlformats.org/drawingml/2006/main">
+              <a:graphicData uri="http://schemas.openxmlformats.org/drawingml/2006/picture">
+                <pic:pic xmlns:pic="http://schemas.openxmlformats.org/drawingml/2006/picture">
+                  <pic:nvPicPr>
+                    <pic:cNvPr id="515555239" name=""/>
+                    <pic:cNvPicPr/>
+                  </pic:nvPicPr>
+                  <pic:blipFill>
+                    <a:blip r:embed="rId9"/>
+                    <a:stretch>
+                      <a:fillRect/>
+                    </a:stretch>
+                  </pic:blipFill>
+                  <pic:spPr>
+                    <a:xfrm>
+                      <a:off x="0" y="0"/>
+                      <a:ext cx="5400040" cy="3644900"/>
+                    </a:xfrm>
+                    <a:prstGeom prst="rect">
+                      <a:avLst/>
+                    </a:prstGeom>
+                  </pic:spPr>
+                </pic:pic>
+              </a:graphicData>
+            </a:graphic>
+          </wp:inline>
+        </w:drawing>
+      </w:r>
+    </w:p>
+    <w:p>
+      <w:r>
+        <w:t>Ajustes:</w:t>
+      </w:r>
+    </w:p>
+    <w:p>
+      <w:pPr>
+        <w:pStyle w:val="PargrafodaLista"/>
+        <w:numPr>
+          <w:ilvl w:val="0"/>
+          <w:numId w:val="1"/>
+        </w:numPr>
+      </w:pPr>
+      <w:r>
+        <w:t>Não está validando o nr do CPF;</w:t>
+      </w:r>
+    </w:p>
+    <w:p>
+      <w:pPr>
+        <w:pStyle w:val="PargrafodaLista"/>
+        <w:numPr>
+          <w:ilvl w:val="0"/>
+          <w:numId w:val="1"/>
+        </w:numPr>
+      </w:pPr>
+      <w:r>
+        <w:t>Na digitação editar o campo CPF/CNPJ;</w:t>
+      </w:r>
+    </w:p>
+    <w:p>
+      <w:pPr>
+        <w:pStyle w:val="PargrafodaLista"/>
+        <w:numPr>
+          <w:ilvl w:val="0"/>
+          <w:numId w:val="1"/>
+        </w:numPr>
+      </w:pPr>
+      <w:r>
+        <w:t xml:space="preserve">A tela para coletar os dados cliente está sobrepondo o orçamento. Sugiro que essa tela para coletar os dados do cliente, seja deslocada para a esquerda acima do botão “Ver Catálogo de Produtos”. Excluir “---VENDA NOVA DO IMIGRANTE”; e subir as duas frases imediatamente abaixo desse texto excluído; descer o botão </w:t>
+      </w:r>
+      <w:r>
+        <w:t>“Ver Catálogo de Produtos”</w:t>
+      </w:r>
+      <w:r>
+        <w:t xml:space="preserve"> para o final da cor amarela.</w:t>
+      </w:r>
+    </w:p>
+    <w:p>
+      <w:pPr>
+        <w:pStyle w:val="PargrafodaLista"/>
+        <w:numPr>
+          <w:ilvl w:val="0"/>
+          <w:numId w:val="1"/>
+        </w:numPr>
+      </w:pPr>
+      <w:r>
+        <w:t xml:space="preserve">Alterar o botão “Enviar Orçamento para o Whatsapp” para </w:t>
+      </w:r>
+      <w:r>
+        <w:t>“Enviar Orçamento</w:t>
+      </w:r>
+      <w:r>
+        <w:t>”;</w:t>
+      </w:r>
+    </w:p>
+    <w:p>
+      <w:pPr>
+        <w:pStyle w:val="PargrafodaLista"/>
+        <w:numPr>
+          <w:ilvl w:val="0"/>
+          <w:numId w:val="1"/>
+        </w:numPr>
+      </w:pPr>
+      <w:r>
+        <w:t>Enquanto o cliente não preencher os seus dados</w:t>
+      </w:r>
+      <w:r>
+        <w:t xml:space="preserve"> e não tiver nenhum item no Orçamento</w:t>
+      </w:r>
+      <w:r>
+        <w:t xml:space="preserve">, não liberar o botão </w:t>
+      </w:r>
+      <w:r>
+        <w:t>“Enviar Orçamento”</w:t>
+      </w:r>
+    </w:p>
+    <w:p>
+      <w:r>
+        <w:t>Ajustes:</w:t>
+      </w:r>
+    </w:p>
+    <w:p>
+      <w:pPr>
+        <w:pStyle w:val="PargrafodaLista"/>
+        <w:numPr>
+          <w:ilvl w:val="0"/>
+          <w:numId w:val="2"/>
+        </w:numPr>
+      </w:pPr>
+      <w:r>
+        <w:t xml:space="preserve">O botão </w:t>
+      </w:r>
+      <w:r>
+        <w:t>“Enviar Orçamento”</w:t>
+      </w:r>
+      <w:r>
+        <w:t xml:space="preserve"> deve ser ativado ao ser adicionado um item</w:t>
+      </w:r>
+      <w:r>
+        <w:t>;</w:t>
+      </w:r>
+    </w:p>
+    <w:p>
+      <w:pPr>
+        <w:pStyle w:val="PargrafodaLista"/>
+        <w:numPr>
+          <w:ilvl w:val="0"/>
+          <w:numId w:val="2"/>
+        </w:numPr>
+      </w:pPr>
+      <w:r>
+        <w:t>Acho que para permitir máscara para edição do</w:t>
+      </w:r>
+      <w:r>
+        <w:t xml:space="preserve"> CPF/CNPJ</w:t>
+      </w:r>
+      <w:r>
+        <w:t>, tem que incluir um campo para selecionar o “Tipo de Pessoa” – se PF, edição para CPF e se PJ, edição para CNPJ;</w:t>
+      </w:r>
+    </w:p>
+    <w:p>
+      <w:pPr>
+        <w:pStyle w:val="PargrafodaLista"/>
+        <w:numPr>
+          <w:ilvl w:val="0"/>
+          <w:numId w:val="2"/>
+        </w:numPr>
+      </w:pPr>
+      <w:r>
+        <w:t xml:space="preserve">Colocar a mesma do botão “Ver Catálogo de Produtos” para </w:t>
+      </w:r>
+      <w:r>
+        <w:t xml:space="preserve">o botão </w:t>
+      </w:r>
+      <w:r>
+        <w:t>“Enviar Orçamento”</w:t>
+      </w:r>
+      <w:r>
+        <w:t>;</w:t>
       </w:r>
     </w:p>
     <w:sectPr>
@@ -298,6 +510,195 @@
     </w:sectPr>
   </w:body>
 </w:document>
+</file>
+
+<file path=word/numbering.xml><?xml version="1.0" encoding="utf-8"?>
+<w:numbering xmlns:wpc="http://schemas.microsoft.com/office/word/2010/wordprocessingCanvas" xmlns:cx="http://schemas.microsoft.com/office/drawing/2014/chartex" xmlns:cx1="http://schemas.microsoft.com/office/drawing/2015/9/8/chartex" xmlns:cx2="http://schemas.microsoft.com/office/drawing/2015/10/21/chartex" xmlns:cx3="http://schemas.microsoft.com/office/drawing/2016/5/9/chartex" xmlns:cx4="http://schemas.microsoft.com/office/drawing/2016/5/10/chartex" xmlns:cx5="http://schemas.microsoft.com/office/drawing/2016/5/11/chartex" xmlns:cx6="http://schemas.microsoft.com/office/drawing/2016/5/12/chartex" xmlns:cx7="http://schemas.microsoft.com/office/drawing/2016/5/13/chartex" xmlns:cx8="http://schemas.microsoft.com/office/drawing/2016/5/14/chartex" xmlns:mc="http://schemas.openxmlformats.org/markup-compatibility/2006" xmlns:aink="http://schemas.microsoft.com/office/drawing/2016/ink" xmlns:am3d="http://schemas.microsoft.com/office/drawing/2017/model3d" xmlns:o="urn:schemas-microsoft-com:office:office" xmlns:oel="http://schemas.microsoft.com/office/2019/extlst" xmlns:r="http://schemas.openxmlformats.org/officeDocument/2006/relationships" xmlns:m="http://schemas.openxmlformats.org/officeDocument/2006/math" xmlns:v="urn:schemas-microsoft-com:vml" xmlns:wp14="http://schemas.microsoft.com/office/word/2010/wordprocessingDrawing" xmlns:wp="http://schemas.openxmlformats.org/drawingml/2006/wordprocessingDrawing" xmlns:w10="urn:schemas-microsoft-com:office:word" xmlns:w="http://schemas.openxmlformats.org/wordprocessingml/2006/main" xmlns:w14="http://schemas.microsoft.com/office/word/2010/wordml" xmlns:w15="http://schemas.microsoft.com/office/word/2012/wordml" xmlns:w16cex="http://schemas.microsoft.com/office/word/2018/wordml/cex" xmlns:w16cid="http://schemas.microsoft.com/office/word/2016/wordml/cid" xmlns:w16="http://schemas.microsoft.com/office/word/2018/wordml" xmlns:w16du="http://schemas.microsoft.com/office/word/2023/wordml/word16du" xmlns:w16sdtdh="http://schemas.microsoft.com/office/word/2020/wordml/sdtdatahash" xmlns:w16sdtfl="http://schemas.microsoft.com/office/word/2024/wordml/sdtformatlock" xmlns:w16se="http://schemas.microsoft.com/office/word/2015/wordml/symex" xmlns:wpg="http://schemas.microsoft.com/office/word/2010/wordprocessingGroup" xmlns:wpi="http://schemas.microsoft.com/office/word/2010/wordprocessingInk" xmlns:wne="http://schemas.microsoft.com/office/word/2006/wordml" xmlns:wps="http://schemas.microsoft.com/office/word/2010/wordprocessingShape" mc:Ignorable="w14 w15 w16se w16cid w16 w16cex w16sdtdh w16sdtfl w16du wp14">
+  <w:abstractNum w:abstractNumId="0" w15:restartNumberingAfterBreak="0">
+    <w:nsid w:val="2D0960C6"/>
+    <w:multiLevelType w:val="hybridMultilevel"/>
+    <w:tmpl w:val="4508B070"/>
+    <w:lvl w:ilvl="0" w:tplc="04160011">
+      <w:start w:val="1"/>
+      <w:numFmt w:val="decimal"/>
+      <w:lvlText w:val="%1)"/>
+      <w:lvlJc w:val="left"/>
+      <w:pPr>
+        <w:ind w:left="720" w:hanging="360"/>
+      </w:pPr>
+      <w:rPr>
+        <w:rFonts w:hint="default"/>
+      </w:rPr>
+    </w:lvl>
+    <w:lvl w:ilvl="1" w:tplc="04160019" w:tentative="1">
+      <w:start w:val="1"/>
+      <w:numFmt w:val="lowerLetter"/>
+      <w:lvlText w:val="%2."/>
+      <w:lvlJc w:val="left"/>
+      <w:pPr>
+        <w:ind w:left="1440" w:hanging="360"/>
+      </w:pPr>
+    </w:lvl>
+    <w:lvl w:ilvl="2" w:tplc="0416001B" w:tentative="1">
+      <w:start w:val="1"/>
+      <w:numFmt w:val="lowerRoman"/>
+      <w:lvlText w:val="%3."/>
+      <w:lvlJc w:val="right"/>
+      <w:pPr>
+        <w:ind w:left="2160" w:hanging="180"/>
+      </w:pPr>
+    </w:lvl>
+    <w:lvl w:ilvl="3" w:tplc="0416000F" w:tentative="1">
+      <w:start w:val="1"/>
+      <w:numFmt w:val="decimal"/>
+      <w:lvlText w:val="%4."/>
+      <w:lvlJc w:val="left"/>
+      <w:pPr>
+        <w:ind w:left="2880" w:hanging="360"/>
+      </w:pPr>
+    </w:lvl>
+    <w:lvl w:ilvl="4" w:tplc="04160019" w:tentative="1">
+      <w:start w:val="1"/>
+      <w:numFmt w:val="lowerLetter"/>
+      <w:lvlText w:val="%5."/>
+      <w:lvlJc w:val="left"/>
+      <w:pPr>
+        <w:ind w:left="3600" w:hanging="360"/>
+      </w:pPr>
+    </w:lvl>
+    <w:lvl w:ilvl="5" w:tplc="0416001B" w:tentative="1">
+      <w:start w:val="1"/>
+      <w:numFmt w:val="lowerRoman"/>
+      <w:lvlText w:val="%6."/>
+      <w:lvlJc w:val="right"/>
+      <w:pPr>
+        <w:ind w:left="4320" w:hanging="180"/>
+      </w:pPr>
+    </w:lvl>
+    <w:lvl w:ilvl="6" w:tplc="0416000F" w:tentative="1">
+      <w:start w:val="1"/>
+      <w:numFmt w:val="decimal"/>
+      <w:lvlText w:val="%7."/>
+      <w:lvlJc w:val="left"/>
+      <w:pPr>
+        <w:ind w:left="5040" w:hanging="360"/>
+      </w:pPr>
+    </w:lvl>
+    <w:lvl w:ilvl="7" w:tplc="04160019" w:tentative="1">
+      <w:start w:val="1"/>
+      <w:numFmt w:val="lowerLetter"/>
+      <w:lvlText w:val="%8."/>
+      <w:lvlJc w:val="left"/>
+      <w:pPr>
+        <w:ind w:left="5760" w:hanging="360"/>
+      </w:pPr>
+    </w:lvl>
+    <w:lvl w:ilvl="8" w:tplc="0416001B" w:tentative="1">
+      <w:start w:val="1"/>
+      <w:numFmt w:val="lowerRoman"/>
+      <w:lvlText w:val="%9."/>
+      <w:lvlJc w:val="right"/>
+      <w:pPr>
+        <w:ind w:left="6480" w:hanging="180"/>
+      </w:pPr>
+    </w:lvl>
+  </w:abstractNum>
+  <w:abstractNum w:abstractNumId="1" w15:restartNumberingAfterBreak="0">
+    <w:nsid w:val="3C3737E7"/>
+    <w:multiLevelType w:val="hybridMultilevel"/>
+    <w:tmpl w:val="50A0703C"/>
+    <w:lvl w:ilvl="0" w:tplc="04160011">
+      <w:start w:val="1"/>
+      <w:numFmt w:val="decimal"/>
+      <w:lvlText w:val="%1)"/>
+      <w:lvlJc w:val="left"/>
+      <w:pPr>
+        <w:ind w:left="720" w:hanging="360"/>
+      </w:pPr>
+      <w:rPr>
+        <w:rFonts w:hint="default"/>
+      </w:rPr>
+    </w:lvl>
+    <w:lvl w:ilvl="1" w:tplc="04160019" w:tentative="1">
+      <w:start w:val="1"/>
+      <w:numFmt w:val="lowerLetter"/>
+      <w:lvlText w:val="%2."/>
+      <w:lvlJc w:val="left"/>
+      <w:pPr>
+        <w:ind w:left="1440" w:hanging="360"/>
+      </w:pPr>
+    </w:lvl>
+    <w:lvl w:ilvl="2" w:tplc="0416001B" w:tentative="1">
+      <w:start w:val="1"/>
+      <w:numFmt w:val="lowerRoman"/>
+      <w:lvlText w:val="%3."/>
+      <w:lvlJc w:val="right"/>
+      <w:pPr>
+        <w:ind w:left="2160" w:hanging="180"/>
+      </w:pPr>
+    </w:lvl>
+    <w:lvl w:ilvl="3" w:tplc="0416000F" w:tentative="1">
+      <w:start w:val="1"/>
+      <w:numFmt w:val="decimal"/>
+      <w:lvlText w:val="%4."/>
+      <w:lvlJc w:val="left"/>
+      <w:pPr>
+        <w:ind w:left="2880" w:hanging="360"/>
+      </w:pPr>
+    </w:lvl>
+    <w:lvl w:ilvl="4" w:tplc="04160019" w:tentative="1">
+      <w:start w:val="1"/>
+      <w:numFmt w:val="lowerLetter"/>
+      <w:lvlText w:val="%5."/>
+      <w:lvlJc w:val="left"/>
+      <w:pPr>
+        <w:ind w:left="3600" w:hanging="360"/>
+      </w:pPr>
+    </w:lvl>
+    <w:lvl w:ilvl="5" w:tplc="0416001B" w:tentative="1">
+      <w:start w:val="1"/>
+      <w:numFmt w:val="lowerRoman"/>
+      <w:lvlText w:val="%6."/>
+      <w:lvlJc w:val="right"/>
+      <w:pPr>
+        <w:ind w:left="4320" w:hanging="180"/>
+      </w:pPr>
+    </w:lvl>
+    <w:lvl w:ilvl="6" w:tplc="0416000F" w:tentative="1">
+      <w:start w:val="1"/>
+      <w:numFmt w:val="decimal"/>
+      <w:lvlText w:val="%7."/>
+      <w:lvlJc w:val="left"/>
+      <w:pPr>
+        <w:ind w:left="5040" w:hanging="360"/>
+      </w:pPr>
+    </w:lvl>
+    <w:lvl w:ilvl="7" w:tplc="04160019" w:tentative="1">
+      <w:start w:val="1"/>
+      <w:numFmt w:val="lowerLetter"/>
+      <w:lvlText w:val="%8."/>
+      <w:lvlJc w:val="left"/>
+      <w:pPr>
+        <w:ind w:left="5760" w:hanging="360"/>
+      </w:pPr>
+    </w:lvl>
+    <w:lvl w:ilvl="8" w:tplc="0416001B" w:tentative="1">
+      <w:start w:val="1"/>
+      <w:numFmt w:val="lowerRoman"/>
+      <w:lvlText w:val="%9."/>
+      <w:lvlJc w:val="right"/>
+      <w:pPr>
+        <w:ind w:left="6480" w:hanging="180"/>
+      </w:pPr>
+    </w:lvl>
+  </w:abstractNum>
+  <w:num w:numId="1" w16cid:durableId="2110393538">
+    <w:abstractNumId w:val="0"/>
+  </w:num>
+  <w:num w:numId="2" w16cid:durableId="906382625">
+    <w:abstractNumId w:val="1"/>
+  </w:num>
+</w:numbering>
 </file>
 
 <file path=word/styles.xml><?xml version="1.0" encoding="utf-8"?>
@@ -903,6 +1304,7 @@
   <w:style w:type="character" w:default="1" w:styleId="Fontepargpadro">
     <w:name w:val="Default Paragraph Font"/>
     <w:uiPriority w:val="1"/>
+    <w:semiHidden/>
     <w:unhideWhenUsed/>
   </w:style>
   <w:style w:type="table" w:default="1" w:styleId="Tabelanormal">
@@ -1237,6 +1639,36 @@
     <w:rPr>
       <w:color w:val="605E5C"/>
       <w:shd w:val="clear" w:color="auto" w:fill="E1DFDD"/>
+    </w:rPr>
+  </w:style>
+  <w:style w:type="paragraph" w:styleId="Pr-formataoHTML">
+    <w:name w:val="HTML Preformatted"/>
+    <w:basedOn w:val="Normal"/>
+    <w:link w:val="Pr-formataoHTMLChar"/>
+    <w:uiPriority w:val="99"/>
+    <w:semiHidden/>
+    <w:unhideWhenUsed/>
+    <w:rsid w:val="003A4185"/>
+    <w:pPr>
+      <w:spacing w:after="0" w:line="240" w:lineRule="auto"/>
+    </w:pPr>
+    <w:rPr>
+      <w:rFonts w:ascii="Consolas" w:hAnsi="Consolas"/>
+      <w:sz w:val="20"/>
+      <w:szCs w:val="20"/>
+    </w:rPr>
+  </w:style>
+  <w:style w:type="character" w:customStyle="1" w:styleId="Pr-formataoHTMLChar">
+    <w:name w:val="Pré-formatação HTML Char"/>
+    <w:basedOn w:val="Fontepargpadro"/>
+    <w:link w:val="Pr-formataoHTML"/>
+    <w:uiPriority w:val="99"/>
+    <w:semiHidden/>
+    <w:rsid w:val="003A4185"/>
+    <w:rPr>
+      <w:rFonts w:ascii="Consolas" w:hAnsi="Consolas"/>
+      <w:sz w:val="20"/>
+      <w:szCs w:val="20"/>
     </w:rPr>
   </w:style>
 </w:styles>

</xml_diff>

<commit_message>
Centralizando titulo, aplicando negritos e aumentando altura dos inputs
Co-authored-by: Cursor <cursoragent@cursor.com>
</commit_message>
<xml_diff>
--- a/Prompt.docx
+++ b/Prompt.docx
@@ -43,21 +43,97 @@
       </w:r>
     </w:p>
     <w:p>
-      <w:r>
-        <w:t xml:space="preserve">git remote add origin </w:t>
+      <w:proofErr w:type="spellStart"/>
+      <w:r>
+        <w:t>git</w:t>
+      </w:r>
+      <w:proofErr w:type="spellEnd"/>
+      <w:r>
+        <w:t xml:space="preserve"> </w:t>
+      </w:r>
+      <w:proofErr w:type="spellStart"/>
+      <w:r>
+        <w:t>remote</w:t>
+      </w:r>
+      <w:proofErr w:type="spellEnd"/>
+      <w:r>
+        <w:t xml:space="preserve"> </w:t>
+      </w:r>
+      <w:proofErr w:type="spellStart"/>
+      <w:r>
+        <w:t>add</w:t>
+      </w:r>
+      <w:proofErr w:type="spellEnd"/>
+      <w:r>
+        <w:t xml:space="preserve"> </w:t>
+      </w:r>
+      <w:proofErr w:type="spellStart"/>
+      <w:r>
+        <w:t>origin</w:t>
+      </w:r>
+      <w:proofErr w:type="spellEnd"/>
+      <w:r>
+        <w:t xml:space="preserve"> </w:t>
       </w:r>
       <w:r>
         <w:t>https://github.com/iandreao/gigaeletro.git</w:t>
       </w:r>
     </w:p>
     <w:p>
-      <w:r>
-        <w:t>git push -u origin main</w:t>
-      </w:r>
-    </w:p>
-    <w:p>
-      <w:r>
-        <w:t>git config --global user.email "</w:t>
+      <w:proofErr w:type="spellStart"/>
+      <w:r>
+        <w:t>git</w:t>
+      </w:r>
+      <w:proofErr w:type="spellEnd"/>
+      <w:r>
+        <w:t xml:space="preserve"> </w:t>
+      </w:r>
+      <w:proofErr w:type="spellStart"/>
+      <w:r>
+        <w:t>push</w:t>
+      </w:r>
+      <w:proofErr w:type="spellEnd"/>
+      <w:r>
+        <w:t xml:space="preserve"> -u </w:t>
+      </w:r>
+      <w:proofErr w:type="spellStart"/>
+      <w:r>
+        <w:t>origin</w:t>
+      </w:r>
+      <w:proofErr w:type="spellEnd"/>
+      <w:r>
+        <w:t xml:space="preserve"> </w:t>
+      </w:r>
+      <w:proofErr w:type="spellStart"/>
+      <w:r>
+        <w:t>main</w:t>
+      </w:r>
+      <w:proofErr w:type="spellEnd"/>
+    </w:p>
+    <w:p>
+      <w:proofErr w:type="spellStart"/>
+      <w:r>
+        <w:t>git</w:t>
+      </w:r>
+      <w:proofErr w:type="spellEnd"/>
+      <w:r>
+        <w:t xml:space="preserve"> </w:t>
+      </w:r>
+      <w:proofErr w:type="spellStart"/>
+      <w:r>
+        <w:t>config</w:t>
+      </w:r>
+      <w:proofErr w:type="spellEnd"/>
+      <w:r>
+        <w:t xml:space="preserve"> --global </w:t>
+      </w:r>
+      <w:proofErr w:type="spellStart"/>
+      <w:r>
+        <w:t>user.email</w:t>
+      </w:r>
+      <w:proofErr w:type="spellEnd"/>
+      <w:r>
+        <w:t xml:space="preserve"> "</w:t>
       </w:r>
       <w:r>
         <w:t>iandreao1308@gmail</w:t>
@@ -87,13 +163,26 @@
     </w:p>
     <w:p>
       <w:r>
-        <w:t>Nome da empresa: Gigaeletro Comércio de Material Elétrico Ltda</w:t>
-      </w:r>
-    </w:p>
-    <w:p>
-      <w:r>
-        <w:t>Nome de Fantasia: Gigaeletro</w:t>
-      </w:r>
+        <w:t xml:space="preserve">Nome da empresa: </w:t>
+      </w:r>
+      <w:proofErr w:type="spellStart"/>
+      <w:r>
+        <w:t>Gigaeletro</w:t>
+      </w:r>
+      <w:proofErr w:type="spellEnd"/>
+      <w:r>
+        <w:t xml:space="preserve"> Comércio de Material Elétrico Ltda</w:t>
+      </w:r>
+    </w:p>
+    <w:p>
+      <w:r>
+        <w:t xml:space="preserve">Nome de Fantasia: </w:t>
+      </w:r>
+      <w:proofErr w:type="spellStart"/>
+      <w:r>
+        <w:t>Gigaeletro</w:t>
+      </w:r>
+      <w:proofErr w:type="spellEnd"/>
     </w:p>
     <w:p>
       <w:r>
@@ -190,121 +279,196 @@
     <w:p/>
     <w:p>
       <w:r>
-        <w:t>CONTEXTO DE RETOMADA - SITE GIGAELETRO (PRODUÇÃO VERCEL)</w:t>
+        <w:t>CONTEXTO DE RETOMADA - PROJETO GIGAELETRO (VERSÃO COMPLETA VERCEL)</w:t>
       </w:r>
     </w:p>
     <w:p/>
     <w:p>
       <w:r>
-        <w:t>1. Status Atual do Projeto:</w:t>
-      </w:r>
-    </w:p>
-    <w:p>
-      <w:r>
-        <w:t>- O site está 100% publicado e online na Vercel através do link: gigaeletro.vercel.app.</w:t>
-      </w:r>
-    </w:p>
-    <w:p>
-      <w:r>
-        <w:t>- A navegação, o catálogo com 5.476 itens e o painel de "Seu orçamento" lateral estão funcionando no computador e no celular.</w:t>
+        <w:t>1. Ajustes Realizados e Consolidados Hoje:</w:t>
+      </w:r>
+    </w:p>
+    <w:p>
+      <w:r>
+        <w:t xml:space="preserve">- O visual do site foi unificado com a identidade oficial amarela da </w:t>
+      </w:r>
+      <w:proofErr w:type="spellStart"/>
+      <w:r>
+        <w:t>Gigaeletro</w:t>
+      </w:r>
+      <w:proofErr w:type="spellEnd"/>
+      <w:r>
+        <w:t>.</w:t>
+      </w:r>
+    </w:p>
+    <w:p>
+      <w:r>
+        <w:t xml:space="preserve">- Criada a seleção dinâmica de "Tipo de Pessoa" (Física/Jurídica), aplicando máscaras limpas para CPF e CNPJ (com integração </w:t>
+      </w:r>
+      <w:proofErr w:type="spellStart"/>
+      <w:r>
+        <w:t>BrasilAPI</w:t>
+      </w:r>
+      <w:proofErr w:type="spellEnd"/>
+      <w:r>
+        <w:t xml:space="preserve"> para autocompletar endereço).</w:t>
+      </w:r>
+    </w:p>
+    <w:p>
+      <w:r>
+        <w:lastRenderedPageBreak/>
+        <w:t>- O formulário foi movido de forma elegante para o bloco da Seção Hero amarela à esquerda, destravando o topo e eliminando a sobreposição do orçamento.</w:t>
+      </w:r>
+    </w:p>
+    <w:p>
+      <w:r>
+        <w:t>- O botão "Enviar Orçamento" foi padronizado visualmente com a mesma cor do botão do catálogo e passa a ser ativado imediatamente após a adição de pelo menos 1 produto (com formulário preenchido).</w:t>
+      </w:r>
+    </w:p>
+    <w:p>
+      <w:r>
+        <w:t>- Ajustadas as proporções das colunas da tabela de dados do cliente no PDF (com ganho de espaço massivo para o campo Endereço).</w:t>
+      </w:r>
+    </w:p>
+    <w:p>
+      <w:r>
+        <w:t>- O disparo do WhatsApp foi fixado para o número oficial da empresa: +55 27 99982-1221.</w:t>
       </w:r>
     </w:p>
     <w:p/>
     <w:p>
       <w:r>
-        <w:lastRenderedPageBreak/>
-        <w:t>2. Próximos Ajustes Planejados (Para quando retornar):</w:t>
-      </w:r>
-    </w:p>
-    <w:p>
-      <w:r>
-        <w:t>- Revisar a experiência de uso prática e responsiva diretamente no celular.</w:t>
-      </w:r>
-    </w:p>
-    <w:p>
-      <w:r>
-        <w:t>- Refinar ou testar o comportamento do upload da planilha (.csv) na Área Restrita dentro do ambiente da Vercel (gravação temporária em /tmp).</w:t>
-      </w:r>
-    </w:p>
-    <w:p>
-      <w:r>
-        <w:t>- Ajustar qualquer detalhe fino de cores, botões ou o comportamento final do envio do pedido para o WhatsApp.</w:t>
+        <w:t>2. Próximo Passo Crítico (Amanhã):</w:t>
+      </w:r>
+    </w:p>
+    <w:p>
+      <w:r>
+        <w:t xml:space="preserve">- Validar a nova lógica de contorno do bloqueio de anexos dos navegadores. O Cursor foi instruído a salvar o PDF temporariamente via API </w:t>
+      </w:r>
+      <w:proofErr w:type="spellStart"/>
+      <w:r>
+        <w:t>Serverless</w:t>
+      </w:r>
+      <w:proofErr w:type="spellEnd"/>
+      <w:r>
+        <w:t xml:space="preserve"> na </w:t>
+      </w:r>
+      <w:proofErr w:type="spellStart"/>
+      <w:r>
+        <w:t>Vercel</w:t>
+      </w:r>
+      <w:proofErr w:type="spellEnd"/>
+      <w:r>
+        <w:t xml:space="preserve"> e enviar o documento formatado como um link direto azul e clicável no meio do texto do WhatsApp.</w:t>
+      </w:r>
+    </w:p>
+    <w:p>
+      <w:r>
+        <w:t>- Fazer os testes finais desse link de PDF pelo smartphone e computador.</w:t>
+      </w:r>
+    </w:p>
+    <w:p>
+      <w:r>
+        <w:t>Retomando os trabalhos</w:t>
+      </w:r>
+      <w:r>
+        <w:t>, peço avaliar e opinar sobre as seguintes propostas de ajustes:</w:t>
+      </w:r>
+    </w:p>
+    <w:p>
+      <w:r>
+        <w:t>COR PREDOMINANTE DO SITE:</w:t>
+      </w:r>
+    </w:p>
+    <w:p>
+      <w:r>
+        <w:t xml:space="preserve">1) A cor predominante da </w:t>
+      </w:r>
+      <w:proofErr w:type="spellStart"/>
+      <w:r>
+        <w:t>Gigaeletro</w:t>
+      </w:r>
+      <w:proofErr w:type="spellEnd"/>
+      <w:r>
+        <w:t xml:space="preserve"> é o amarelo. Colocar um fundo amarelo com contorno suave na cor preta imaginamos que ficará muito bom – vamos testar. </w:t>
+      </w:r>
+    </w:p>
+    <w:p>
+      <w:r>
+        <w:t>IDENTIFICAÇÃO DO CLIENTE:</w:t>
+      </w:r>
+    </w:p>
+    <w:p>
+      <w:r>
+        <w:t>2) A identificação do cliente na geração do orçamento é necessária para alimentar o sistema gestor. Criar campos para informar: Nome; CPF/CNPF, Endereço; Número; Bairro; Cidade; Estado e CEP - (se CPF, validar se é válido; se CNPJ, acessar a Receita Federal e já trazer o endereço); e Telefone</w:t>
+      </w:r>
+      <w:r>
+        <w:t>.</w:t>
+      </w:r>
+    </w:p>
+    <w:p>
+      <w:r>
+        <w:t>GERAR ARQUIVO PDF:</w:t>
+      </w:r>
+    </w:p>
+    <w:p>
+      <w:r>
+        <w:t xml:space="preserve">3) </w:t>
+      </w:r>
+      <w:r>
+        <w:t>O envio do orçamento no</w:t>
+      </w:r>
+      <w:r>
+        <w:t xml:space="preserve"> Whatsapp </w:t>
+      </w:r>
+      <w:r>
+        <w:t>não traz uma boa visualização, inclusive, tem a facilidade de ser alterada. Ao enviar o orçamento, gerar arquivo PDF e enviar via whatsapp em anexo, com a seguintes mensagem:</w:t>
+      </w:r>
+    </w:p>
+    <w:p>
+      <w:r>
+        <w:t>Olá!!</w:t>
+      </w:r>
+    </w:p>
+    <w:p>
+      <w:r>
+        <w:t xml:space="preserve">Segue orçamento no valor de R$ </w:t>
+      </w:r>
+      <w:proofErr w:type="spellStart"/>
+      <w:r>
+        <w:t>zzz.zzy,yy</w:t>
+      </w:r>
+      <w:proofErr w:type="spellEnd"/>
+      <w:r>
+        <w:t>, cujos itens estão listados no anexo.</w:t>
+      </w:r>
+    </w:p>
+    <w:p>
+      <w:r>
+        <w:t xml:space="preserve">Aguardamos o retorno. Desde já agradecemos a atenção de sempre. </w:t>
       </w:r>
     </w:p>
     <w:p/>
     <w:p>
       <w:r>
-        <w:t>Retomando os trabalhos</w:t>
-      </w:r>
-      <w:r>
-        <w:t>, peço avaliar e opinar sobre as seguintes propostas de ajustes:</w:t>
-      </w:r>
-    </w:p>
-    <w:p>
-      <w:r>
-        <w:t>COR PREDOMINANTE DO SITE:</w:t>
-      </w:r>
-    </w:p>
-    <w:p>
-      <w:r>
-        <w:t xml:space="preserve">1) A cor predominante da Gigaeletro é o amarelo. Colocar um fundo amarelo com contorno suave na cor preta imaginamos que ficará muito bom – vamos testar. </w:t>
-      </w:r>
-    </w:p>
-    <w:p>
-      <w:r>
-        <w:t>IDENTIFICAÇÃO DO CLIENTE:</w:t>
-      </w:r>
-    </w:p>
-    <w:p>
-      <w:r>
-        <w:t>2) A identificação do cliente na geração do orçamento é necessária para alimentar o sistema gestor. Criar campos para informar: Nome; CPF/CNPF, Endereço; Número; Bairro; Cidade; Estado e CEP - (se CPF, validar se é válido; se CNPJ, acessar a Receita Federal e já trazer o endereço); e Telefone</w:t>
-      </w:r>
-      <w:r>
-        <w:t>.</w:t>
-      </w:r>
-    </w:p>
-    <w:p>
-      <w:r>
-        <w:t>GERAR ARQUIVO PDF:</w:t>
-      </w:r>
-    </w:p>
-    <w:p>
-      <w:r>
-        <w:t xml:space="preserve">3) </w:t>
-      </w:r>
-      <w:r>
-        <w:t>O envio do orçamento no</w:t>
-      </w:r>
-      <w:r>
-        <w:t xml:space="preserve"> Whatsapp </w:t>
-      </w:r>
-      <w:r>
-        <w:t>não traz uma boa visualização, inclusive, tem a facilidade de ser alterada. Ao enviar o orçamento, gerar arquivo PDF e enviar via whatsapp em anexo, com a seguintes mensagem:</w:t>
-      </w:r>
-    </w:p>
-    <w:p>
-      <w:r>
-        <w:t>Olá!!</w:t>
-      </w:r>
-    </w:p>
-    <w:p>
-      <w:r>
-        <w:t>Segue orçamento no valor de R$ zzz.zzy,yy, cujos itens estão listados no anexo.</w:t>
-      </w:r>
-    </w:p>
-    <w:p>
-      <w:r>
-        <w:t xml:space="preserve">Aguardamos o retorno. Desde já agradecemos a atenção de sempre. </w:t>
-      </w:r>
-    </w:p>
-    <w:p/>
-    <w:p>
-      <w:r>
         <w:t>Fulano de Tal</w:t>
       </w:r>
       <w:r>
-        <w:t xml:space="preserve"> – Contato: (xx)xxxxx-xxxx</w:t>
-      </w:r>
+        <w:t xml:space="preserve"> – Contato: (</w:t>
+      </w:r>
+      <w:proofErr w:type="spellStart"/>
+      <w:r>
+        <w:t>xx</w:t>
+      </w:r>
+      <w:proofErr w:type="spellEnd"/>
+      <w:r>
+        <w:t>)</w:t>
+      </w:r>
+      <w:proofErr w:type="spellStart"/>
+      <w:r>
+        <w:t>xxxxx-xxxx</w:t>
+      </w:r>
+      <w:proofErr w:type="spellEnd"/>
     </w:p>
     <w:p>
       <w:r>
@@ -313,7 +477,9 @@
     </w:p>
     <w:p>
       <w:r>
-        <w:lastRenderedPageBreak/>
+        <w:rPr>
+          <w:noProof/>
+        </w:rPr>
         <w:drawing>
           <wp:inline distT="0" distB="0" distL="0" distR="0" wp14:anchorId="7817BC4A" wp14:editId="3066F77F">
             <wp:extent cx="5400040" cy="3644900"/>
@@ -365,7 +531,15 @@
         </w:numPr>
       </w:pPr>
       <w:r>
-        <w:t>Não está validando o nr do CPF;</w:t>
+        <w:t xml:space="preserve">Não está validando o </w:t>
+      </w:r>
+      <w:proofErr w:type="spellStart"/>
+      <w:r>
+        <w:t>nr</w:t>
+      </w:r>
+      <w:proofErr w:type="spellEnd"/>
+      <w:r>
+        <w:t xml:space="preserve"> do CPF;</w:t>
       </w:r>
     </w:p>
     <w:p>
@@ -389,13 +563,7 @@
         </w:numPr>
       </w:pPr>
       <w:r>
-        <w:t xml:space="preserve">A tela para coletar os dados cliente está sobrepondo o orçamento. Sugiro que essa tela para coletar os dados do cliente, seja deslocada para a esquerda acima do botão “Ver Catálogo de Produtos”. Excluir “---VENDA NOVA DO IMIGRANTE”; e subir as duas frases imediatamente abaixo desse texto excluído; descer o botão </w:t>
-      </w:r>
-      <w:r>
-        <w:t>“Ver Catálogo de Produtos”</w:t>
-      </w:r>
-      <w:r>
-        <w:t xml:space="preserve"> para o final da cor amarela.</w:t>
+        <w:t>A tela para coletar os dados cliente está sobrepondo o orçamento. Sugiro que essa tela para coletar os dados do cliente, seja deslocada para a esquerda acima do botão “Ver Catálogo de Produtos”. Excluir “---VENDA NOVA DO IMIGRANTE”; e subir as duas frases imediatamente abaixo desse texto excluído; descer o botão “Ver Catálogo de Produtos” para o final da cor amarela.</w:t>
       </w:r>
     </w:p>
     <w:p>
@@ -407,13 +575,7 @@
         </w:numPr>
       </w:pPr>
       <w:r>
-        <w:t xml:space="preserve">Alterar o botão “Enviar Orçamento para o Whatsapp” para </w:t>
-      </w:r>
-      <w:r>
-        <w:t>“Enviar Orçamento</w:t>
-      </w:r>
-      <w:r>
-        <w:t>”;</w:t>
+        <w:t>Alterar o botão “Enviar Orçamento para o Whatsapp” para “Enviar Orçamento”;</w:t>
       </w:r>
     </w:p>
     <w:p>
@@ -451,16 +613,7 @@
         </w:numPr>
       </w:pPr>
       <w:r>
-        <w:t xml:space="preserve">O botão </w:t>
-      </w:r>
-      <w:r>
-        <w:t>“Enviar Orçamento”</w:t>
-      </w:r>
-      <w:r>
-        <w:t xml:space="preserve"> deve ser ativado ao ser adicionado um item</w:t>
-      </w:r>
-      <w:r>
-        <w:t>;</w:t>
+        <w:t>Reduzir a largura das seguintes colunas do formulário “Pedido de Orçamento”: coluna 1 reduzir 50%; coluna 2 reduzir 60%, coluna 4 reduzir 50%, coluna 5 reduzir 10%, coluna 6 reduzir 10%. Remanejar o espaço que sobrar para a coluna 3;</w:t>
       </w:r>
     </w:p>
     <w:p>
@@ -468,17 +621,34 @@
         <w:pStyle w:val="PargrafodaLista"/>
         <w:numPr>
           <w:ilvl w:val="0"/>
-          <w:numId w:val="2"/>
+          <w:numId w:val="1"/>
         </w:numPr>
       </w:pPr>
       <w:r>
-        <w:t>Acho que para permitir máscara para edição do</w:t>
-      </w:r>
-      <w:r>
-        <w:t xml:space="preserve"> CPF/CNPJ</w:t>
-      </w:r>
-      <w:r>
-        <w:t>, tem que incluir um campo para selecionar o “Tipo de Pessoa” – se PF, edição para CPF e se PJ, edição para CNPJ;</w:t>
+        <w:lastRenderedPageBreak/>
+        <w:t>O celular 27 9998021221 está cadastrado para envio de Whatsapp. Ao clicar no botão “Enviar Orçamento” deve abrir automaticamente o whatsapp desse número com a mensagem e o anexo.</w:t>
+      </w:r>
+    </w:p>
+    <w:p>
+      <w:pPr>
+        <w:ind w:left="360"/>
+        <w:rPr>
+          <w:color w:val="EE0000"/>
+        </w:rPr>
+      </w:pPr>
+    </w:p>
+    <w:p>
+      <w:pPr>
+        <w:ind w:left="360"/>
+        <w:rPr>
+          <w:color w:val="EE0000"/>
+        </w:rPr>
+      </w:pPr>
+      <w:r>
+        <w:rPr>
+          <w:color w:val="EE0000"/>
+        </w:rPr>
+        <w:t>IMPLEMENTAR:</w:t>
       </w:r>
     </w:p>
     <w:p>
@@ -486,21 +656,28 @@
         <w:pStyle w:val="PargrafodaLista"/>
         <w:numPr>
           <w:ilvl w:val="0"/>
-          <w:numId w:val="2"/>
+          <w:numId w:val="3"/>
         </w:numPr>
-      </w:pPr>
-      <w:r>
-        <w:t xml:space="preserve">Colocar a mesma do botão “Ver Catálogo de Produtos” para </w:t>
-      </w:r>
-      <w:r>
-        <w:t xml:space="preserve">o botão </w:t>
-      </w:r>
-      <w:r>
-        <w:t>“Enviar Orçamento”</w:t>
-      </w:r>
-      <w:r>
-        <w:t>;</w:t>
-      </w:r>
+        <w:rPr>
+          <w:color w:val="EE0000"/>
+        </w:rPr>
+      </w:pPr>
+      <w:r>
+        <w:rPr>
+          <w:color w:val="EE0000"/>
+        </w:rPr>
+        <w:t>O cliente precisa ter uma forma de ver seu orçamento.</w:t>
+      </w:r>
+    </w:p>
+    <w:p>
+      <w:pPr>
+        <w:pStyle w:val="PargrafodaLista"/>
+      </w:pPr>
+    </w:p>
+    <w:p>
+      <w:pPr>
+        <w:pStyle w:val="PargrafodaLista"/>
+      </w:pPr>
     </w:p>
     <w:sectPr>
       <w:pgSz w:w="11906" w:h="16838"/>
@@ -604,9 +781,247 @@
     </w:lvl>
   </w:abstractNum>
   <w:abstractNum w:abstractNumId="1" w15:restartNumberingAfterBreak="0">
+    <w:nsid w:val="3A8F41DF"/>
+    <w:multiLevelType w:val="multilevel"/>
+    <w:tmpl w:val="8A94E16C"/>
+    <w:lvl w:ilvl="0">
+      <w:start w:val="1"/>
+      <w:numFmt w:val="bullet"/>
+      <w:lvlText w:val=""/>
+      <w:lvlJc w:val="left"/>
+      <w:pPr>
+        <w:tabs>
+          <w:tab w:val="num" w:pos="720"/>
+        </w:tabs>
+        <w:ind w:left="720" w:hanging="360"/>
+      </w:pPr>
+      <w:rPr>
+        <w:rFonts w:ascii="Symbol" w:hAnsi="Symbol" w:hint="default"/>
+        <w:sz w:val="20"/>
+      </w:rPr>
+    </w:lvl>
+    <w:lvl w:ilvl="1" w:tentative="1">
+      <w:start w:val="1"/>
+      <w:numFmt w:val="bullet"/>
+      <w:lvlText w:val="o"/>
+      <w:lvlJc w:val="left"/>
+      <w:pPr>
+        <w:tabs>
+          <w:tab w:val="num" w:pos="1440"/>
+        </w:tabs>
+        <w:ind w:left="1440" w:hanging="360"/>
+      </w:pPr>
+      <w:rPr>
+        <w:rFonts w:ascii="Courier New" w:hAnsi="Courier New" w:hint="default"/>
+        <w:sz w:val="20"/>
+      </w:rPr>
+    </w:lvl>
+    <w:lvl w:ilvl="2" w:tentative="1">
+      <w:start w:val="1"/>
+      <w:numFmt w:val="bullet"/>
+      <w:lvlText w:val=""/>
+      <w:lvlJc w:val="left"/>
+      <w:pPr>
+        <w:tabs>
+          <w:tab w:val="num" w:pos="2160"/>
+        </w:tabs>
+        <w:ind w:left="2160" w:hanging="360"/>
+      </w:pPr>
+      <w:rPr>
+        <w:rFonts w:ascii="Wingdings" w:hAnsi="Wingdings" w:hint="default"/>
+        <w:sz w:val="20"/>
+      </w:rPr>
+    </w:lvl>
+    <w:lvl w:ilvl="3" w:tentative="1">
+      <w:start w:val="1"/>
+      <w:numFmt w:val="bullet"/>
+      <w:lvlText w:val=""/>
+      <w:lvlJc w:val="left"/>
+      <w:pPr>
+        <w:tabs>
+          <w:tab w:val="num" w:pos="2880"/>
+        </w:tabs>
+        <w:ind w:left="2880" w:hanging="360"/>
+      </w:pPr>
+      <w:rPr>
+        <w:rFonts w:ascii="Wingdings" w:hAnsi="Wingdings" w:hint="default"/>
+        <w:sz w:val="20"/>
+      </w:rPr>
+    </w:lvl>
+    <w:lvl w:ilvl="4" w:tentative="1">
+      <w:start w:val="1"/>
+      <w:numFmt w:val="bullet"/>
+      <w:lvlText w:val=""/>
+      <w:lvlJc w:val="left"/>
+      <w:pPr>
+        <w:tabs>
+          <w:tab w:val="num" w:pos="3600"/>
+        </w:tabs>
+        <w:ind w:left="3600" w:hanging="360"/>
+      </w:pPr>
+      <w:rPr>
+        <w:rFonts w:ascii="Wingdings" w:hAnsi="Wingdings" w:hint="default"/>
+        <w:sz w:val="20"/>
+      </w:rPr>
+    </w:lvl>
+    <w:lvl w:ilvl="5" w:tentative="1">
+      <w:start w:val="1"/>
+      <w:numFmt w:val="bullet"/>
+      <w:lvlText w:val=""/>
+      <w:lvlJc w:val="left"/>
+      <w:pPr>
+        <w:tabs>
+          <w:tab w:val="num" w:pos="4320"/>
+        </w:tabs>
+        <w:ind w:left="4320" w:hanging="360"/>
+      </w:pPr>
+      <w:rPr>
+        <w:rFonts w:ascii="Wingdings" w:hAnsi="Wingdings" w:hint="default"/>
+        <w:sz w:val="20"/>
+      </w:rPr>
+    </w:lvl>
+    <w:lvl w:ilvl="6" w:tentative="1">
+      <w:start w:val="1"/>
+      <w:numFmt w:val="bullet"/>
+      <w:lvlText w:val=""/>
+      <w:lvlJc w:val="left"/>
+      <w:pPr>
+        <w:tabs>
+          <w:tab w:val="num" w:pos="5040"/>
+        </w:tabs>
+        <w:ind w:left="5040" w:hanging="360"/>
+      </w:pPr>
+      <w:rPr>
+        <w:rFonts w:ascii="Wingdings" w:hAnsi="Wingdings" w:hint="default"/>
+        <w:sz w:val="20"/>
+      </w:rPr>
+    </w:lvl>
+    <w:lvl w:ilvl="7" w:tentative="1">
+      <w:start w:val="1"/>
+      <w:numFmt w:val="bullet"/>
+      <w:lvlText w:val=""/>
+      <w:lvlJc w:val="left"/>
+      <w:pPr>
+        <w:tabs>
+          <w:tab w:val="num" w:pos="5760"/>
+        </w:tabs>
+        <w:ind w:left="5760" w:hanging="360"/>
+      </w:pPr>
+      <w:rPr>
+        <w:rFonts w:ascii="Wingdings" w:hAnsi="Wingdings" w:hint="default"/>
+        <w:sz w:val="20"/>
+      </w:rPr>
+    </w:lvl>
+    <w:lvl w:ilvl="8" w:tentative="1">
+      <w:start w:val="1"/>
+      <w:numFmt w:val="bullet"/>
+      <w:lvlText w:val=""/>
+      <w:lvlJc w:val="left"/>
+      <w:pPr>
+        <w:tabs>
+          <w:tab w:val="num" w:pos="6480"/>
+        </w:tabs>
+        <w:ind w:left="6480" w:hanging="360"/>
+      </w:pPr>
+      <w:rPr>
+        <w:rFonts w:ascii="Wingdings" w:hAnsi="Wingdings" w:hint="default"/>
+        <w:sz w:val="20"/>
+      </w:rPr>
+    </w:lvl>
+  </w:abstractNum>
+  <w:abstractNum w:abstractNumId="2" w15:restartNumberingAfterBreak="0">
     <w:nsid w:val="3C3737E7"/>
     <w:multiLevelType w:val="hybridMultilevel"/>
     <w:tmpl w:val="50A0703C"/>
+    <w:lvl w:ilvl="0" w:tplc="04160011">
+      <w:start w:val="1"/>
+      <w:numFmt w:val="decimal"/>
+      <w:lvlText w:val="%1)"/>
+      <w:lvlJc w:val="left"/>
+      <w:pPr>
+        <w:ind w:left="720" w:hanging="360"/>
+      </w:pPr>
+      <w:rPr>
+        <w:rFonts w:hint="default"/>
+      </w:rPr>
+    </w:lvl>
+    <w:lvl w:ilvl="1" w:tplc="04160019" w:tentative="1">
+      <w:start w:val="1"/>
+      <w:numFmt w:val="lowerLetter"/>
+      <w:lvlText w:val="%2."/>
+      <w:lvlJc w:val="left"/>
+      <w:pPr>
+        <w:ind w:left="1440" w:hanging="360"/>
+      </w:pPr>
+    </w:lvl>
+    <w:lvl w:ilvl="2" w:tplc="0416001B" w:tentative="1">
+      <w:start w:val="1"/>
+      <w:numFmt w:val="lowerRoman"/>
+      <w:lvlText w:val="%3."/>
+      <w:lvlJc w:val="right"/>
+      <w:pPr>
+        <w:ind w:left="2160" w:hanging="180"/>
+      </w:pPr>
+    </w:lvl>
+    <w:lvl w:ilvl="3" w:tplc="0416000F" w:tentative="1">
+      <w:start w:val="1"/>
+      <w:numFmt w:val="decimal"/>
+      <w:lvlText w:val="%4."/>
+      <w:lvlJc w:val="left"/>
+      <w:pPr>
+        <w:ind w:left="2880" w:hanging="360"/>
+      </w:pPr>
+    </w:lvl>
+    <w:lvl w:ilvl="4" w:tplc="04160019" w:tentative="1">
+      <w:start w:val="1"/>
+      <w:numFmt w:val="lowerLetter"/>
+      <w:lvlText w:val="%5."/>
+      <w:lvlJc w:val="left"/>
+      <w:pPr>
+        <w:ind w:left="3600" w:hanging="360"/>
+      </w:pPr>
+    </w:lvl>
+    <w:lvl w:ilvl="5" w:tplc="0416001B" w:tentative="1">
+      <w:start w:val="1"/>
+      <w:numFmt w:val="lowerRoman"/>
+      <w:lvlText w:val="%6."/>
+      <w:lvlJc w:val="right"/>
+      <w:pPr>
+        <w:ind w:left="4320" w:hanging="180"/>
+      </w:pPr>
+    </w:lvl>
+    <w:lvl w:ilvl="6" w:tplc="0416000F" w:tentative="1">
+      <w:start w:val="1"/>
+      <w:numFmt w:val="decimal"/>
+      <w:lvlText w:val="%7."/>
+      <w:lvlJc w:val="left"/>
+      <w:pPr>
+        <w:ind w:left="5040" w:hanging="360"/>
+      </w:pPr>
+    </w:lvl>
+    <w:lvl w:ilvl="7" w:tplc="04160019" w:tentative="1">
+      <w:start w:val="1"/>
+      <w:numFmt w:val="lowerLetter"/>
+      <w:lvlText w:val="%8."/>
+      <w:lvlJc w:val="left"/>
+      <w:pPr>
+        <w:ind w:left="5760" w:hanging="360"/>
+      </w:pPr>
+    </w:lvl>
+    <w:lvl w:ilvl="8" w:tplc="0416001B" w:tentative="1">
+      <w:start w:val="1"/>
+      <w:numFmt w:val="lowerRoman"/>
+      <w:lvlText w:val="%9."/>
+      <w:lvlJc w:val="right"/>
+      <w:pPr>
+        <w:ind w:left="6480" w:hanging="180"/>
+      </w:pPr>
+    </w:lvl>
+  </w:abstractNum>
+  <w:abstractNum w:abstractNumId="3" w15:restartNumberingAfterBreak="0">
+    <w:nsid w:val="571A3C7E"/>
+    <w:multiLevelType w:val="hybridMultilevel"/>
+    <w:tmpl w:val="8F2E537C"/>
     <w:lvl w:ilvl="0" w:tplc="04160011">
       <w:start w:val="1"/>
       <w:numFmt w:val="decimal"/>
@@ -696,6 +1111,12 @@
     <w:abstractNumId w:val="0"/>
   </w:num>
   <w:num w:numId="2" w16cid:durableId="906382625">
+    <w:abstractNumId w:val="2"/>
+  </w:num>
+  <w:num w:numId="3" w16cid:durableId="1895853702">
+    <w:abstractNumId w:val="3"/>
+  </w:num>
+  <w:num w:numId="4" w16cid:durableId="1257983223">
     <w:abstractNumId w:val="1"/>
   </w:num>
 </w:numbering>
@@ -1304,7 +1725,6 @@
   <w:style w:type="character" w:default="1" w:styleId="Fontepargpadro">
     <w:name w:val="Default Paragraph Font"/>
     <w:uiPriority w:val="1"/>
-    <w:semiHidden/>
     <w:unhideWhenUsed/>
   </w:style>
   <w:style w:type="table" w:default="1" w:styleId="Tabelanormal">

</xml_diff>

<commit_message>
feat: adiciona opcao de excluir e ajustes de usabilidade
</commit_message>
<xml_diff>
--- a/Prompt.docx
+++ b/Prompt.docx
@@ -270,216 +270,10 @@
     </w:p>
     <w:p>
       <w:r>
-        <w:t xml:space="preserve">Tabela de produtos: será anexado arquivo </w:t>
-      </w:r>
-      <w:r>
-        <w:t>Excel</w:t>
-      </w:r>
-    </w:p>
-    <w:p/>
-    <w:p>
-      <w:r>
-        <w:t>CONTEXTO DE RETOMADA - PROJETO GIGAELETRO (VERSÃO COMPLETA VERCEL)</w:t>
-      </w:r>
-    </w:p>
-    <w:p/>
-    <w:p>
-      <w:r>
-        <w:t>1. Ajustes Realizados e Consolidados Hoje:</w:t>
-      </w:r>
-    </w:p>
-    <w:p>
-      <w:r>
-        <w:t xml:space="preserve">- O visual do site foi unificado com a identidade oficial amarela da </w:t>
-      </w:r>
-      <w:proofErr w:type="spellStart"/>
-      <w:r>
-        <w:t>Gigaeletro</w:t>
-      </w:r>
-      <w:proofErr w:type="spellEnd"/>
-      <w:r>
-        <w:t>.</w:t>
-      </w:r>
-    </w:p>
-    <w:p>
-      <w:r>
-        <w:t xml:space="preserve">- Criada a seleção dinâmica de "Tipo de Pessoa" (Física/Jurídica), aplicando máscaras limpas para CPF e CNPJ (com integração </w:t>
-      </w:r>
-      <w:proofErr w:type="spellStart"/>
-      <w:r>
-        <w:t>BrasilAPI</w:t>
-      </w:r>
-      <w:proofErr w:type="spellEnd"/>
-      <w:r>
-        <w:t xml:space="preserve"> para autocompletar endereço).</w:t>
-      </w:r>
-    </w:p>
-    <w:p>
-      <w:r>
-        <w:lastRenderedPageBreak/>
-        <w:t>- O formulário foi movido de forma elegante para o bloco da Seção Hero amarela à esquerda, destravando o topo e eliminando a sobreposição do orçamento.</w:t>
-      </w:r>
-    </w:p>
-    <w:p>
-      <w:r>
-        <w:t>- O botão "Enviar Orçamento" foi padronizado visualmente com a mesma cor do botão do catálogo e passa a ser ativado imediatamente após a adição de pelo menos 1 produto (com formulário preenchido).</w:t>
-      </w:r>
-    </w:p>
-    <w:p>
-      <w:r>
-        <w:t>- Ajustadas as proporções das colunas da tabela de dados do cliente no PDF (com ganho de espaço massivo para o campo Endereço).</w:t>
-      </w:r>
-    </w:p>
-    <w:p>
-      <w:r>
-        <w:t>- O disparo do WhatsApp foi fixado para o número oficial da empresa: +55 27 99982-1221.</w:t>
-      </w:r>
-    </w:p>
-    <w:p/>
-    <w:p>
-      <w:r>
-        <w:t>2. Próximo Passo Crítico (Amanhã):</w:t>
-      </w:r>
-    </w:p>
-    <w:p>
-      <w:r>
-        <w:t xml:space="preserve">- Validar a nova lógica de contorno do bloqueio de anexos dos navegadores. O Cursor foi instruído a salvar o PDF temporariamente via API </w:t>
-      </w:r>
-      <w:proofErr w:type="spellStart"/>
-      <w:r>
-        <w:t>Serverless</w:t>
-      </w:r>
-      <w:proofErr w:type="spellEnd"/>
-      <w:r>
-        <w:t xml:space="preserve"> na </w:t>
-      </w:r>
-      <w:proofErr w:type="spellStart"/>
-      <w:r>
-        <w:t>Vercel</w:t>
-      </w:r>
-      <w:proofErr w:type="spellEnd"/>
-      <w:r>
-        <w:t xml:space="preserve"> e enviar o documento formatado como um link direto azul e clicável no meio do texto do WhatsApp.</w:t>
-      </w:r>
-    </w:p>
-    <w:p>
-      <w:r>
-        <w:t>- Fazer os testes finais desse link de PDF pelo smartphone e computador.</w:t>
-      </w:r>
-    </w:p>
-    <w:p>
-      <w:r>
-        <w:t>Retomando os trabalhos</w:t>
-      </w:r>
-      <w:r>
-        <w:t>, peço avaliar e opinar sobre as seguintes propostas de ajustes:</w:t>
-      </w:r>
-    </w:p>
-    <w:p>
-      <w:r>
-        <w:t>COR PREDOMINANTE DO SITE:</w:t>
-      </w:r>
-    </w:p>
-    <w:p>
-      <w:r>
-        <w:t xml:space="preserve">1) A cor predominante da </w:t>
-      </w:r>
-      <w:proofErr w:type="spellStart"/>
-      <w:r>
-        <w:t>Gigaeletro</w:t>
-      </w:r>
-      <w:proofErr w:type="spellEnd"/>
-      <w:r>
-        <w:t xml:space="preserve"> é o amarelo. Colocar um fundo amarelo com contorno suave na cor preta imaginamos que ficará muito bom – vamos testar. </w:t>
-      </w:r>
-    </w:p>
-    <w:p>
-      <w:r>
-        <w:t>IDENTIFICAÇÃO DO CLIENTE:</w:t>
-      </w:r>
-    </w:p>
-    <w:p>
-      <w:r>
-        <w:t>2) A identificação do cliente na geração do orçamento é necessária para alimentar o sistema gestor. Criar campos para informar: Nome; CPF/CNPF, Endereço; Número; Bairro; Cidade; Estado e CEP - (se CPF, validar se é válido; se CNPJ, acessar a Receita Federal e já trazer o endereço); e Telefone</w:t>
-      </w:r>
-      <w:r>
-        <w:t>.</w:t>
-      </w:r>
-    </w:p>
-    <w:p>
-      <w:r>
-        <w:t>GERAR ARQUIVO PDF:</w:t>
-      </w:r>
-    </w:p>
-    <w:p>
-      <w:r>
-        <w:t xml:space="preserve">3) </w:t>
-      </w:r>
-      <w:r>
-        <w:t>O envio do orçamento no</w:t>
-      </w:r>
-      <w:r>
-        <w:t xml:space="preserve"> Whatsapp </w:t>
-      </w:r>
-      <w:r>
-        <w:t>não traz uma boa visualização, inclusive, tem a facilidade de ser alterada. Ao enviar o orçamento, gerar arquivo PDF e enviar via whatsapp em anexo, com a seguintes mensagem:</w:t>
-      </w:r>
-    </w:p>
-    <w:p>
-      <w:r>
-        <w:t>Olá!!</w:t>
-      </w:r>
-    </w:p>
-    <w:p>
-      <w:r>
-        <w:t xml:space="preserve">Segue orçamento no valor de R$ </w:t>
-      </w:r>
-      <w:proofErr w:type="spellStart"/>
-      <w:r>
-        <w:t>zzz.zzy,yy</w:t>
-      </w:r>
-      <w:proofErr w:type="spellEnd"/>
-      <w:r>
-        <w:t>, cujos itens estão listados no anexo.</w:t>
-      </w:r>
-    </w:p>
-    <w:p>
-      <w:r>
-        <w:t xml:space="preserve">Aguardamos o retorno. Desde já agradecemos a atenção de sempre. </w:t>
-      </w:r>
-    </w:p>
-    <w:p/>
-    <w:p>
-      <w:r>
-        <w:t>Fulano de Tal</w:t>
-      </w:r>
-      <w:r>
-        <w:t xml:space="preserve"> – Contato: (</w:t>
-      </w:r>
-      <w:proofErr w:type="spellStart"/>
-      <w:r>
-        <w:t>xx</w:t>
-      </w:r>
-      <w:proofErr w:type="spellEnd"/>
-      <w:r>
-        <w:t>)</w:t>
-      </w:r>
-      <w:proofErr w:type="spellStart"/>
-      <w:r>
-        <w:t>xxxxx-xxxx</w:t>
-      </w:r>
-      <w:proofErr w:type="spellEnd"/>
-    </w:p>
-    <w:p>
-      <w:r>
-        <w:t>Leiaute do Pedido de Orçamento.</w:t>
-      </w:r>
-    </w:p>
-    <w:p>
-      <w:r>
         <w:rPr>
           <w:noProof/>
         </w:rPr>
+        <w:lastRenderedPageBreak/>
         <w:drawing>
           <wp:inline distT="0" distB="0" distL="0" distR="0" wp14:anchorId="7817BC4A" wp14:editId="3066F77F">
             <wp:extent cx="5400040" cy="3644900"/>
@@ -518,8 +312,107 @@
       </w:r>
     </w:p>
     <w:p>
-      <w:r>
-        <w:t>Ajustes:</w:t>
+      <w:pPr>
+        <w:pStyle w:val="PargrafodaLista"/>
+        <w:ind w:left="1080"/>
+        <w:rPr>
+          <w:color w:val="EE0000"/>
+        </w:rPr>
+      </w:pPr>
+    </w:p>
+    <w:p>
+      <w:r>
+        <w:t xml:space="preserve">             </w:t>
+      </w:r>
+    </w:p>
+    <w:p>
+      <w:pPr>
+        <w:pStyle w:val="PargrafodaLista"/>
+      </w:pPr>
+      <w:r>
+        <w:t>CONTEXTO DO PROJETO:</w:t>
+      </w:r>
+    </w:p>
+    <w:p>
+      <w:pPr>
+        <w:pStyle w:val="PargrafodaLista"/>
+      </w:pPr>
+    </w:p>
+    <w:p>
+      <w:pPr>
+        <w:pStyle w:val="PargrafodaLista"/>
+        <w:rPr>
+          <w:b/>
+          <w:bCs/>
+        </w:rPr>
+      </w:pPr>
+      <w:r>
+        <w:rPr>
+          <w:b/>
+          <w:bCs/>
+        </w:rPr>
+        <w:t xml:space="preserve">CONTEXTO DE RETOMADA DE PROJETO: </w:t>
+      </w:r>
+      <w:proofErr w:type="spellStart"/>
+      <w:r>
+        <w:rPr>
+          <w:b/>
+          <w:bCs/>
+        </w:rPr>
+        <w:t>SiteGigaeletro</w:t>
+      </w:r>
+      <w:proofErr w:type="spellEnd"/>
+    </w:p>
+    <w:p>
+      <w:pPr>
+        <w:pStyle w:val="PargrafodaLista"/>
+      </w:pPr>
+      <w:r>
+        <w:t>Por favor, leia este resumo para entender o estado atual do projeto, a arquitetura e as regras de negócio antes de iniciarmos as próximas tarefas.</w:t>
+      </w:r>
+    </w:p>
+    <w:p>
+      <w:pPr>
+        <w:pStyle w:val="PargrafodaLista"/>
+      </w:pPr>
+      <w:r>
+        <w:rPr>
+          <w:b/>
+          <w:bCs/>
+        </w:rPr>
+        <w:t>1. SOBRE O PROJETO</w:t>
+      </w:r>
+      <w:r>
+        <w:br/>
+        <w:t xml:space="preserve">O </w:t>
+      </w:r>
+      <w:proofErr w:type="spellStart"/>
+      <w:r>
+        <w:t>SiteGigaeletro</w:t>
+      </w:r>
+      <w:proofErr w:type="spellEnd"/>
+      <w:r>
+        <w:t xml:space="preserve"> é um catálogo digital de materiais elétricos (residenciais, comerciais e industriais) para a loja física </w:t>
+      </w:r>
+      <w:proofErr w:type="spellStart"/>
+      <w:r>
+        <w:t>GigaEletro</w:t>
+      </w:r>
+      <w:proofErr w:type="spellEnd"/>
+      <w:r>
+        <w:t>, localizada em Venda Nova do Imigrante - ES. O objetivo principal do site é permitir que o cliente monte uma lista de orçamento e a envie diretamente para os vendedores através do WhatsApp.</w:t>
+      </w:r>
+    </w:p>
+    <w:p>
+      <w:pPr>
+        <w:pStyle w:val="PargrafodaLista"/>
+      </w:pPr>
+      <w:r>
+        <w:rPr>
+          <w:b/>
+          <w:bCs/>
+        </w:rPr>
+        <w:t>2. INFRAESTRUTURA E AMBIENTE</w:t>
       </w:r>
     </w:p>
     <w:p>
@@ -527,19 +420,18 @@
         <w:pStyle w:val="PargrafodaLista"/>
         <w:numPr>
           <w:ilvl w:val="0"/>
-          <w:numId w:val="1"/>
+          <w:numId w:val="8"/>
         </w:numPr>
       </w:pPr>
       <w:r>
-        <w:t xml:space="preserve">Não está validando o </w:t>
-      </w:r>
-      <w:proofErr w:type="spellStart"/>
-      <w:r>
-        <w:t>nr</w:t>
-      </w:r>
-      <w:proofErr w:type="spellEnd"/>
-      <w:r>
-        <w:t xml:space="preserve"> do CPF;</w:t>
+        <w:rPr>
+          <w:b/>
+          <w:bCs/>
+        </w:rPr>
+        <w:t>Repositório:</w:t>
+      </w:r>
+      <w:r>
+        <w:t xml:space="preserve"> Conectado ao GitHub.</w:t>
       </w:r>
     </w:p>
     <w:p>
@@ -547,11 +439,34 @@
         <w:pStyle w:val="PargrafodaLista"/>
         <w:numPr>
           <w:ilvl w:val="0"/>
-          <w:numId w:val="1"/>
+          <w:numId w:val="8"/>
         </w:numPr>
       </w:pPr>
       <w:r>
-        <w:t>Na digitação editar o campo CPF/CNPJ;</w:t>
+        <w:rPr>
+          <w:b/>
+          <w:bCs/>
+        </w:rPr>
+        <w:t>Hospedagem:</w:t>
+      </w:r>
+      <w:r>
+        <w:t xml:space="preserve"> Publicado na </w:t>
+      </w:r>
+      <w:proofErr w:type="spellStart"/>
+      <w:r>
+        <w:t>Vercel</w:t>
+      </w:r>
+      <w:proofErr w:type="spellEnd"/>
+      <w:r>
+        <w:t xml:space="preserve"> em ambiente de desenvolvimento/</w:t>
+      </w:r>
+      <w:proofErr w:type="spellStart"/>
+      <w:r>
+        <w:t>staging</w:t>
+      </w:r>
+      <w:proofErr w:type="spellEnd"/>
+      <w:r>
+        <w:t>.</w:t>
       </w:r>
     </w:p>
     <w:p>
@@ -559,11 +474,18 @@
         <w:pStyle w:val="PargrafodaLista"/>
         <w:numPr>
           <w:ilvl w:val="0"/>
-          <w:numId w:val="1"/>
+          <w:numId w:val="8"/>
         </w:numPr>
       </w:pPr>
       <w:r>
-        <w:t>A tela para coletar os dados cliente está sobrepondo o orçamento. Sugiro que essa tela para coletar os dados do cliente, seja deslocada para a esquerda acima do botão “Ver Catálogo de Produtos”. Excluir “---VENDA NOVA DO IMIGRANTE”; e subir as duas frases imediatamente abaixo desse texto excluído; descer o botão “Ver Catálogo de Produtos” para o final da cor amarela.</w:t>
+        <w:rPr>
+          <w:b/>
+          <w:bCs/>
+        </w:rPr>
+        <w:t>URL Atual:</w:t>
+      </w:r>
+      <w:r>
+        <w:t xml:space="preserve"> https://gigaeletro.vercel.app/</w:t>
       </w:r>
     </w:p>
     <w:p>
@@ -571,11 +493,82 @@
         <w:pStyle w:val="PargrafodaLista"/>
         <w:numPr>
           <w:ilvl w:val="0"/>
-          <w:numId w:val="1"/>
+          <w:numId w:val="8"/>
         </w:numPr>
       </w:pPr>
       <w:r>
-        <w:t>Alterar o botão “Enviar Orçamento para o Whatsapp” para “Enviar Orçamento”;</w:t>
+        <w:rPr>
+          <w:b/>
+          <w:bCs/>
+        </w:rPr>
+        <w:t>Fluxo de trabalho:</w:t>
+      </w:r>
+      <w:r>
+        <w:t xml:space="preserve"> As alterações de código devem ser integradas via </w:t>
+      </w:r>
+      <w:proofErr w:type="spellStart"/>
+      <w:r>
+        <w:t>Git</w:t>
+      </w:r>
+      <w:proofErr w:type="spellEnd"/>
+      <w:r>
+        <w:t xml:space="preserve"> (</w:t>
+      </w:r>
+      <w:proofErr w:type="spellStart"/>
+      <w:r>
+        <w:t>add</w:t>
+      </w:r>
+      <w:proofErr w:type="spellEnd"/>
+      <w:r>
+        <w:t xml:space="preserve">, </w:t>
+      </w:r>
+      <w:proofErr w:type="spellStart"/>
+      <w:r>
+        <w:t>commit</w:t>
+      </w:r>
+      <w:proofErr w:type="spellEnd"/>
+      <w:r>
+        <w:t xml:space="preserve"> e </w:t>
+      </w:r>
+      <w:proofErr w:type="spellStart"/>
+      <w:r>
+        <w:t>push</w:t>
+      </w:r>
+      <w:proofErr w:type="spellEnd"/>
+      <w:r>
+        <w:t xml:space="preserve">) para disparar o </w:t>
+      </w:r>
+      <w:proofErr w:type="spellStart"/>
+      <w:r>
+        <w:t>deploy</w:t>
+      </w:r>
+      <w:proofErr w:type="spellEnd"/>
+      <w:r>
+        <w:t xml:space="preserve"> automatizado na nuvem da </w:t>
+      </w:r>
+      <w:proofErr w:type="spellStart"/>
+      <w:r>
+        <w:t>Vercel</w:t>
+      </w:r>
+      <w:proofErr w:type="spellEnd"/>
+      <w:r>
+        <w:t>.</w:t>
+      </w:r>
+    </w:p>
+    <w:p>
+      <w:pPr>
+        <w:pStyle w:val="PargrafodaLista"/>
+      </w:pPr>
+      <w:r>
+        <w:rPr>
+          <w:b/>
+          <w:bCs/>
+        </w:rPr>
+        <w:t>3. ESTRUTURA DA PÁGINA PRINCIPAL (LAYOUT ATUAL)</w:t>
+      </w:r>
+      <w:r>
+        <w:br/>
+        <w:t>A interface foi projetada em um sistema de 3 colunas principais em desktop, com as seguintes proporções e regras visuais:</w:t>
       </w:r>
     </w:p>
     <w:p>
@@ -583,25 +576,19 @@
         <w:pStyle w:val="PargrafodaLista"/>
         <w:numPr>
           <w:ilvl w:val="0"/>
-          <w:numId w:val="1"/>
+          <w:numId w:val="9"/>
         </w:numPr>
       </w:pPr>
       <w:r>
-        <w:t>Enquanto o cliente não preencher os seus dados</w:t>
-      </w:r>
-      <w:r>
-        <w:t xml:space="preserve"> e não tiver nenhum item no Orçamento</w:t>
-      </w:r>
-      <w:r>
-        <w:t xml:space="preserve">, não liberar o botão </w:t>
-      </w:r>
-      <w:r>
-        <w:t>“Enviar Orçamento”</w:t>
-      </w:r>
-    </w:p>
-    <w:p>
-      <w:r>
-        <w:t>Ajustes:</w:t>
+        <w:rPr>
+          <w:b/>
+          <w:bCs/>
+        </w:rPr>
+        <w:lastRenderedPageBreak/>
+        <w:t>Coluna Esquerda:</w:t>
+      </w:r>
+      <w:r>
+        <w:t xml:space="preserve"> Fachada da loja física expandida em +30% na largura horizontal para destaque visual.</w:t>
       </w:r>
     </w:p>
     <w:p>
@@ -609,11 +596,18 @@
         <w:pStyle w:val="PargrafodaLista"/>
         <w:numPr>
           <w:ilvl w:val="0"/>
-          <w:numId w:val="2"/>
+          <w:numId w:val="9"/>
         </w:numPr>
       </w:pPr>
       <w:r>
-        <w:t>Reduzir a largura das seguintes colunas do formulário “Pedido de Orçamento”: coluna 1 reduzir 50%; coluna 2 reduzir 60%, coluna 4 reduzir 50%, coluna 5 reduzir 10%, coluna 6 reduzir 10%. Remanejar o espaço que sobrar para a coluna 3;</w:t>
+        <w:rPr>
+          <w:b/>
+          <w:bCs/>
+        </w:rPr>
+        <w:t>Coluna Central:</w:t>
+      </w:r>
+      <w:r>
+        <w:t xml:space="preserve"> Formulário amarelo de identificação do cliente (com campos condicionais para PF/PJ, Nome, Endereço, etc.), reduzido em -30% na largura horizontal para evitar sobreposições. Inclui o botão "Ver Catálogo de Produtos".</w:t>
       </w:r>
     </w:p>
     <w:p>
@@ -621,34 +615,44 @@
         <w:pStyle w:val="PargrafodaLista"/>
         <w:numPr>
           <w:ilvl w:val="0"/>
-          <w:numId w:val="1"/>
+          <w:numId w:val="9"/>
         </w:numPr>
       </w:pPr>
       <w:r>
-        <w:lastRenderedPageBreak/>
-        <w:t>O celular 27 9998021221 está cadastrado para envio de Whatsapp. Ao clicar no botão “Enviar Orçamento” deve abrir automaticamente o whatsapp desse número com a mensagem e o anexo.</w:t>
-      </w:r>
-    </w:p>
-    <w:p>
-      <w:pPr>
-        <w:ind w:left="360"/>
         <w:rPr>
-          <w:color w:val="EE0000"/>
+          <w:b/>
+          <w:bCs/>
         </w:rPr>
-      </w:pPr>
-    </w:p>
-    <w:p>
-      <w:pPr>
-        <w:ind w:left="360"/>
+        <w:t>Coluna Direita:</w:t>
+      </w:r>
+      <w:r>
+        <w:t xml:space="preserve"> Painel "Seu Orçamento" fixado permanentemente na lateral direita (sem comportamento de arrastar). Dedica </w:t>
+      </w:r>
+      <w:r>
         <w:rPr>
-          <w:color w:val="EE0000"/>
+          <w:b/>
+          <w:bCs/>
         </w:rPr>
-      </w:pPr>
-      <w:r>
-        <w:rPr>
-          <w:color w:val="EE0000"/>
-        </w:rPr>
-        <w:t>IMPLEMENTAR:</w:t>
+        <w:t>100% do seu espaço vertical</w:t>
+      </w:r>
+      <w:r>
+        <w:t xml:space="preserve"> para a exibição limpa da lista atual de produtos e valores selecionados pelo cliente. Suas fontes dinâmicas e o texto fixo de aviso legal ("Os preços são do catálogo do dia...") usam tamanhos discretos (</w:t>
+      </w:r>
+      <w:proofErr w:type="spellStart"/>
+      <w:r>
+        <w:t>text-sm</w:t>
+      </w:r>
+      <w:proofErr w:type="spellEnd"/>
+      <w:r>
+        <w:t xml:space="preserve"> e </w:t>
+      </w:r>
+      <w:proofErr w:type="spellStart"/>
+      <w:r>
+        <w:t>text-xs</w:t>
+      </w:r>
+      <w:proofErr w:type="spellEnd"/>
+      <w:r>
+        <w:t>).</w:t>
       </w:r>
     </w:p>
     <w:p>
@@ -656,28 +660,454 @@
         <w:pStyle w:val="PargrafodaLista"/>
         <w:numPr>
           <w:ilvl w:val="0"/>
-          <w:numId w:val="3"/>
+          <w:numId w:val="9"/>
         </w:numPr>
+      </w:pPr>
+      <w:r>
         <w:rPr>
-          <w:color w:val="EE0000"/>
+          <w:b/>
+          <w:bCs/>
         </w:rPr>
-      </w:pPr>
+        <w:t>Rodapé (</w:t>
+      </w:r>
+      <w:proofErr w:type="spellStart"/>
       <w:r>
         <w:rPr>
-          <w:color w:val="EE0000"/>
+          <w:b/>
+          <w:bCs/>
         </w:rPr>
-        <w:t>O cliente precisa ter uma forma de ver seu orçamento.</w:t>
+        <w:t>Footer</w:t>
+      </w:r>
+      <w:proofErr w:type="spellEnd"/>
+      <w:r>
+        <w:rPr>
+          <w:b/>
+          <w:bCs/>
+        </w:rPr>
+        <w:t>):</w:t>
+      </w:r>
+      <w:r>
+        <w:t xml:space="preserve"> Ocupa toda a largura da base (w-full), contendo os dados institucionais recuperados (Endereço, CNPJ, Telefones, WhatsApp e o botão com link "Como chegar").</w:t>
       </w:r>
     </w:p>
     <w:p>
       <w:pPr>
         <w:pStyle w:val="PargrafodaLista"/>
       </w:pPr>
+      <w:r>
+        <w:rPr>
+          <w:b/>
+          <w:bCs/>
+        </w:rPr>
+        <w:t>4. FUNCIONALIDADES CORE E COMPORTAMENTOS</w:t>
+      </w:r>
     </w:p>
     <w:p>
       <w:pPr>
         <w:pStyle w:val="PargrafodaLista"/>
-      </w:pPr>
+        <w:numPr>
+          <w:ilvl w:val="0"/>
+          <w:numId w:val="10"/>
+        </w:numPr>
+      </w:pPr>
+      <w:r>
+        <w:rPr>
+          <w:b/>
+          <w:bCs/>
+        </w:rPr>
+        <w:t xml:space="preserve">Menu </w:t>
+      </w:r>
+      <w:proofErr w:type="spellStart"/>
+      <w:r>
+        <w:rPr>
+          <w:b/>
+          <w:bCs/>
+        </w:rPr>
+        <w:t>Pull</w:t>
+      </w:r>
+      <w:proofErr w:type="spellEnd"/>
+      <w:r>
+        <w:rPr>
+          <w:b/>
+          <w:bCs/>
+        </w:rPr>
+        <w:t>-Down "Meus Orçamentos":</w:t>
+      </w:r>
+      <w:r>
+        <w:t xml:space="preserve"> Localizado no menu superior (Header), substituiu o antigo link ocioso. Contém a </w:t>
+      </w:r>
+      <w:proofErr w:type="spellStart"/>
+      <w:r>
+        <w:t>subopção</w:t>
+      </w:r>
+      <w:proofErr w:type="spellEnd"/>
+      <w:r>
+        <w:t xml:space="preserve"> </w:t>
+      </w:r>
+      <w:r>
+        <w:rPr>
+          <w:b/>
+          <w:bCs/>
+        </w:rPr>
+        <w:t>"Histórico de Orçamentos"</w:t>
+      </w:r>
+      <w:r>
+        <w:t>.</w:t>
+      </w:r>
+    </w:p>
+    <w:p>
+      <w:pPr>
+        <w:pStyle w:val="PargrafodaLista"/>
+        <w:numPr>
+          <w:ilvl w:val="0"/>
+          <w:numId w:val="10"/>
+        </w:numPr>
+      </w:pPr>
+      <w:r>
+        <w:rPr>
+          <w:b/>
+          <w:bCs/>
+        </w:rPr>
+        <w:t>Modal de Histórico (</w:t>
+      </w:r>
+      <w:proofErr w:type="spellStart"/>
+      <w:r>
+        <w:rPr>
+          <w:b/>
+          <w:bCs/>
+        </w:rPr>
+        <w:t>LocalStorage</w:t>
+      </w:r>
+      <w:proofErr w:type="spellEnd"/>
+      <w:r>
+        <w:rPr>
+          <w:b/>
+          <w:bCs/>
+        </w:rPr>
+        <w:t>):</w:t>
+      </w:r>
+      <w:r>
+        <w:t xml:space="preserve"> Ao clicar no histórico do menu superior, abre-se um modal elegante e centralizado que lê os dados salvos no </w:t>
+      </w:r>
+      <w:proofErr w:type="spellStart"/>
+      <w:r>
+        <w:t>localStorage</w:t>
+      </w:r>
+      <w:proofErr w:type="spellEnd"/>
+      <w:r>
+        <w:t xml:space="preserve"> do navegador do cliente. Cada linha exibe os dados de orçamentos anteriores com duas ações estritas: </w:t>
+      </w:r>
+      <w:r>
+        <w:rPr>
+          <w:b/>
+          <w:bCs/>
+        </w:rPr>
+        <w:t>"Visualizar"</w:t>
+      </w:r>
+      <w:r>
+        <w:t xml:space="preserve"> e </w:t>
+      </w:r>
+      <w:r>
+        <w:rPr>
+          <w:b/>
+          <w:bCs/>
+        </w:rPr>
+        <w:t>"Editar/Recarregar"</w:t>
+      </w:r>
+      <w:r>
+        <w:t xml:space="preserve"> (que reinjeta os produtos e dados antigos no carrinho principal para edição, fechando o modal).</w:t>
+      </w:r>
+    </w:p>
+    <w:p>
+      <w:pPr>
+        <w:pStyle w:val="PargrafodaLista"/>
+        <w:numPr>
+          <w:ilvl w:val="0"/>
+          <w:numId w:val="10"/>
+        </w:numPr>
+      </w:pPr>
+      <w:r>
+        <w:rPr>
+          <w:b/>
+          <w:bCs/>
+        </w:rPr>
+        <w:t>Catálogo Flutuante:</w:t>
+      </w:r>
+      <w:r>
+        <w:t xml:space="preserve"> O modal do "Catálogo de Produtos" possui comportamento flutuante e sistema Drag </w:t>
+      </w:r>
+      <w:proofErr w:type="spellStart"/>
+      <w:r>
+        <w:t>and</w:t>
+      </w:r>
+      <w:proofErr w:type="spellEnd"/>
+      <w:r>
+        <w:t xml:space="preserve"> </w:t>
+      </w:r>
+      <w:proofErr w:type="spellStart"/>
+      <w:r>
+        <w:t>Drop</w:t>
+      </w:r>
+      <w:proofErr w:type="spellEnd"/>
+      <w:r>
+        <w:t xml:space="preserve"> (arrastável), permitindo movimentação livre pela tela.</w:t>
+      </w:r>
+    </w:p>
+    <w:p>
+      <w:pPr>
+        <w:pStyle w:val="PargrafodaLista"/>
+        <w:numPr>
+          <w:ilvl w:val="0"/>
+          <w:numId w:val="10"/>
+        </w:numPr>
+      </w:pPr>
+      <w:r>
+        <w:rPr>
+          <w:b/>
+          <w:bCs/>
+        </w:rPr>
+        <w:t>Área Restrita:</w:t>
+      </w:r>
+      <w:r>
+        <w:t xml:space="preserve"> Seção protegida por senha de administrador para gerenciamento interno de produtos.</w:t>
+      </w:r>
+    </w:p>
+    <w:p>
+      <w:pPr>
+        <w:pStyle w:val="PargrafodaLista"/>
+      </w:pPr>
+      <w:r>
+        <w:rPr>
+          <w:b/>
+          <w:bCs/>
+        </w:rPr>
+        <w:t>PONTO ATUAL DO PROJETO:</w:t>
+      </w:r>
+      <w:r>
+        <w:br/>
+        <w:t xml:space="preserve">O layout de 3 colunas (com rebalanceamento de 30%), a expansão total do painel "Seu Orçamento" na direita, o novo menu </w:t>
+      </w:r>
+      <w:proofErr w:type="spellStart"/>
+      <w:r>
+        <w:t>pull-down</w:t>
+      </w:r>
+      <w:proofErr w:type="spellEnd"/>
+      <w:r>
+        <w:t xml:space="preserve"> com modal de histórico via </w:t>
+      </w:r>
+      <w:proofErr w:type="spellStart"/>
+      <w:r>
+        <w:t>localStorage</w:t>
+      </w:r>
+      <w:proofErr w:type="spellEnd"/>
+      <w:r>
+        <w:t xml:space="preserve">, o catálogo arrastável e a automação de </w:t>
+      </w:r>
+      <w:proofErr w:type="spellStart"/>
+      <w:r>
+        <w:t>deploy</w:t>
+      </w:r>
+      <w:proofErr w:type="spellEnd"/>
+      <w:r>
+        <w:t xml:space="preserve"> estão 100% implementados, consolidados e publicados na </w:t>
+      </w:r>
+      <w:proofErr w:type="spellStart"/>
+      <w:r>
+        <w:t>Vercel</w:t>
+      </w:r>
+      <w:proofErr w:type="spellEnd"/>
+      <w:r>
+        <w:t>.</w:t>
+      </w:r>
+    </w:p>
+    <w:p>
+      <w:pPr>
+        <w:pStyle w:val="PargrafodaLista"/>
+      </w:pPr>
+      <w:r>
+        <w:t>Aguarde minhas próximas instruções para saber qual funcionalidade, correção ou nova seção iremos desenvolver a partir deste ponto.</w:t>
+      </w:r>
+    </w:p>
+    <w:p>
+      <w:pPr>
+        <w:pStyle w:val="PargrafodaLista"/>
+      </w:pPr>
+      <w:r>
+        <w:pict w14:anchorId="0FEBC54F">
+          <v:rect id="_x0000_i1025" style="width:0;height:1.5pt" o:hralign="center" o:hrstd="t" o:hr="t" fillcolor="#a0a0a0" stroked="f"/>
+        </w:pict>
+      </w:r>
+    </w:p>
+    <w:p>
+      <w:pPr>
+        <w:pStyle w:val="PargrafodaLista"/>
+      </w:pPr>
+      <w:r>
+        <w:t>Bom descanso e até amanhã! O projeto deu um salto gigante hoje.</w:t>
+      </w:r>
+    </w:p>
+    <w:p>
+      <w:pPr>
+        <w:pStyle w:val="PargrafodaLista"/>
+      </w:pPr>
+    </w:p>
+    <w:p>
+      <w:pPr>
+        <w:pStyle w:val="PargrafodaLista"/>
+      </w:pPr>
+      <w:r>
+        <w:t xml:space="preserve">============================== </w:t>
+      </w:r>
+      <w:r>
+        <w:t>Vamos refinar a lógica de gravação e exibição do "Histórico de Orçamentos" para usar o CPF/CNPJ como chave de controle:</w:t>
+      </w:r>
+    </w:p>
+    <w:p>
+      <w:pPr>
+        <w:pStyle w:val="PargrafodaLista"/>
+      </w:pPr>
+    </w:p>
+    <w:p>
+      <w:pPr>
+        <w:pStyle w:val="PargrafodaLista"/>
+      </w:pPr>
+      <w:r>
+        <w:lastRenderedPageBreak/>
+        <w:t xml:space="preserve">1. Ao salvar um orçamento no </w:t>
+      </w:r>
+      <w:proofErr w:type="spellStart"/>
+      <w:r>
+        <w:t>localStorage</w:t>
+      </w:r>
+      <w:proofErr w:type="spellEnd"/>
+      <w:r>
+        <w:t>, certifique-se de vincular o registro ao CPF ou CNPJ preenchido no formulário amarelo naquele momento.</w:t>
+      </w:r>
+    </w:p>
+    <w:p>
+      <w:pPr>
+        <w:pStyle w:val="PargrafodaLista"/>
+      </w:pPr>
+      <w:r>
+        <w:t xml:space="preserve">2. Modifique o modal "Meus Orçamentos": ele deve verificar qual CPF ou CNPJ está digitado no formulário amarelo. </w:t>
+      </w:r>
+    </w:p>
+    <w:p>
+      <w:pPr>
+        <w:pStyle w:val="PargrafodaLista"/>
+      </w:pPr>
+      <w:r>
+        <w:t xml:space="preserve">   - Se houver um documento digitado, filtre a lista e exiba APENAS os orçamentos históricos que pertencem a esse CPF/CNPJ.</w:t>
+      </w:r>
+    </w:p>
+    <w:p>
+      <w:pPr>
+        <w:pStyle w:val="PargrafodaLista"/>
+      </w:pPr>
+      <w:r>
+        <w:t xml:space="preserve">   - Se o campo de documento estiver vazio, exiba uma mensagem amigável solicitando: "Por favor, digite seu CPF ou CNPJ no formulário para consultar seu histórico de orçamentos."</w:t>
+      </w:r>
+    </w:p>
+    <w:p>
+      <w:pPr>
+        <w:pStyle w:val="PargrafodaLista"/>
+      </w:pPr>
+      <w:r>
+        <w:t>3. Após concluir a alteração, abra o terminal e envie as atualizações para a nuvem:</w:t>
+      </w:r>
+    </w:p>
+    <w:p>
+      <w:pPr>
+        <w:pStyle w:val="PargrafodaLista"/>
+      </w:pPr>
+      <w:r>
+        <w:t xml:space="preserve">   </w:t>
+      </w:r>
+      <w:proofErr w:type="spellStart"/>
+      <w:r>
+        <w:t>git</w:t>
+      </w:r>
+      <w:proofErr w:type="spellEnd"/>
+      <w:r>
+        <w:t xml:space="preserve"> </w:t>
+      </w:r>
+      <w:proofErr w:type="spellStart"/>
+      <w:r>
+        <w:t>add</w:t>
+      </w:r>
+      <w:proofErr w:type="spellEnd"/>
+      <w:r>
+        <w:t xml:space="preserve"> .</w:t>
+      </w:r>
+    </w:p>
+    <w:p>
+      <w:pPr>
+        <w:pStyle w:val="PargrafodaLista"/>
+      </w:pPr>
+      <w:r>
+        <w:t xml:space="preserve">   </w:t>
+      </w:r>
+      <w:proofErr w:type="spellStart"/>
+      <w:r>
+        <w:t>git</w:t>
+      </w:r>
+      <w:proofErr w:type="spellEnd"/>
+      <w:r>
+        <w:t xml:space="preserve"> </w:t>
+      </w:r>
+      <w:proofErr w:type="spellStart"/>
+      <w:r>
+        <w:t>commit</w:t>
+      </w:r>
+      <w:proofErr w:type="spellEnd"/>
+      <w:r>
+        <w:t xml:space="preserve"> -m "</w:t>
+      </w:r>
+      <w:proofErr w:type="spellStart"/>
+      <w:r>
+        <w:t>fix</w:t>
+      </w:r>
+      <w:proofErr w:type="spellEnd"/>
+      <w:r>
+        <w:t>: atrela e filtra o histórico de orçamentos estritamente por CPF/CNPJ"</w:t>
+      </w:r>
+    </w:p>
+    <w:p>
+      <w:pPr>
+        <w:pStyle w:val="PargrafodaLista"/>
+      </w:pPr>
+      <w:r>
+        <w:t xml:space="preserve">   </w:t>
+      </w:r>
+      <w:proofErr w:type="spellStart"/>
+      <w:r>
+        <w:t>git</w:t>
+      </w:r>
+      <w:proofErr w:type="spellEnd"/>
+      <w:r>
+        <w:t xml:space="preserve"> </w:t>
+      </w:r>
+      <w:proofErr w:type="spellStart"/>
+      <w:r>
+        <w:t>push</w:t>
+      </w:r>
+      <w:proofErr w:type="spellEnd"/>
+      <w:r>
+        <w:t xml:space="preserve"> </w:t>
+      </w:r>
+      <w:proofErr w:type="spellStart"/>
+      <w:r>
+        <w:t>origin</w:t>
+      </w:r>
+      <w:proofErr w:type="spellEnd"/>
+      <w:r>
+        <w:t xml:space="preserve"> </w:t>
+      </w:r>
+      <w:proofErr w:type="spellStart"/>
+      <w:r>
+        <w:t>main</w:t>
+      </w:r>
+      <w:proofErr w:type="spellEnd"/>
     </w:p>
     <w:sectPr>
       <w:pgSz w:w="11906" w:h="16838"/>
@@ -692,6 +1122,333 @@
 <file path=word/numbering.xml><?xml version="1.0" encoding="utf-8"?>
 <w:numbering xmlns:wpc="http://schemas.microsoft.com/office/word/2010/wordprocessingCanvas" xmlns:cx="http://schemas.microsoft.com/office/drawing/2014/chartex" xmlns:cx1="http://schemas.microsoft.com/office/drawing/2015/9/8/chartex" xmlns:cx2="http://schemas.microsoft.com/office/drawing/2015/10/21/chartex" xmlns:cx3="http://schemas.microsoft.com/office/drawing/2016/5/9/chartex" xmlns:cx4="http://schemas.microsoft.com/office/drawing/2016/5/10/chartex" xmlns:cx5="http://schemas.microsoft.com/office/drawing/2016/5/11/chartex" xmlns:cx6="http://schemas.microsoft.com/office/drawing/2016/5/12/chartex" xmlns:cx7="http://schemas.microsoft.com/office/drawing/2016/5/13/chartex" xmlns:cx8="http://schemas.microsoft.com/office/drawing/2016/5/14/chartex" xmlns:mc="http://schemas.openxmlformats.org/markup-compatibility/2006" xmlns:aink="http://schemas.microsoft.com/office/drawing/2016/ink" xmlns:am3d="http://schemas.microsoft.com/office/drawing/2017/model3d" xmlns:o="urn:schemas-microsoft-com:office:office" xmlns:oel="http://schemas.microsoft.com/office/2019/extlst" xmlns:r="http://schemas.openxmlformats.org/officeDocument/2006/relationships" xmlns:m="http://schemas.openxmlformats.org/officeDocument/2006/math" xmlns:v="urn:schemas-microsoft-com:vml" xmlns:wp14="http://schemas.microsoft.com/office/word/2010/wordprocessingDrawing" xmlns:wp="http://schemas.openxmlformats.org/drawingml/2006/wordprocessingDrawing" xmlns:w10="urn:schemas-microsoft-com:office:word" xmlns:w="http://schemas.openxmlformats.org/wordprocessingml/2006/main" xmlns:w14="http://schemas.microsoft.com/office/word/2010/wordml" xmlns:w15="http://schemas.microsoft.com/office/word/2012/wordml" xmlns:w16cex="http://schemas.microsoft.com/office/word/2018/wordml/cex" xmlns:w16cid="http://schemas.microsoft.com/office/word/2016/wordml/cid" xmlns:w16="http://schemas.microsoft.com/office/word/2018/wordml" xmlns:w16du="http://schemas.microsoft.com/office/word/2023/wordml/word16du" xmlns:w16sdtdh="http://schemas.microsoft.com/office/word/2020/wordml/sdtdatahash" xmlns:w16sdtfl="http://schemas.microsoft.com/office/word/2024/wordml/sdtformatlock" xmlns:w16se="http://schemas.microsoft.com/office/word/2015/wordml/symex" xmlns:wpg="http://schemas.microsoft.com/office/word/2010/wordprocessingGroup" xmlns:wpi="http://schemas.microsoft.com/office/word/2010/wordprocessingInk" xmlns:wne="http://schemas.microsoft.com/office/word/2006/wordml" xmlns:wps="http://schemas.microsoft.com/office/word/2010/wordprocessingShape" mc:Ignorable="w14 w15 w16se w16cid w16 w16cex w16sdtdh w16sdtfl w16du wp14">
   <w:abstractNum w:abstractNumId="0" w15:restartNumberingAfterBreak="0">
+    <w:nsid w:val="03214134"/>
+    <w:multiLevelType w:val="hybridMultilevel"/>
+    <w:tmpl w:val="FE9E8392"/>
+    <w:lvl w:ilvl="0" w:tplc="04160011">
+      <w:start w:val="1"/>
+      <w:numFmt w:val="decimal"/>
+      <w:lvlText w:val="%1)"/>
+      <w:lvlJc w:val="left"/>
+      <w:pPr>
+        <w:ind w:left="720" w:hanging="360"/>
+      </w:pPr>
+      <w:rPr>
+        <w:rFonts w:hint="default"/>
+      </w:rPr>
+    </w:lvl>
+    <w:lvl w:ilvl="1" w:tplc="04160019" w:tentative="1">
+      <w:start w:val="1"/>
+      <w:numFmt w:val="lowerLetter"/>
+      <w:lvlText w:val="%2."/>
+      <w:lvlJc w:val="left"/>
+      <w:pPr>
+        <w:ind w:left="1440" w:hanging="360"/>
+      </w:pPr>
+    </w:lvl>
+    <w:lvl w:ilvl="2" w:tplc="0416001B" w:tentative="1">
+      <w:start w:val="1"/>
+      <w:numFmt w:val="lowerRoman"/>
+      <w:lvlText w:val="%3."/>
+      <w:lvlJc w:val="right"/>
+      <w:pPr>
+        <w:ind w:left="2160" w:hanging="180"/>
+      </w:pPr>
+    </w:lvl>
+    <w:lvl w:ilvl="3" w:tplc="0416000F" w:tentative="1">
+      <w:start w:val="1"/>
+      <w:numFmt w:val="decimal"/>
+      <w:lvlText w:val="%4."/>
+      <w:lvlJc w:val="left"/>
+      <w:pPr>
+        <w:ind w:left="2880" w:hanging="360"/>
+      </w:pPr>
+    </w:lvl>
+    <w:lvl w:ilvl="4" w:tplc="04160019" w:tentative="1">
+      <w:start w:val="1"/>
+      <w:numFmt w:val="lowerLetter"/>
+      <w:lvlText w:val="%5."/>
+      <w:lvlJc w:val="left"/>
+      <w:pPr>
+        <w:ind w:left="3600" w:hanging="360"/>
+      </w:pPr>
+    </w:lvl>
+    <w:lvl w:ilvl="5" w:tplc="0416001B" w:tentative="1">
+      <w:start w:val="1"/>
+      <w:numFmt w:val="lowerRoman"/>
+      <w:lvlText w:val="%6."/>
+      <w:lvlJc w:val="right"/>
+      <w:pPr>
+        <w:ind w:left="4320" w:hanging="180"/>
+      </w:pPr>
+    </w:lvl>
+    <w:lvl w:ilvl="6" w:tplc="0416000F" w:tentative="1">
+      <w:start w:val="1"/>
+      <w:numFmt w:val="decimal"/>
+      <w:lvlText w:val="%7."/>
+      <w:lvlJc w:val="left"/>
+      <w:pPr>
+        <w:ind w:left="5040" w:hanging="360"/>
+      </w:pPr>
+    </w:lvl>
+    <w:lvl w:ilvl="7" w:tplc="04160019" w:tentative="1">
+      <w:start w:val="1"/>
+      <w:numFmt w:val="lowerLetter"/>
+      <w:lvlText w:val="%8."/>
+      <w:lvlJc w:val="left"/>
+      <w:pPr>
+        <w:ind w:left="5760" w:hanging="360"/>
+      </w:pPr>
+    </w:lvl>
+    <w:lvl w:ilvl="8" w:tplc="0416001B" w:tentative="1">
+      <w:start w:val="1"/>
+      <w:numFmt w:val="lowerRoman"/>
+      <w:lvlText w:val="%9."/>
+      <w:lvlJc w:val="right"/>
+      <w:pPr>
+        <w:ind w:left="6480" w:hanging="180"/>
+      </w:pPr>
+    </w:lvl>
+  </w:abstractNum>
+  <w:abstractNum w:abstractNumId="1" w15:restartNumberingAfterBreak="0">
+    <w:nsid w:val="04765FE3"/>
+    <w:multiLevelType w:val="multilevel"/>
+    <w:tmpl w:val="BB2CFC5C"/>
+    <w:lvl w:ilvl="0">
+      <w:start w:val="1"/>
+      <w:numFmt w:val="bullet"/>
+      <w:lvlText w:val=""/>
+      <w:lvlJc w:val="left"/>
+      <w:pPr>
+        <w:tabs>
+          <w:tab w:val="num" w:pos="720"/>
+        </w:tabs>
+        <w:ind w:left="720" w:hanging="360"/>
+      </w:pPr>
+      <w:rPr>
+        <w:rFonts w:ascii="Symbol" w:hAnsi="Symbol" w:hint="default"/>
+        <w:sz w:val="20"/>
+      </w:rPr>
+    </w:lvl>
+    <w:lvl w:ilvl="1" w:tentative="1">
+      <w:start w:val="1"/>
+      <w:numFmt w:val="bullet"/>
+      <w:lvlText w:val="o"/>
+      <w:lvlJc w:val="left"/>
+      <w:pPr>
+        <w:tabs>
+          <w:tab w:val="num" w:pos="1440"/>
+        </w:tabs>
+        <w:ind w:left="1440" w:hanging="360"/>
+      </w:pPr>
+      <w:rPr>
+        <w:rFonts w:ascii="Courier New" w:hAnsi="Courier New" w:hint="default"/>
+        <w:sz w:val="20"/>
+      </w:rPr>
+    </w:lvl>
+    <w:lvl w:ilvl="2" w:tentative="1">
+      <w:start w:val="1"/>
+      <w:numFmt w:val="bullet"/>
+      <w:lvlText w:val=""/>
+      <w:lvlJc w:val="left"/>
+      <w:pPr>
+        <w:tabs>
+          <w:tab w:val="num" w:pos="2160"/>
+        </w:tabs>
+        <w:ind w:left="2160" w:hanging="360"/>
+      </w:pPr>
+      <w:rPr>
+        <w:rFonts w:ascii="Wingdings" w:hAnsi="Wingdings" w:hint="default"/>
+        <w:sz w:val="20"/>
+      </w:rPr>
+    </w:lvl>
+    <w:lvl w:ilvl="3" w:tentative="1">
+      <w:start w:val="1"/>
+      <w:numFmt w:val="bullet"/>
+      <w:lvlText w:val=""/>
+      <w:lvlJc w:val="left"/>
+      <w:pPr>
+        <w:tabs>
+          <w:tab w:val="num" w:pos="2880"/>
+        </w:tabs>
+        <w:ind w:left="2880" w:hanging="360"/>
+      </w:pPr>
+      <w:rPr>
+        <w:rFonts w:ascii="Wingdings" w:hAnsi="Wingdings" w:hint="default"/>
+        <w:sz w:val="20"/>
+      </w:rPr>
+    </w:lvl>
+    <w:lvl w:ilvl="4" w:tentative="1">
+      <w:start w:val="1"/>
+      <w:numFmt w:val="bullet"/>
+      <w:lvlText w:val=""/>
+      <w:lvlJc w:val="left"/>
+      <w:pPr>
+        <w:tabs>
+          <w:tab w:val="num" w:pos="3600"/>
+        </w:tabs>
+        <w:ind w:left="3600" w:hanging="360"/>
+      </w:pPr>
+      <w:rPr>
+        <w:rFonts w:ascii="Wingdings" w:hAnsi="Wingdings" w:hint="default"/>
+        <w:sz w:val="20"/>
+      </w:rPr>
+    </w:lvl>
+    <w:lvl w:ilvl="5" w:tentative="1">
+      <w:start w:val="1"/>
+      <w:numFmt w:val="bullet"/>
+      <w:lvlText w:val=""/>
+      <w:lvlJc w:val="left"/>
+      <w:pPr>
+        <w:tabs>
+          <w:tab w:val="num" w:pos="4320"/>
+        </w:tabs>
+        <w:ind w:left="4320" w:hanging="360"/>
+      </w:pPr>
+      <w:rPr>
+        <w:rFonts w:ascii="Wingdings" w:hAnsi="Wingdings" w:hint="default"/>
+        <w:sz w:val="20"/>
+      </w:rPr>
+    </w:lvl>
+    <w:lvl w:ilvl="6" w:tentative="1">
+      <w:start w:val="1"/>
+      <w:numFmt w:val="bullet"/>
+      <w:lvlText w:val=""/>
+      <w:lvlJc w:val="left"/>
+      <w:pPr>
+        <w:tabs>
+          <w:tab w:val="num" w:pos="5040"/>
+        </w:tabs>
+        <w:ind w:left="5040" w:hanging="360"/>
+      </w:pPr>
+      <w:rPr>
+        <w:rFonts w:ascii="Wingdings" w:hAnsi="Wingdings" w:hint="default"/>
+        <w:sz w:val="20"/>
+      </w:rPr>
+    </w:lvl>
+    <w:lvl w:ilvl="7" w:tentative="1">
+      <w:start w:val="1"/>
+      <w:numFmt w:val="bullet"/>
+      <w:lvlText w:val=""/>
+      <w:lvlJc w:val="left"/>
+      <w:pPr>
+        <w:tabs>
+          <w:tab w:val="num" w:pos="5760"/>
+        </w:tabs>
+        <w:ind w:left="5760" w:hanging="360"/>
+      </w:pPr>
+      <w:rPr>
+        <w:rFonts w:ascii="Wingdings" w:hAnsi="Wingdings" w:hint="default"/>
+        <w:sz w:val="20"/>
+      </w:rPr>
+    </w:lvl>
+    <w:lvl w:ilvl="8" w:tentative="1">
+      <w:start w:val="1"/>
+      <w:numFmt w:val="bullet"/>
+      <w:lvlText w:val=""/>
+      <w:lvlJc w:val="left"/>
+      <w:pPr>
+        <w:tabs>
+          <w:tab w:val="num" w:pos="6480"/>
+        </w:tabs>
+        <w:ind w:left="6480" w:hanging="360"/>
+      </w:pPr>
+      <w:rPr>
+        <w:rFonts w:ascii="Wingdings" w:hAnsi="Wingdings" w:hint="default"/>
+        <w:sz w:val="20"/>
+      </w:rPr>
+    </w:lvl>
+  </w:abstractNum>
+  <w:abstractNum w:abstractNumId="2" w15:restartNumberingAfterBreak="0">
+    <w:nsid w:val="20B57917"/>
+    <w:multiLevelType w:val="hybridMultilevel"/>
+    <w:tmpl w:val="AFA85686"/>
+    <w:lvl w:ilvl="0" w:tplc="97DAED3C">
+      <w:start w:val="1"/>
+      <w:numFmt w:val="decimal"/>
+      <w:lvlText w:val="%1)"/>
+      <w:lvlJc w:val="left"/>
+      <w:pPr>
+        <w:ind w:left="1080" w:hanging="360"/>
+      </w:pPr>
+      <w:rPr>
+        <w:rFonts w:hint="default"/>
+      </w:rPr>
+    </w:lvl>
+    <w:lvl w:ilvl="1" w:tplc="04160019" w:tentative="1">
+      <w:start w:val="1"/>
+      <w:numFmt w:val="lowerLetter"/>
+      <w:lvlText w:val="%2."/>
+      <w:lvlJc w:val="left"/>
+      <w:pPr>
+        <w:ind w:left="1800" w:hanging="360"/>
+      </w:pPr>
+    </w:lvl>
+    <w:lvl w:ilvl="2" w:tplc="0416001B" w:tentative="1">
+      <w:start w:val="1"/>
+      <w:numFmt w:val="lowerRoman"/>
+      <w:lvlText w:val="%3."/>
+      <w:lvlJc w:val="right"/>
+      <w:pPr>
+        <w:ind w:left="2520" w:hanging="180"/>
+      </w:pPr>
+    </w:lvl>
+    <w:lvl w:ilvl="3" w:tplc="0416000F" w:tentative="1">
+      <w:start w:val="1"/>
+      <w:numFmt w:val="decimal"/>
+      <w:lvlText w:val="%4."/>
+      <w:lvlJc w:val="left"/>
+      <w:pPr>
+        <w:ind w:left="3240" w:hanging="360"/>
+      </w:pPr>
+    </w:lvl>
+    <w:lvl w:ilvl="4" w:tplc="04160019" w:tentative="1">
+      <w:start w:val="1"/>
+      <w:numFmt w:val="lowerLetter"/>
+      <w:lvlText w:val="%5."/>
+      <w:lvlJc w:val="left"/>
+      <w:pPr>
+        <w:ind w:left="3960" w:hanging="360"/>
+      </w:pPr>
+    </w:lvl>
+    <w:lvl w:ilvl="5" w:tplc="0416001B" w:tentative="1">
+      <w:start w:val="1"/>
+      <w:numFmt w:val="lowerRoman"/>
+      <w:lvlText w:val="%6."/>
+      <w:lvlJc w:val="right"/>
+      <w:pPr>
+        <w:ind w:left="4680" w:hanging="180"/>
+      </w:pPr>
+    </w:lvl>
+    <w:lvl w:ilvl="6" w:tplc="0416000F" w:tentative="1">
+      <w:start w:val="1"/>
+      <w:numFmt w:val="decimal"/>
+      <w:lvlText w:val="%7."/>
+      <w:lvlJc w:val="left"/>
+      <w:pPr>
+        <w:ind w:left="5400" w:hanging="360"/>
+      </w:pPr>
+    </w:lvl>
+    <w:lvl w:ilvl="7" w:tplc="04160019" w:tentative="1">
+      <w:start w:val="1"/>
+      <w:numFmt w:val="lowerLetter"/>
+      <w:lvlText w:val="%8."/>
+      <w:lvlJc w:val="left"/>
+      <w:pPr>
+        <w:ind w:left="6120" w:hanging="360"/>
+      </w:pPr>
+    </w:lvl>
+    <w:lvl w:ilvl="8" w:tplc="0416001B" w:tentative="1">
+      <w:start w:val="1"/>
+      <w:numFmt w:val="lowerRoman"/>
+      <w:lvlText w:val="%9."/>
+      <w:lvlJc w:val="right"/>
+      <w:pPr>
+        <w:ind w:left="6840" w:hanging="180"/>
+      </w:pPr>
+    </w:lvl>
+  </w:abstractNum>
+  <w:abstractNum w:abstractNumId="3" w15:restartNumberingAfterBreak="0">
     <w:nsid w:val="2D0960C6"/>
     <w:multiLevelType w:val="hybridMultilevel"/>
     <w:tmpl w:val="4508B070"/>
@@ -780,7 +1537,7 @@
       </w:pPr>
     </w:lvl>
   </w:abstractNum>
-  <w:abstractNum w:abstractNumId="1" w15:restartNumberingAfterBreak="0">
+  <w:abstractNum w:abstractNumId="4" w15:restartNumberingAfterBreak="0">
     <w:nsid w:val="3A8F41DF"/>
     <w:multiLevelType w:val="multilevel"/>
     <w:tmpl w:val="8A94E16C"/>
@@ -929,7 +1686,156 @@
       </w:rPr>
     </w:lvl>
   </w:abstractNum>
-  <w:abstractNum w:abstractNumId="2" w15:restartNumberingAfterBreak="0">
+  <w:abstractNum w:abstractNumId="5" w15:restartNumberingAfterBreak="0">
+    <w:nsid w:val="3B8F2A92"/>
+    <w:multiLevelType w:val="multilevel"/>
+    <w:tmpl w:val="CDD623DA"/>
+    <w:lvl w:ilvl="0">
+      <w:start w:val="1"/>
+      <w:numFmt w:val="bullet"/>
+      <w:lvlText w:val=""/>
+      <w:lvlJc w:val="left"/>
+      <w:pPr>
+        <w:tabs>
+          <w:tab w:val="num" w:pos="720"/>
+        </w:tabs>
+        <w:ind w:left="720" w:hanging="360"/>
+      </w:pPr>
+      <w:rPr>
+        <w:rFonts w:ascii="Symbol" w:hAnsi="Symbol" w:hint="default"/>
+        <w:sz w:val="20"/>
+      </w:rPr>
+    </w:lvl>
+    <w:lvl w:ilvl="1" w:tentative="1">
+      <w:start w:val="1"/>
+      <w:numFmt w:val="bullet"/>
+      <w:lvlText w:val="o"/>
+      <w:lvlJc w:val="left"/>
+      <w:pPr>
+        <w:tabs>
+          <w:tab w:val="num" w:pos="1440"/>
+        </w:tabs>
+        <w:ind w:left="1440" w:hanging="360"/>
+      </w:pPr>
+      <w:rPr>
+        <w:rFonts w:ascii="Courier New" w:hAnsi="Courier New" w:hint="default"/>
+        <w:sz w:val="20"/>
+      </w:rPr>
+    </w:lvl>
+    <w:lvl w:ilvl="2" w:tentative="1">
+      <w:start w:val="1"/>
+      <w:numFmt w:val="bullet"/>
+      <w:lvlText w:val=""/>
+      <w:lvlJc w:val="left"/>
+      <w:pPr>
+        <w:tabs>
+          <w:tab w:val="num" w:pos="2160"/>
+        </w:tabs>
+        <w:ind w:left="2160" w:hanging="360"/>
+      </w:pPr>
+      <w:rPr>
+        <w:rFonts w:ascii="Wingdings" w:hAnsi="Wingdings" w:hint="default"/>
+        <w:sz w:val="20"/>
+      </w:rPr>
+    </w:lvl>
+    <w:lvl w:ilvl="3" w:tentative="1">
+      <w:start w:val="1"/>
+      <w:numFmt w:val="bullet"/>
+      <w:lvlText w:val=""/>
+      <w:lvlJc w:val="left"/>
+      <w:pPr>
+        <w:tabs>
+          <w:tab w:val="num" w:pos="2880"/>
+        </w:tabs>
+        <w:ind w:left="2880" w:hanging="360"/>
+      </w:pPr>
+      <w:rPr>
+        <w:rFonts w:ascii="Wingdings" w:hAnsi="Wingdings" w:hint="default"/>
+        <w:sz w:val="20"/>
+      </w:rPr>
+    </w:lvl>
+    <w:lvl w:ilvl="4" w:tentative="1">
+      <w:start w:val="1"/>
+      <w:numFmt w:val="bullet"/>
+      <w:lvlText w:val=""/>
+      <w:lvlJc w:val="left"/>
+      <w:pPr>
+        <w:tabs>
+          <w:tab w:val="num" w:pos="3600"/>
+        </w:tabs>
+        <w:ind w:left="3600" w:hanging="360"/>
+      </w:pPr>
+      <w:rPr>
+        <w:rFonts w:ascii="Wingdings" w:hAnsi="Wingdings" w:hint="default"/>
+        <w:sz w:val="20"/>
+      </w:rPr>
+    </w:lvl>
+    <w:lvl w:ilvl="5" w:tentative="1">
+      <w:start w:val="1"/>
+      <w:numFmt w:val="bullet"/>
+      <w:lvlText w:val=""/>
+      <w:lvlJc w:val="left"/>
+      <w:pPr>
+        <w:tabs>
+          <w:tab w:val="num" w:pos="4320"/>
+        </w:tabs>
+        <w:ind w:left="4320" w:hanging="360"/>
+      </w:pPr>
+      <w:rPr>
+        <w:rFonts w:ascii="Wingdings" w:hAnsi="Wingdings" w:hint="default"/>
+        <w:sz w:val="20"/>
+      </w:rPr>
+    </w:lvl>
+    <w:lvl w:ilvl="6" w:tentative="1">
+      <w:start w:val="1"/>
+      <w:numFmt w:val="bullet"/>
+      <w:lvlText w:val=""/>
+      <w:lvlJc w:val="left"/>
+      <w:pPr>
+        <w:tabs>
+          <w:tab w:val="num" w:pos="5040"/>
+        </w:tabs>
+        <w:ind w:left="5040" w:hanging="360"/>
+      </w:pPr>
+      <w:rPr>
+        <w:rFonts w:ascii="Wingdings" w:hAnsi="Wingdings" w:hint="default"/>
+        <w:sz w:val="20"/>
+      </w:rPr>
+    </w:lvl>
+    <w:lvl w:ilvl="7" w:tentative="1">
+      <w:start w:val="1"/>
+      <w:numFmt w:val="bullet"/>
+      <w:lvlText w:val=""/>
+      <w:lvlJc w:val="left"/>
+      <w:pPr>
+        <w:tabs>
+          <w:tab w:val="num" w:pos="5760"/>
+        </w:tabs>
+        <w:ind w:left="5760" w:hanging="360"/>
+      </w:pPr>
+      <w:rPr>
+        <w:rFonts w:ascii="Wingdings" w:hAnsi="Wingdings" w:hint="default"/>
+        <w:sz w:val="20"/>
+      </w:rPr>
+    </w:lvl>
+    <w:lvl w:ilvl="8" w:tentative="1">
+      <w:start w:val="1"/>
+      <w:numFmt w:val="bullet"/>
+      <w:lvlText w:val=""/>
+      <w:lvlJc w:val="left"/>
+      <w:pPr>
+        <w:tabs>
+          <w:tab w:val="num" w:pos="6480"/>
+        </w:tabs>
+        <w:ind w:left="6480" w:hanging="360"/>
+      </w:pPr>
+      <w:rPr>
+        <w:rFonts w:ascii="Wingdings" w:hAnsi="Wingdings" w:hint="default"/>
+        <w:sz w:val="20"/>
+      </w:rPr>
+    </w:lvl>
+  </w:abstractNum>
+  <w:abstractNum w:abstractNumId="6" w15:restartNumberingAfterBreak="0">
     <w:nsid w:val="3C3737E7"/>
     <w:multiLevelType w:val="hybridMultilevel"/>
     <w:tmpl w:val="50A0703C"/>
@@ -1018,7 +1924,245 @@
       </w:pPr>
     </w:lvl>
   </w:abstractNum>
-  <w:abstractNum w:abstractNumId="3" w15:restartNumberingAfterBreak="0">
+  <w:abstractNum w:abstractNumId="7" w15:restartNumberingAfterBreak="0">
+    <w:nsid w:val="3F956B8E"/>
+    <w:multiLevelType w:val="hybridMultilevel"/>
+    <w:tmpl w:val="19BA73F2"/>
+    <w:lvl w:ilvl="0" w:tplc="04160011">
+      <w:start w:val="1"/>
+      <w:numFmt w:val="decimal"/>
+      <w:lvlText w:val="%1)"/>
+      <w:lvlJc w:val="left"/>
+      <w:pPr>
+        <w:ind w:left="720" w:hanging="360"/>
+      </w:pPr>
+      <w:rPr>
+        <w:rFonts w:hint="default"/>
+      </w:rPr>
+    </w:lvl>
+    <w:lvl w:ilvl="1" w:tplc="04160019" w:tentative="1">
+      <w:start w:val="1"/>
+      <w:numFmt w:val="lowerLetter"/>
+      <w:lvlText w:val="%2."/>
+      <w:lvlJc w:val="left"/>
+      <w:pPr>
+        <w:ind w:left="1440" w:hanging="360"/>
+      </w:pPr>
+    </w:lvl>
+    <w:lvl w:ilvl="2" w:tplc="0416001B" w:tentative="1">
+      <w:start w:val="1"/>
+      <w:numFmt w:val="lowerRoman"/>
+      <w:lvlText w:val="%3."/>
+      <w:lvlJc w:val="right"/>
+      <w:pPr>
+        <w:ind w:left="2160" w:hanging="180"/>
+      </w:pPr>
+    </w:lvl>
+    <w:lvl w:ilvl="3" w:tplc="0416000F" w:tentative="1">
+      <w:start w:val="1"/>
+      <w:numFmt w:val="decimal"/>
+      <w:lvlText w:val="%4."/>
+      <w:lvlJc w:val="left"/>
+      <w:pPr>
+        <w:ind w:left="2880" w:hanging="360"/>
+      </w:pPr>
+    </w:lvl>
+    <w:lvl w:ilvl="4" w:tplc="04160019" w:tentative="1">
+      <w:start w:val="1"/>
+      <w:numFmt w:val="lowerLetter"/>
+      <w:lvlText w:val="%5."/>
+      <w:lvlJc w:val="left"/>
+      <w:pPr>
+        <w:ind w:left="3600" w:hanging="360"/>
+      </w:pPr>
+    </w:lvl>
+    <w:lvl w:ilvl="5" w:tplc="0416001B" w:tentative="1">
+      <w:start w:val="1"/>
+      <w:numFmt w:val="lowerRoman"/>
+      <w:lvlText w:val="%6."/>
+      <w:lvlJc w:val="right"/>
+      <w:pPr>
+        <w:ind w:left="4320" w:hanging="180"/>
+      </w:pPr>
+    </w:lvl>
+    <w:lvl w:ilvl="6" w:tplc="0416000F" w:tentative="1">
+      <w:start w:val="1"/>
+      <w:numFmt w:val="decimal"/>
+      <w:lvlText w:val="%7."/>
+      <w:lvlJc w:val="left"/>
+      <w:pPr>
+        <w:ind w:left="5040" w:hanging="360"/>
+      </w:pPr>
+    </w:lvl>
+    <w:lvl w:ilvl="7" w:tplc="04160019" w:tentative="1">
+      <w:start w:val="1"/>
+      <w:numFmt w:val="lowerLetter"/>
+      <w:lvlText w:val="%8."/>
+      <w:lvlJc w:val="left"/>
+      <w:pPr>
+        <w:ind w:left="5760" w:hanging="360"/>
+      </w:pPr>
+    </w:lvl>
+    <w:lvl w:ilvl="8" w:tplc="0416001B" w:tentative="1">
+      <w:start w:val="1"/>
+      <w:numFmt w:val="lowerRoman"/>
+      <w:lvlText w:val="%9."/>
+      <w:lvlJc w:val="right"/>
+      <w:pPr>
+        <w:ind w:left="6480" w:hanging="180"/>
+      </w:pPr>
+    </w:lvl>
+  </w:abstractNum>
+  <w:abstractNum w:abstractNumId="8" w15:restartNumberingAfterBreak="0">
+    <w:nsid w:val="40814AA8"/>
+    <w:multiLevelType w:val="multilevel"/>
+    <w:tmpl w:val="96A4B72E"/>
+    <w:lvl w:ilvl="0">
+      <w:start w:val="1"/>
+      <w:numFmt w:val="bullet"/>
+      <w:lvlText w:val=""/>
+      <w:lvlJc w:val="left"/>
+      <w:pPr>
+        <w:tabs>
+          <w:tab w:val="num" w:pos="720"/>
+        </w:tabs>
+        <w:ind w:left="720" w:hanging="360"/>
+      </w:pPr>
+      <w:rPr>
+        <w:rFonts w:ascii="Symbol" w:hAnsi="Symbol" w:hint="default"/>
+        <w:sz w:val="20"/>
+      </w:rPr>
+    </w:lvl>
+    <w:lvl w:ilvl="1" w:tentative="1">
+      <w:start w:val="1"/>
+      <w:numFmt w:val="bullet"/>
+      <w:lvlText w:val="o"/>
+      <w:lvlJc w:val="left"/>
+      <w:pPr>
+        <w:tabs>
+          <w:tab w:val="num" w:pos="1440"/>
+        </w:tabs>
+        <w:ind w:left="1440" w:hanging="360"/>
+      </w:pPr>
+      <w:rPr>
+        <w:rFonts w:ascii="Courier New" w:hAnsi="Courier New" w:hint="default"/>
+        <w:sz w:val="20"/>
+      </w:rPr>
+    </w:lvl>
+    <w:lvl w:ilvl="2" w:tentative="1">
+      <w:start w:val="1"/>
+      <w:numFmt w:val="bullet"/>
+      <w:lvlText w:val=""/>
+      <w:lvlJc w:val="left"/>
+      <w:pPr>
+        <w:tabs>
+          <w:tab w:val="num" w:pos="2160"/>
+        </w:tabs>
+        <w:ind w:left="2160" w:hanging="360"/>
+      </w:pPr>
+      <w:rPr>
+        <w:rFonts w:ascii="Wingdings" w:hAnsi="Wingdings" w:hint="default"/>
+        <w:sz w:val="20"/>
+      </w:rPr>
+    </w:lvl>
+    <w:lvl w:ilvl="3" w:tentative="1">
+      <w:start w:val="1"/>
+      <w:numFmt w:val="bullet"/>
+      <w:lvlText w:val=""/>
+      <w:lvlJc w:val="left"/>
+      <w:pPr>
+        <w:tabs>
+          <w:tab w:val="num" w:pos="2880"/>
+        </w:tabs>
+        <w:ind w:left="2880" w:hanging="360"/>
+      </w:pPr>
+      <w:rPr>
+        <w:rFonts w:ascii="Wingdings" w:hAnsi="Wingdings" w:hint="default"/>
+        <w:sz w:val="20"/>
+      </w:rPr>
+    </w:lvl>
+    <w:lvl w:ilvl="4" w:tentative="1">
+      <w:start w:val="1"/>
+      <w:numFmt w:val="bullet"/>
+      <w:lvlText w:val=""/>
+      <w:lvlJc w:val="left"/>
+      <w:pPr>
+        <w:tabs>
+          <w:tab w:val="num" w:pos="3600"/>
+        </w:tabs>
+        <w:ind w:left="3600" w:hanging="360"/>
+      </w:pPr>
+      <w:rPr>
+        <w:rFonts w:ascii="Wingdings" w:hAnsi="Wingdings" w:hint="default"/>
+        <w:sz w:val="20"/>
+      </w:rPr>
+    </w:lvl>
+    <w:lvl w:ilvl="5" w:tentative="1">
+      <w:start w:val="1"/>
+      <w:numFmt w:val="bullet"/>
+      <w:lvlText w:val=""/>
+      <w:lvlJc w:val="left"/>
+      <w:pPr>
+        <w:tabs>
+          <w:tab w:val="num" w:pos="4320"/>
+        </w:tabs>
+        <w:ind w:left="4320" w:hanging="360"/>
+      </w:pPr>
+      <w:rPr>
+        <w:rFonts w:ascii="Wingdings" w:hAnsi="Wingdings" w:hint="default"/>
+        <w:sz w:val="20"/>
+      </w:rPr>
+    </w:lvl>
+    <w:lvl w:ilvl="6" w:tentative="1">
+      <w:start w:val="1"/>
+      <w:numFmt w:val="bullet"/>
+      <w:lvlText w:val=""/>
+      <w:lvlJc w:val="left"/>
+      <w:pPr>
+        <w:tabs>
+          <w:tab w:val="num" w:pos="5040"/>
+        </w:tabs>
+        <w:ind w:left="5040" w:hanging="360"/>
+      </w:pPr>
+      <w:rPr>
+        <w:rFonts w:ascii="Wingdings" w:hAnsi="Wingdings" w:hint="default"/>
+        <w:sz w:val="20"/>
+      </w:rPr>
+    </w:lvl>
+    <w:lvl w:ilvl="7" w:tentative="1">
+      <w:start w:val="1"/>
+      <w:numFmt w:val="bullet"/>
+      <w:lvlText w:val=""/>
+      <w:lvlJc w:val="left"/>
+      <w:pPr>
+        <w:tabs>
+          <w:tab w:val="num" w:pos="5760"/>
+        </w:tabs>
+        <w:ind w:left="5760" w:hanging="360"/>
+      </w:pPr>
+      <w:rPr>
+        <w:rFonts w:ascii="Wingdings" w:hAnsi="Wingdings" w:hint="default"/>
+        <w:sz w:val="20"/>
+      </w:rPr>
+    </w:lvl>
+    <w:lvl w:ilvl="8" w:tentative="1">
+      <w:start w:val="1"/>
+      <w:numFmt w:val="bullet"/>
+      <w:lvlText w:val=""/>
+      <w:lvlJc w:val="left"/>
+      <w:pPr>
+        <w:tabs>
+          <w:tab w:val="num" w:pos="6480"/>
+        </w:tabs>
+        <w:ind w:left="6480" w:hanging="360"/>
+      </w:pPr>
+      <w:rPr>
+        <w:rFonts w:ascii="Wingdings" w:hAnsi="Wingdings" w:hint="default"/>
+        <w:sz w:val="20"/>
+      </w:rPr>
+    </w:lvl>
+  </w:abstractNum>
+  <w:abstractNum w:abstractNumId="9" w15:restartNumberingAfterBreak="0">
     <w:nsid w:val="571A3C7E"/>
     <w:multiLevelType w:val="hybridMultilevel"/>
     <w:tmpl w:val="8F2E537C"/>
@@ -1108,16 +2252,34 @@
     </w:lvl>
   </w:abstractNum>
   <w:num w:numId="1" w16cid:durableId="2110393538">
+    <w:abstractNumId w:val="3"/>
+  </w:num>
+  <w:num w:numId="2" w16cid:durableId="906382625">
+    <w:abstractNumId w:val="6"/>
+  </w:num>
+  <w:num w:numId="3" w16cid:durableId="1895853702">
+    <w:abstractNumId w:val="9"/>
+  </w:num>
+  <w:num w:numId="4" w16cid:durableId="1257983223">
+    <w:abstractNumId w:val="4"/>
+  </w:num>
+  <w:num w:numId="5" w16cid:durableId="1159269155">
     <w:abstractNumId w:val="0"/>
   </w:num>
-  <w:num w:numId="2" w16cid:durableId="906382625">
+  <w:num w:numId="6" w16cid:durableId="802188752">
+    <w:abstractNumId w:val="7"/>
+  </w:num>
+  <w:num w:numId="7" w16cid:durableId="1673294507">
     <w:abstractNumId w:val="2"/>
   </w:num>
-  <w:num w:numId="3" w16cid:durableId="1895853702">
-    <w:abstractNumId w:val="3"/>
+  <w:num w:numId="8" w16cid:durableId="270280957">
+    <w:abstractNumId w:val="1"/>
   </w:num>
-  <w:num w:numId="4" w16cid:durableId="1257983223">
-    <w:abstractNumId w:val="1"/>
+  <w:num w:numId="9" w16cid:durableId="1378966432">
+    <w:abstractNumId w:val="5"/>
+  </w:num>
+  <w:num w:numId="10" w16cid:durableId="1729956909">
+    <w:abstractNumId w:val="8"/>
   </w:num>
 </w:numbering>
 </file>
@@ -1725,6 +2887,7 @@
   <w:style w:type="character" w:default="1" w:styleId="Fontepargpadro">
     <w:name w:val="Default Paragraph Font"/>
     <w:uiPriority w:val="1"/>
+    <w:semiHidden/>
     <w:unhideWhenUsed/>
   </w:style>
   <w:style w:type="table" w:default="1" w:styleId="Tabelanormal">

</xml_diff>

<commit_message>
fix: eliminando texto antigo do whatsapp definitivamente
</commit_message>
<xml_diff>
--- a/Prompt.docx
+++ b/Prompt.docx
@@ -18,135 +18,9 @@
     </w:p>
     <w:p>
       <w:r>
-        <w:t xml:space="preserve">Acesso Celular: </w:t>
+        <w:t xml:space="preserve">Link acesso: </w:t>
       </w:r>
       <w:hyperlink r:id="rId6" w:history="1">
-        <w:r>
-          <w:rPr>
-            <w:rStyle w:val="Hyperlink"/>
-          </w:rPr>
-          <w:t>http://192.168.15.65:8765/</w:t>
-        </w:r>
-      </w:hyperlink>
-    </w:p>
-    <w:p>
-      <w:r>
-        <w:t xml:space="preserve">senha área restrita: </w:t>
-      </w:r>
-      <w:r>
-        <w:t>GigaAdmin2026</w:t>
-      </w:r>
-    </w:p>
-    <w:p>
-      <w:r>
-        <w:t>GitHub (e executar no Cursos)</w:t>
-      </w:r>
-    </w:p>
-    <w:p>
-      <w:proofErr w:type="spellStart"/>
-      <w:r>
-        <w:t>git</w:t>
-      </w:r>
-      <w:proofErr w:type="spellEnd"/>
-      <w:r>
-        <w:t xml:space="preserve"> </w:t>
-      </w:r>
-      <w:proofErr w:type="spellStart"/>
-      <w:r>
-        <w:t>remote</w:t>
-      </w:r>
-      <w:proofErr w:type="spellEnd"/>
-      <w:r>
-        <w:t xml:space="preserve"> </w:t>
-      </w:r>
-      <w:proofErr w:type="spellStart"/>
-      <w:r>
-        <w:t>add</w:t>
-      </w:r>
-      <w:proofErr w:type="spellEnd"/>
-      <w:r>
-        <w:t xml:space="preserve"> </w:t>
-      </w:r>
-      <w:proofErr w:type="spellStart"/>
-      <w:r>
-        <w:t>origin</w:t>
-      </w:r>
-      <w:proofErr w:type="spellEnd"/>
-      <w:r>
-        <w:t xml:space="preserve"> </w:t>
-      </w:r>
-      <w:r>
-        <w:t>https://github.com/iandreao/gigaeletro.git</w:t>
-      </w:r>
-    </w:p>
-    <w:p>
-      <w:proofErr w:type="spellStart"/>
-      <w:r>
-        <w:t>git</w:t>
-      </w:r>
-      <w:proofErr w:type="spellEnd"/>
-      <w:r>
-        <w:t xml:space="preserve"> </w:t>
-      </w:r>
-      <w:proofErr w:type="spellStart"/>
-      <w:r>
-        <w:t>push</w:t>
-      </w:r>
-      <w:proofErr w:type="spellEnd"/>
-      <w:r>
-        <w:t xml:space="preserve"> -u </w:t>
-      </w:r>
-      <w:proofErr w:type="spellStart"/>
-      <w:r>
-        <w:t>origin</w:t>
-      </w:r>
-      <w:proofErr w:type="spellEnd"/>
-      <w:r>
-        <w:t xml:space="preserve"> </w:t>
-      </w:r>
-      <w:proofErr w:type="spellStart"/>
-      <w:r>
-        <w:t>main</w:t>
-      </w:r>
-      <w:proofErr w:type="spellEnd"/>
-    </w:p>
-    <w:p>
-      <w:proofErr w:type="spellStart"/>
-      <w:r>
-        <w:t>git</w:t>
-      </w:r>
-      <w:proofErr w:type="spellEnd"/>
-      <w:r>
-        <w:t xml:space="preserve"> </w:t>
-      </w:r>
-      <w:proofErr w:type="spellStart"/>
-      <w:r>
-        <w:t>config</w:t>
-      </w:r>
-      <w:proofErr w:type="spellEnd"/>
-      <w:r>
-        <w:t xml:space="preserve"> --global </w:t>
-      </w:r>
-      <w:proofErr w:type="spellStart"/>
-      <w:r>
-        <w:t>user.email</w:t>
-      </w:r>
-      <w:proofErr w:type="spellEnd"/>
-      <w:r>
-        <w:t xml:space="preserve"> "</w:t>
-      </w:r>
-      <w:r>
-        <w:t>iandreao1308@gmail</w:t>
-      </w:r>
-      <w:r>
-        <w:t>.com"</w:t>
-      </w:r>
-    </w:p>
-    <w:p>
-      <w:r>
-        <w:t xml:space="preserve">Link acesso: </w:t>
-      </w:r>
-      <w:hyperlink r:id="rId7" w:history="1">
         <w:r>
           <w:rPr>
             <w:rStyle w:val="Hyperlink"/>
@@ -154,6 +28,119 @@
           <w:t>https://gigaeletro.vercel.app/</w:t>
         </w:r>
       </w:hyperlink>
+    </w:p>
+    <w:p>
+      <w:r>
+        <w:t xml:space="preserve">senha área restrita: </w:t>
+      </w:r>
+      <w:r>
+        <w:t>GigaAdmin2026</w:t>
+      </w:r>
+    </w:p>
+    <w:p>
+      <w:r>
+        <w:t>GitHub (e executar no Cursos)</w:t>
+      </w:r>
+    </w:p>
+    <w:p>
+      <w:proofErr w:type="spellStart"/>
+      <w:r>
+        <w:t>git</w:t>
+      </w:r>
+      <w:proofErr w:type="spellEnd"/>
+      <w:r>
+        <w:t xml:space="preserve"> </w:t>
+      </w:r>
+      <w:proofErr w:type="spellStart"/>
+      <w:r>
+        <w:t>remote</w:t>
+      </w:r>
+      <w:proofErr w:type="spellEnd"/>
+      <w:r>
+        <w:t xml:space="preserve"> </w:t>
+      </w:r>
+      <w:proofErr w:type="spellStart"/>
+      <w:r>
+        <w:t>add</w:t>
+      </w:r>
+      <w:proofErr w:type="spellEnd"/>
+      <w:r>
+        <w:t xml:space="preserve"> </w:t>
+      </w:r>
+      <w:proofErr w:type="spellStart"/>
+      <w:r>
+        <w:t>origin</w:t>
+      </w:r>
+      <w:proofErr w:type="spellEnd"/>
+      <w:r>
+        <w:t xml:space="preserve"> </w:t>
+      </w:r>
+      <w:r>
+        <w:t>https://github.com/iandreao/gigaeletro.git</w:t>
+      </w:r>
+    </w:p>
+    <w:p>
+      <w:proofErr w:type="spellStart"/>
+      <w:r>
+        <w:t>git</w:t>
+      </w:r>
+      <w:proofErr w:type="spellEnd"/>
+      <w:r>
+        <w:t xml:space="preserve"> </w:t>
+      </w:r>
+      <w:proofErr w:type="spellStart"/>
+      <w:r>
+        <w:t>push</w:t>
+      </w:r>
+      <w:proofErr w:type="spellEnd"/>
+      <w:r>
+        <w:t xml:space="preserve"> -u </w:t>
+      </w:r>
+      <w:proofErr w:type="spellStart"/>
+      <w:r>
+        <w:t>origin</w:t>
+      </w:r>
+      <w:proofErr w:type="spellEnd"/>
+      <w:r>
+        <w:t xml:space="preserve"> </w:t>
+      </w:r>
+      <w:proofErr w:type="spellStart"/>
+      <w:r>
+        <w:t>main</w:t>
+      </w:r>
+      <w:proofErr w:type="spellEnd"/>
+    </w:p>
+    <w:p>
+      <w:proofErr w:type="spellStart"/>
+      <w:r>
+        <w:t>git</w:t>
+      </w:r>
+      <w:proofErr w:type="spellEnd"/>
+      <w:r>
+        <w:t xml:space="preserve"> </w:t>
+      </w:r>
+      <w:proofErr w:type="spellStart"/>
+      <w:r>
+        <w:t>config</w:t>
+      </w:r>
+      <w:proofErr w:type="spellEnd"/>
+      <w:r>
+        <w:t xml:space="preserve"> --global </w:t>
+      </w:r>
+      <w:proofErr w:type="spellStart"/>
+      <w:r>
+        <w:t>user.email</w:t>
+      </w:r>
+      <w:proofErr w:type="spellEnd"/>
+      <w:r>
+        <w:t xml:space="preserve"> "</w:t>
+      </w:r>
+      <w:r>
+        <w:t>iandreao1308@gmail</w:t>
+      </w:r>
+      <w:r>
+        <w:t>.com"</w:t>
+      </w:r>
     </w:p>
     <w:p/>
     <w:p>
@@ -236,7 +223,7 @@
                     </pic:cNvPicPr>
                   </pic:nvPicPr>
                   <pic:blipFill>
-                    <a:blip r:embed="rId8" cstate="print">
+                    <a:blip r:embed="rId7" cstate="print">
                       <a:extLst>
                         <a:ext uri="{28A0092B-C50C-407E-A947-70E740481C1C}">
                           <a14:useLocalDpi xmlns:a14="http://schemas.microsoft.com/office/drawing/2010/main" val="0"/>
@@ -273,10 +260,9 @@
         <w:rPr>
           <w:noProof/>
         </w:rPr>
-        <w:lastRenderedPageBreak/>
         <w:drawing>
-          <wp:inline distT="0" distB="0" distL="0" distR="0" wp14:anchorId="7817BC4A" wp14:editId="3066F77F">
-            <wp:extent cx="5400040" cy="3644900"/>
+          <wp:inline distT="0" distB="0" distL="0" distR="0" wp14:anchorId="7817BC4A" wp14:editId="68BA4B45">
+            <wp:extent cx="5400040" cy="2955577"/>
             <wp:effectExtent l="0" t="0" r="0" b="0"/>
             <wp:docPr id="515555239" name="Imagem 1"/>
             <wp:cNvGraphicFramePr>
@@ -290,7 +276,7 @@
                     <pic:cNvPicPr/>
                   </pic:nvPicPr>
                   <pic:blipFill>
-                    <a:blip r:embed="rId9"/>
+                    <a:blip r:embed="rId8"/>
                     <a:stretch>
                       <a:fillRect/>
                     </a:stretch>
@@ -298,7 +284,7 @@
                   <pic:spPr>
                     <a:xfrm>
                       <a:off x="0" y="0"/>
-                      <a:ext cx="5400040" cy="3644900"/>
+                      <a:ext cx="5402995" cy="2957194"/>
                     </a:xfrm>
                     <a:prstGeom prst="rect">
                       <a:avLst/>
@@ -336,6 +322,10 @@
     <w:p>
       <w:pPr>
         <w:pStyle w:val="PargrafodaLista"/>
+        <w:rPr>
+          <w:b/>
+          <w:bCs/>
+        </w:rPr>
       </w:pPr>
     </w:p>
     <w:p>
@@ -362,18 +352,55 @@
         <w:t>SiteGigaeletro</w:t>
       </w:r>
       <w:proofErr w:type="spellEnd"/>
+      <w:r>
+        <w:rPr>
+          <w:b/>
+          <w:bCs/>
+        </w:rPr>
+        <w:t xml:space="preserve"> (Versão Outubro/2026)</w:t>
+      </w:r>
     </w:p>
     <w:p>
       <w:pPr>
         <w:pStyle w:val="PargrafodaLista"/>
-      </w:pPr>
-      <w:r>
-        <w:t>Por favor, leia este resumo para entender o estado atual do projeto, a arquitetura e as regras de negócio antes de iniciarmos as próximas tarefas.</w:t>
-      </w:r>
+        <w:rPr>
+          <w:b/>
+          <w:bCs/>
+        </w:rPr>
+      </w:pPr>
     </w:p>
     <w:p>
       <w:pPr>
         <w:pStyle w:val="PargrafodaLista"/>
+        <w:rPr>
+          <w:b/>
+          <w:bCs/>
+        </w:rPr>
+      </w:pPr>
+      <w:r>
+        <w:rPr>
+          <w:b/>
+          <w:bCs/>
+        </w:rPr>
+        <w:t>Por favor, leia este resumo para entender o estado atual, a arquitetura consolidada, as regras de interface e as regras de negócio antes de iniciarmos as próximas tarefas.</w:t>
+      </w:r>
+    </w:p>
+    <w:p>
+      <w:pPr>
+        <w:pStyle w:val="PargrafodaLista"/>
+        <w:rPr>
+          <w:b/>
+          <w:bCs/>
+        </w:rPr>
+      </w:pPr>
+    </w:p>
+    <w:p>
+      <w:pPr>
+        <w:pStyle w:val="PargrafodaLista"/>
+        <w:rPr>
+          <w:b/>
+          <w:bCs/>
+        </w:rPr>
       </w:pPr>
       <w:r>
         <w:rPr>
@@ -382,30 +409,71 @@
         </w:rPr>
         <w:t>1. SOBRE O PROJETO</w:t>
       </w:r>
-      <w:r>
-        <w:br/>
+    </w:p>
+    <w:p>
+      <w:pPr>
+        <w:pStyle w:val="PargrafodaLista"/>
+        <w:rPr>
+          <w:b/>
+          <w:bCs/>
+        </w:rPr>
+      </w:pPr>
+      <w:r>
+        <w:rPr>
+          <w:b/>
+          <w:bCs/>
+        </w:rPr>
         <w:t xml:space="preserve">O </w:t>
       </w:r>
       <w:proofErr w:type="spellStart"/>
       <w:r>
+        <w:rPr>
+          <w:b/>
+          <w:bCs/>
+        </w:rPr>
         <w:t>SiteGigaeletro</w:t>
       </w:r>
       <w:proofErr w:type="spellEnd"/>
       <w:r>
-        <w:t xml:space="preserve"> é um catálogo digital de materiais elétricos (residenciais, comerciais e industriais) para a loja física </w:t>
+        <w:rPr>
+          <w:b/>
+          <w:bCs/>
+        </w:rPr>
+        <w:t xml:space="preserve"> é um catálogo digital de materiais elétricos para a loja física </w:t>
       </w:r>
       <w:proofErr w:type="spellStart"/>
       <w:r>
+        <w:rPr>
+          <w:b/>
+          <w:bCs/>
+        </w:rPr>
         <w:t>GigaEletro</w:t>
       </w:r>
       <w:proofErr w:type="spellEnd"/>
       <w:r>
-        <w:t>, localizada em Venda Nova do Imigrante - ES. O objetivo principal do site é permitir que o cliente monte uma lista de orçamento e a envie diretamente para os vendedores através do WhatsApp.</w:t>
+        <w:rPr>
+          <w:b/>
+          <w:bCs/>
+        </w:rPr>
+        <w:t xml:space="preserve"> (Venda Nova do Imigrante - ES). O cliente monta uma lista de orçamento personalizada e a envia diretamente para os vendedores via WhatsApp.</w:t>
       </w:r>
     </w:p>
     <w:p>
       <w:pPr>
         <w:pStyle w:val="PargrafodaLista"/>
+        <w:rPr>
+          <w:b/>
+          <w:bCs/>
+        </w:rPr>
+      </w:pPr>
+    </w:p>
+    <w:p>
+      <w:pPr>
+        <w:pStyle w:val="PargrafodaLista"/>
+        <w:rPr>
+          <w:b/>
+          <w:bCs/>
+        </w:rPr>
       </w:pPr>
       <w:r>
         <w:rPr>
@@ -418,696 +486,871 @@
     <w:p>
       <w:pPr>
         <w:pStyle w:val="PargrafodaLista"/>
-        <w:numPr>
-          <w:ilvl w:val="0"/>
-          <w:numId w:val="8"/>
-        </w:numPr>
-      </w:pPr>
-      <w:r>
-        <w:rPr>
-          <w:b/>
-          <w:bCs/>
-        </w:rPr>
-        <w:t>Repositório:</w:t>
-      </w:r>
-      <w:r>
-        <w:t xml:space="preserve"> Conectado ao GitHub.</w:t>
+        <w:rPr>
+          <w:b/>
+          <w:bCs/>
+        </w:rPr>
+      </w:pPr>
+      <w:r>
+        <w:rPr>
+          <w:b/>
+          <w:bCs/>
+        </w:rPr>
+        <w:t xml:space="preserve">- Hospedagem &amp; </w:t>
+      </w:r>
+      <w:proofErr w:type="spellStart"/>
+      <w:r>
+        <w:rPr>
+          <w:b/>
+          <w:bCs/>
+        </w:rPr>
+        <w:t>Deploy</w:t>
+      </w:r>
+      <w:proofErr w:type="spellEnd"/>
+      <w:r>
+        <w:rPr>
+          <w:b/>
+          <w:bCs/>
+        </w:rPr>
+        <w:t xml:space="preserve">: Publicado de forma automatizada na </w:t>
+      </w:r>
+      <w:proofErr w:type="spellStart"/>
+      <w:r>
+        <w:rPr>
+          <w:b/>
+          <w:bCs/>
+        </w:rPr>
+        <w:t>Vercel</w:t>
+      </w:r>
+      <w:proofErr w:type="spellEnd"/>
+      <w:r>
+        <w:rPr>
+          <w:b/>
+          <w:bCs/>
+        </w:rPr>
+        <w:t xml:space="preserve"> a partir de </w:t>
+      </w:r>
+      <w:proofErr w:type="spellStart"/>
+      <w:r>
+        <w:rPr>
+          <w:b/>
+          <w:bCs/>
+        </w:rPr>
+        <w:t>commits</w:t>
+      </w:r>
+      <w:proofErr w:type="spellEnd"/>
+      <w:r>
+        <w:rPr>
+          <w:b/>
+          <w:bCs/>
+        </w:rPr>
+        <w:t xml:space="preserve"> diretos na </w:t>
+      </w:r>
+      <w:proofErr w:type="spellStart"/>
+      <w:r>
+        <w:rPr>
+          <w:b/>
+          <w:bCs/>
+        </w:rPr>
+        <w:t>branch</w:t>
+      </w:r>
+      <w:proofErr w:type="spellEnd"/>
+      <w:r>
+        <w:rPr>
+          <w:b/>
+          <w:bCs/>
+        </w:rPr>
+        <w:t xml:space="preserve"> '</w:t>
+      </w:r>
+      <w:proofErr w:type="spellStart"/>
+      <w:r>
+        <w:rPr>
+          <w:b/>
+          <w:bCs/>
+        </w:rPr>
+        <w:t>main</w:t>
+      </w:r>
+      <w:proofErr w:type="spellEnd"/>
+      <w:r>
+        <w:rPr>
+          <w:b/>
+          <w:bCs/>
+        </w:rPr>
+        <w:t>' do GitHub.</w:t>
       </w:r>
     </w:p>
     <w:p>
       <w:pPr>
         <w:pStyle w:val="PargrafodaLista"/>
-        <w:numPr>
-          <w:ilvl w:val="0"/>
-          <w:numId w:val="8"/>
-        </w:numPr>
-      </w:pPr>
-      <w:r>
-        <w:rPr>
-          <w:b/>
-          <w:bCs/>
-        </w:rPr>
-        <w:t>Hospedagem:</w:t>
-      </w:r>
-      <w:r>
-        <w:t xml:space="preserve"> Publicado na </w:t>
+        <w:rPr>
+          <w:b/>
+          <w:bCs/>
+        </w:rPr>
+      </w:pPr>
+      <w:r>
+        <w:rPr>
+          <w:b/>
+          <w:bCs/>
+        </w:rPr>
+        <w:t xml:space="preserve">- Funcionalidades do WhatsApp: Disparos utilizando formato internacional limpo (55 + DDD + Número) e </w:t>
       </w:r>
       <w:proofErr w:type="spellStart"/>
       <w:r>
+        <w:rPr>
+          <w:b/>
+          <w:bCs/>
+        </w:rPr>
+        <w:t>strings</w:t>
+      </w:r>
+      <w:proofErr w:type="spellEnd"/>
+      <w:r>
+        <w:rPr>
+          <w:b/>
+          <w:bCs/>
+        </w:rPr>
+        <w:t xml:space="preserve"> tratadas obrigatoriamente com </w:t>
+      </w:r>
+      <w:proofErr w:type="spellStart"/>
+      <w:r>
+        <w:rPr>
+          <w:b/>
+          <w:bCs/>
+        </w:rPr>
+        <w:t>encodeURIComponent</w:t>
+      </w:r>
+      <w:proofErr w:type="spellEnd"/>
+      <w:r>
+        <w:rPr>
+          <w:b/>
+          <w:bCs/>
+        </w:rPr>
+        <w:t>().</w:t>
+      </w:r>
+    </w:p>
+    <w:p>
+      <w:pPr>
+        <w:pStyle w:val="PargrafodaLista"/>
+        <w:rPr>
+          <w:b/>
+          <w:bCs/>
+        </w:rPr>
+      </w:pPr>
+    </w:p>
+    <w:p>
+      <w:pPr>
+        <w:pStyle w:val="PargrafodaLista"/>
+        <w:rPr>
+          <w:b/>
+          <w:bCs/>
+        </w:rPr>
+      </w:pPr>
+      <w:r>
+        <w:rPr>
+          <w:b/>
+          <w:bCs/>
+        </w:rPr>
+        <w:t>3. ESTRUTURA DA PÁGINA PRINCIPAL (DESIGN RESPONSIVO &amp; ALINHAMENTOS)</w:t>
+      </w:r>
+    </w:p>
+    <w:p>
+      <w:pPr>
+        <w:pStyle w:val="PargrafodaLista"/>
+        <w:rPr>
+          <w:b/>
+          <w:bCs/>
+        </w:rPr>
+      </w:pPr>
+      <w:r>
+        <w:rPr>
+          <w:b/>
+          <w:bCs/>
+        </w:rPr>
+        <w:t>- Layout Desktop (3 Colunas):</w:t>
+      </w:r>
+    </w:p>
+    <w:p>
+      <w:pPr>
+        <w:pStyle w:val="PargrafodaLista"/>
+        <w:rPr>
+          <w:b/>
+          <w:bCs/>
+        </w:rPr>
+      </w:pPr>
+      <w:r>
+        <w:rPr>
+          <w:b/>
+          <w:bCs/>
+        </w:rPr>
+        <w:t xml:space="preserve">  * Coluna Esquerda: Imagem da fachada da loja física.</w:t>
+      </w:r>
+    </w:p>
+    <w:p>
+      <w:pPr>
+        <w:pStyle w:val="PargrafodaLista"/>
+        <w:rPr>
+          <w:b/>
+          <w:bCs/>
+        </w:rPr>
+      </w:pPr>
+      <w:r>
+        <w:rPr>
+          <w:b/>
+          <w:bCs/>
+        </w:rPr>
+        <w:t xml:space="preserve">  * Coluna Central (Formulário Amarelo): Campos de identificação com largura reduzida em -30%. Possui comportamento 100% dinâmico (exibe "Nome" para PF e "Razão Social" para PJ). O espaçamento vertical interno foi expandido para que o botão "Ver Catálogo de Produtos" termine perfeitamente alinhado com a linha de base da imagem da fachada à esquerda.</w:t>
+      </w:r>
+    </w:p>
+    <w:p>
+      <w:pPr>
+        <w:pStyle w:val="PargrafodaLista"/>
+        <w:rPr>
+          <w:b/>
+          <w:bCs/>
+        </w:rPr>
+      </w:pPr>
+      <w:r>
+        <w:rPr>
+          <w:b/>
+          <w:bCs/>
+        </w:rPr>
+        <w:t xml:space="preserve">  * Coluna Direita (Painel "Seu Orçamento"): Cupom contábil fixo com borda preta (</w:t>
+      </w:r>
+      <w:proofErr w:type="spellStart"/>
+      <w:r>
+        <w:rPr>
+          <w:b/>
+          <w:bCs/>
+        </w:rPr>
+        <w:t>border</w:t>
+      </w:r>
+      <w:proofErr w:type="spellEnd"/>
+      <w:r>
+        <w:rPr>
+          <w:b/>
+          <w:bCs/>
+        </w:rPr>
+        <w:t>-black) e sombra (</w:t>
+      </w:r>
+      <w:proofErr w:type="spellStart"/>
+      <w:r>
+        <w:rPr>
+          <w:b/>
+          <w:bCs/>
+        </w:rPr>
+        <w:t>shadow-md</w:t>
+      </w:r>
+      <w:proofErr w:type="spellEnd"/>
+      <w:r>
+        <w:rPr>
+          <w:b/>
+          <w:bCs/>
+        </w:rPr>
+        <w:t>).</w:t>
+      </w:r>
+    </w:p>
+    <w:p>
+      <w:pPr>
+        <w:pStyle w:val="PargrafodaLista"/>
+        <w:rPr>
+          <w:b/>
+          <w:bCs/>
+        </w:rPr>
+      </w:pPr>
+      <w:r>
+        <w:rPr>
+          <w:b/>
+          <w:bCs/>
+        </w:rPr>
+        <w:t>- Layout Mobile: Transforma-se automaticamente em uma coluna vertical de rolagem contínua.</w:t>
+      </w:r>
+    </w:p>
+    <w:p>
+      <w:pPr>
+        <w:pStyle w:val="PargrafodaLista"/>
+        <w:rPr>
+          <w:b/>
+          <w:bCs/>
+        </w:rPr>
+      </w:pPr>
+    </w:p>
+    <w:p>
+      <w:pPr>
+        <w:pStyle w:val="PargrafodaLista"/>
+        <w:rPr>
+          <w:b/>
+          <w:bCs/>
+        </w:rPr>
+      </w:pPr>
+      <w:r>
+        <w:rPr>
+          <w:b/>
+          <w:bCs/>
+        </w:rPr>
+        <w:t>4. COMPORTAMENTO DO CATÁLOGO DE PRODUTOS</w:t>
+      </w:r>
+    </w:p>
+    <w:p>
+      <w:pPr>
+        <w:pStyle w:val="PargrafodaLista"/>
+        <w:rPr>
+          <w:b/>
+          <w:bCs/>
+        </w:rPr>
+      </w:pPr>
+      <w:r>
+        <w:rPr>
+          <w:b/>
+          <w:bCs/>
+        </w:rPr>
+        <w:lastRenderedPageBreak/>
+        <w:t>- Layout compacto (</w:t>
+      </w:r>
+      <w:proofErr w:type="spellStart"/>
+      <w:r>
+        <w:rPr>
+          <w:b/>
+          <w:bCs/>
+        </w:rPr>
+        <w:t>text-xs</w:t>
+      </w:r>
+      <w:proofErr w:type="spellEnd"/>
+      <w:r>
+        <w:rPr>
+          <w:b/>
+          <w:bCs/>
+        </w:rPr>
+        <w:t>), em coluna única, sem exibição de SKU/Estoque e sem o símbolo "R$" nos preços dos itens. Os botões de inserção exibem apenas o texto "Adicionar" (o sinal de "+" foi removido).</w:t>
+      </w:r>
+    </w:p>
+    <w:p>
+      <w:pPr>
+        <w:pStyle w:val="PargrafodaLista"/>
+        <w:rPr>
+          <w:b/>
+          <w:bCs/>
+        </w:rPr>
+      </w:pPr>
+      <w:r>
+        <w:rPr>
+          <w:b/>
+          <w:bCs/>
+        </w:rPr>
+        <w:t xml:space="preserve">- Interação Flutuante: O quadro é arrastável (Drag </w:t>
+      </w:r>
+      <w:proofErr w:type="spellStart"/>
+      <w:r>
+        <w:rPr>
+          <w:b/>
+          <w:bCs/>
+        </w:rPr>
+        <w:t>and</w:t>
+      </w:r>
+      <w:proofErr w:type="spellEnd"/>
+      <w:r>
+        <w:rPr>
+          <w:b/>
+          <w:bCs/>
+        </w:rPr>
+        <w:t xml:space="preserve"> </w:t>
+      </w:r>
+      <w:proofErr w:type="spellStart"/>
+      <w:r>
+        <w:rPr>
+          <w:b/>
+          <w:bCs/>
+        </w:rPr>
+        <w:t>Drop</w:t>
+      </w:r>
+      <w:proofErr w:type="spellEnd"/>
+      <w:r>
+        <w:rPr>
+          <w:b/>
+          <w:bCs/>
+        </w:rPr>
+        <w:t>). Ao clicar em "Ver Catálogo" ou "Produtos", ele abre posicionado sobre o painel da direita. No exato momento em que o usuário clica em "Adicionar", o quadro resete suas coordenadas e se reposiciona centralizado exatamente sobre o formulário amarelo.</w:t>
+      </w:r>
+    </w:p>
+    <w:p>
+      <w:pPr>
+        <w:pStyle w:val="PargrafodaLista"/>
+        <w:rPr>
+          <w:b/>
+          <w:bCs/>
+        </w:rPr>
+      </w:pPr>
+      <w:r>
+        <w:rPr>
+          <w:b/>
+          <w:bCs/>
+        </w:rPr>
+        <w:t>- Limitação Mobile: Trava rígida de altura para exibir no máximo 3 produtos simultâneos com rolagem interna (overflow-y-auto).</w:t>
+      </w:r>
+    </w:p>
+    <w:p>
+      <w:pPr>
+        <w:pStyle w:val="PargrafodaLista"/>
+        <w:rPr>
+          <w:b/>
+          <w:bCs/>
+        </w:rPr>
+      </w:pPr>
+      <w:r>
+        <w:rPr>
+          <w:b/>
+          <w:bCs/>
+        </w:rPr>
+        <w:t>- Textos Removidos: Foram eliminados o contador "Exibindo X produtos..." e a palavra literal "Fechar" no topo (mantendo apenas o ícone [X]).</w:t>
+      </w:r>
+    </w:p>
+    <w:p>
+      <w:pPr>
+        <w:pStyle w:val="PargrafodaLista"/>
+        <w:rPr>
+          <w:b/>
+          <w:bCs/>
+        </w:rPr>
+      </w:pPr>
+    </w:p>
+    <w:p>
+      <w:pPr>
+        <w:pStyle w:val="PargrafodaLista"/>
+        <w:rPr>
+          <w:b/>
+          <w:bCs/>
+        </w:rPr>
+      </w:pPr>
+      <w:r>
+        <w:rPr>
+          <w:b/>
+          <w:bCs/>
+        </w:rPr>
+        <w:t>5. PAINEL "SEU ORÇAMENTO" (CUPOM FISCAL)</w:t>
+      </w:r>
+    </w:p>
+    <w:p>
+      <w:pPr>
+        <w:pStyle w:val="PargrafodaLista"/>
+        <w:rPr>
+          <w:b/>
+          <w:bCs/>
+        </w:rPr>
+      </w:pPr>
+      <w:r>
+        <w:rPr>
+          <w:b/>
+          <w:bCs/>
+        </w:rPr>
+        <w:t>- Grade Matemática de 7 Colunas: Linhas dos produtos sem o símbolo "R$" (fixado apenas no "Total Estimado" na base).</w:t>
+      </w:r>
+    </w:p>
+    <w:p>
+      <w:pPr>
+        <w:pStyle w:val="PargrafodaLista"/>
+        <w:rPr>
+          <w:b/>
+          <w:bCs/>
+        </w:rPr>
+      </w:pPr>
+      <w:r>
+        <w:rPr>
+          <w:b/>
+          <w:bCs/>
+        </w:rPr>
+        <w:t>- Substituição por Ícones: O botão textual "Remover" foi integralmente substituído por um ícone visual de lixeira (cesto) na cor vermelha na extrema direita.</w:t>
+      </w:r>
+    </w:p>
+    <w:p>
+      <w:pPr>
+        <w:pStyle w:val="PargrafodaLista"/>
+        <w:rPr>
+          <w:b/>
+          <w:bCs/>
+        </w:rPr>
+      </w:pPr>
+      <w:r>
+        <w:rPr>
+          <w:b/>
+          <w:bCs/>
+        </w:rPr>
+        <w:t>- Alinhamento &amp; Textos atualizados: Os blocos de "</w:t>
+      </w:r>
+      <w:proofErr w:type="spellStart"/>
+      <w:r>
+        <w:rPr>
+          <w:b/>
+          <w:bCs/>
+        </w:rPr>
+        <w:t>Vlr</w:t>
+      </w:r>
+      <w:proofErr w:type="spellEnd"/>
+      <w:r>
+        <w:rPr>
+          <w:b/>
+          <w:bCs/>
+        </w:rPr>
+        <w:t>. Unit:" e o antigo "Valor:" foram deslocados para a direita, eliminando vazios e preenchendo melhor o espaço horizontal. O rótulo "Valor:" foi alterado para "Total:".</w:t>
+      </w:r>
+    </w:p>
+    <w:p>
+      <w:pPr>
+        <w:pStyle w:val="PargrafodaLista"/>
+        <w:rPr>
+          <w:b/>
+          <w:bCs/>
+        </w:rPr>
+      </w:pPr>
+      <w:r>
+        <w:rPr>
+          <w:b/>
+          <w:bCs/>
+        </w:rPr>
+        <w:t>- Nota de Validade: O rodapé exibe textualmente: "Os preços têm validade de 15 dias a contar do envio do orçamento. O estoque e o frete serão confirmados no Whatsapp".</w:t>
+      </w:r>
+    </w:p>
+    <w:p>
+      <w:pPr>
+        <w:pStyle w:val="PargrafodaLista"/>
+        <w:rPr>
+          <w:b/>
+          <w:bCs/>
+        </w:rPr>
+      </w:pPr>
+    </w:p>
+    <w:p>
+      <w:pPr>
+        <w:pStyle w:val="PargrafodaLista"/>
+        <w:rPr>
+          <w:b/>
+          <w:bCs/>
+        </w:rPr>
+      </w:pPr>
+      <w:r>
+        <w:rPr>
+          <w:b/>
+          <w:bCs/>
+        </w:rPr>
+        <w:t>6. MENU "MEUS ORÇAMENTOS" &amp; HISTÓRICO DO CLIENTE</w:t>
+      </w:r>
+    </w:p>
+    <w:p>
+      <w:pPr>
+        <w:pStyle w:val="PargrafodaLista"/>
+        <w:rPr>
+          <w:b/>
+          <w:bCs/>
+        </w:rPr>
+      </w:pPr>
+      <w:r>
+        <w:rPr>
+          <w:b/>
+          <w:bCs/>
+        </w:rPr>
+        <w:t>- Modal elegante acessado pelo cabeçalho para consulta por CPF/CNPJ.</w:t>
+      </w:r>
+    </w:p>
+    <w:p>
+      <w:pPr>
+        <w:pStyle w:val="PargrafodaLista"/>
+        <w:rPr>
+          <w:b/>
+          <w:bCs/>
+        </w:rPr>
+      </w:pPr>
+      <w:r>
+        <w:rPr>
+          <w:b/>
+          <w:bCs/>
+        </w:rPr>
+        <w:t>- Ícones de Ação: Substituição completa de textos por ícones universais: "Visualizar" -&gt; Olho, "Alterar" -&gt; Lápis, "Excluir" -&gt; Lixeira.</w:t>
+      </w:r>
+    </w:p>
+    <w:p>
+      <w:pPr>
+        <w:pStyle w:val="PargrafodaLista"/>
+        <w:rPr>
+          <w:b/>
+          <w:bCs/>
+        </w:rPr>
+      </w:pPr>
+      <w:r>
+        <w:rPr>
+          <w:b/>
+          <w:bCs/>
+        </w:rPr>
+        <w:t xml:space="preserve">- Regra de Edição: Se o cliente escolher "Alterar", o sistema reinjeta os produtos no carrinho e preenche o formulário. No momento em que ele envia o orçamento atualizado, o sistema deleta automaticamente o registro antigo do </w:t>
+      </w:r>
+      <w:proofErr w:type="spellStart"/>
+      <w:r>
+        <w:rPr>
+          <w:b/>
+          <w:bCs/>
+        </w:rPr>
+        <w:t>localStorage</w:t>
+      </w:r>
+      <w:proofErr w:type="spellEnd"/>
+      <w:r>
+        <w:rPr>
+          <w:b/>
+          <w:bCs/>
+        </w:rPr>
+        <w:t xml:space="preserve"> para evitar duplicidades.</w:t>
+      </w:r>
+    </w:p>
+    <w:p>
+      <w:pPr>
+        <w:pStyle w:val="PargrafodaLista"/>
+        <w:rPr>
+          <w:b/>
+          <w:bCs/>
+        </w:rPr>
+      </w:pPr>
+    </w:p>
+    <w:p>
+      <w:pPr>
+        <w:pStyle w:val="PargrafodaLista"/>
+        <w:rPr>
+          <w:b/>
+          <w:bCs/>
+        </w:rPr>
+      </w:pPr>
+      <w:r>
+        <w:rPr>
+          <w:b/>
+          <w:bCs/>
+        </w:rPr>
+        <w:t>7. ÁREA RESTRITA (PAINEL DO ADMINISTRADOR)</w:t>
+      </w:r>
+    </w:p>
+    <w:p>
+      <w:pPr>
+        <w:pStyle w:val="PargrafodaLista"/>
+        <w:rPr>
+          <w:b/>
+          <w:bCs/>
+        </w:rPr>
+      </w:pPr>
+      <w:r>
+        <w:rPr>
+          <w:b/>
+          <w:bCs/>
+        </w:rPr>
+        <w:t>- Dividida em duas telas/visões 100% independentes através de abas (</w:t>
+      </w:r>
+      <w:proofErr w:type="spellStart"/>
+      <w:r>
+        <w:rPr>
+          <w:b/>
+          <w:bCs/>
+        </w:rPr>
+        <w:t>Tabs</w:t>
+      </w:r>
+      <w:proofErr w:type="spellEnd"/>
+      <w:r>
+        <w:rPr>
+          <w:b/>
+          <w:bCs/>
+        </w:rPr>
+        <w:t>) de navegação no topo:</w:t>
+      </w:r>
+    </w:p>
+    <w:p>
+      <w:pPr>
+        <w:pStyle w:val="PargrafodaLista"/>
+        <w:rPr>
+          <w:b/>
+          <w:bCs/>
+        </w:rPr>
+      </w:pPr>
+      <w:r>
+        <w:rPr>
+          <w:b/>
+          <w:bCs/>
+        </w:rPr>
+        <w:t xml:space="preserve">  1. "Orçamentos Recebidos": Exibe o bloco de filtros e a listagem consolidada de pedidos (vinda do banco de dados/API </w:t>
+      </w:r>
+      <w:proofErr w:type="spellStart"/>
+      <w:r>
+        <w:rPr>
+          <w:b/>
+          <w:bCs/>
+        </w:rPr>
+        <w:t>Serverless</w:t>
+      </w:r>
+      <w:proofErr w:type="spellEnd"/>
+      <w:r>
+        <w:rPr>
+          <w:b/>
+          <w:bCs/>
+        </w:rPr>
+        <w:t xml:space="preserve"> da </w:t>
+      </w:r>
+      <w:proofErr w:type="spellStart"/>
+      <w:r>
+        <w:rPr>
+          <w:b/>
+          <w:bCs/>
+        </w:rPr>
         <w:t>Vercel</w:t>
       </w:r>
       <w:proofErr w:type="spellEnd"/>
       <w:r>
-        <w:t xml:space="preserve"> em ambiente de desenvolvimento/</w:t>
+        <w:rPr>
+          <w:b/>
+          <w:bCs/>
+        </w:rPr>
+        <w:t xml:space="preserve">) com botão físico de "Buscar" integrado. A coluna "Itens" foi removida da tabela principal </w:t>
+      </w:r>
+      <w:r>
+        <w:rPr>
+          <w:b/>
+          <w:bCs/>
+        </w:rPr>
+        <w:lastRenderedPageBreak/>
+        <w:t>para despoluir o layout. Ao final de cada registro, há uma coluna de ações com os ícones de Olho (visualizar lista de itens em um modal) e Impressora (gerar o PDF contábil).</w:t>
+      </w:r>
+    </w:p>
+    <w:p>
+      <w:pPr>
+        <w:pStyle w:val="PargrafodaLista"/>
+        <w:rPr>
+          <w:b/>
+          <w:bCs/>
+        </w:rPr>
+      </w:pPr>
+      <w:r>
+        <w:rPr>
+          <w:b/>
+          <w:bCs/>
+        </w:rPr>
+        <w:t xml:space="preserve">  2. "Atualizar Estoque": Exibe unicamente a área amarela de upload (drag </w:t>
       </w:r>
       <w:proofErr w:type="spellStart"/>
       <w:r>
-        <w:t>staging</w:t>
+        <w:rPr>
+          <w:b/>
+          <w:bCs/>
+        </w:rPr>
+        <w:t>and</w:t>
       </w:r>
       <w:proofErr w:type="spellEnd"/>
       <w:r>
+        <w:rPr>
+          <w:b/>
+          <w:bCs/>
+        </w:rPr>
+        <w:t xml:space="preserve"> </w:t>
+      </w:r>
+      <w:proofErr w:type="spellStart"/>
+      <w:r>
+        <w:rPr>
+          <w:b/>
+          <w:bCs/>
+        </w:rPr>
+        <w:t>drop</w:t>
+      </w:r>
+      <w:proofErr w:type="spellEnd"/>
+      <w:r>
+        <w:rPr>
+          <w:b/>
+          <w:bCs/>
+        </w:rPr>
+        <w:t>) de planilhas/fotos de estoque.</w:t>
+      </w:r>
+    </w:p>
+    <w:p>
+      <w:pPr>
+        <w:pStyle w:val="PargrafodaLista"/>
+        <w:rPr>
+          <w:b/>
+          <w:bCs/>
+        </w:rPr>
+      </w:pPr>
+      <w:r>
+        <w:rPr>
+          <w:b/>
+          <w:bCs/>
+        </w:rPr>
+        <w:t>- Recuperação de Acesso: O link "Esqueceu a Senha?" na tela de login abre uma nova aba do WhatsApp direcionada para o número celular master da administração com uma mensagem automática solicitando a chave de redefinição.</w:t>
+      </w:r>
+    </w:p>
+    <w:p>
+      <w:pPr>
+        <w:pStyle w:val="PargrafodaLista"/>
+        <w:rPr>
+          <w:b/>
+          <w:bCs/>
+        </w:rPr>
+      </w:pPr>
+    </w:p>
+    <w:p>
+      <w:pPr>
+        <w:pStyle w:val="PargrafodaLista"/>
+        <w:rPr>
+          <w:b/>
+          <w:bCs/>
+        </w:rPr>
+      </w:pPr>
+      <w:r>
+        <w:rPr>
+          <w:b/>
+          <w:bCs/>
+        </w:rPr>
+        <w:t xml:space="preserve">ESTADO ATUAL: Todas as regras de design, substituição de ícones, alinhamento simétrico do formulário com a foto da fachada, atualização dos textos de validade e o desmembramento das telas da Área Restrita estão 100% funcionais, consolidados e publicados em produção na </w:t>
+      </w:r>
+      <w:proofErr w:type="spellStart"/>
+      <w:r>
+        <w:rPr>
+          <w:b/>
+          <w:bCs/>
+        </w:rPr>
+        <w:t>branch</w:t>
+      </w:r>
+      <w:proofErr w:type="spellEnd"/>
+      <w:r>
+        <w:rPr>
+          <w:b/>
+          <w:bCs/>
+        </w:rPr>
+        <w:t xml:space="preserve"> </w:t>
+      </w:r>
+      <w:proofErr w:type="spellStart"/>
+      <w:r>
+        <w:rPr>
+          <w:b/>
+          <w:bCs/>
+        </w:rPr>
+        <w:t>main</w:t>
+      </w:r>
+      <w:proofErr w:type="spellEnd"/>
+      <w:r>
+        <w:rPr>
+          <w:b/>
+          <w:bCs/>
+        </w:rPr>
         <w:t>.</w:t>
       </w:r>
     </w:p>
     <w:p>
       <w:pPr>
         <w:pStyle w:val="PargrafodaLista"/>
-        <w:numPr>
-          <w:ilvl w:val="0"/>
-          <w:numId w:val="8"/>
-        </w:numPr>
-      </w:pPr>
-      <w:r>
-        <w:rPr>
-          <w:b/>
-          <w:bCs/>
-        </w:rPr>
-        <w:t>URL Atual:</w:t>
-      </w:r>
-      <w:r>
-        <w:t xml:space="preserve"> https://gigaeletro.vercel.app/</w:t>
-      </w:r>
+      </w:pPr>
     </w:p>
     <w:p>
       <w:pPr>
         <w:pStyle w:val="PargrafodaLista"/>
-        <w:numPr>
-          <w:ilvl w:val="0"/>
-          <w:numId w:val="8"/>
-        </w:numPr>
-      </w:pPr>
-      <w:r>
-        <w:rPr>
-          <w:b/>
-          <w:bCs/>
-        </w:rPr>
-        <w:t>Fluxo de trabalho:</w:t>
-      </w:r>
-      <w:r>
-        <w:t xml:space="preserve"> As alterações de código devem ser integradas via </w:t>
-      </w:r>
-      <w:proofErr w:type="spellStart"/>
-      <w:r>
-        <w:t>Git</w:t>
-      </w:r>
-      <w:proofErr w:type="spellEnd"/>
-      <w:r>
-        <w:t xml:space="preserve"> (</w:t>
-      </w:r>
-      <w:proofErr w:type="spellStart"/>
-      <w:r>
-        <w:t>add</w:t>
-      </w:r>
-      <w:proofErr w:type="spellEnd"/>
-      <w:r>
-        <w:t xml:space="preserve">, </w:t>
-      </w:r>
-      <w:proofErr w:type="spellStart"/>
-      <w:r>
-        <w:t>commit</w:t>
-      </w:r>
-      <w:proofErr w:type="spellEnd"/>
-      <w:r>
-        <w:t xml:space="preserve"> e </w:t>
-      </w:r>
-      <w:proofErr w:type="spellStart"/>
-      <w:r>
-        <w:t>push</w:t>
-      </w:r>
-      <w:proofErr w:type="spellEnd"/>
-      <w:r>
-        <w:t xml:space="preserve">) para disparar o </w:t>
-      </w:r>
-      <w:proofErr w:type="spellStart"/>
-      <w:r>
-        <w:t>deploy</w:t>
-      </w:r>
-      <w:proofErr w:type="spellEnd"/>
-      <w:r>
-        <w:t xml:space="preserve"> automatizado na nuvem da </w:t>
-      </w:r>
-      <w:proofErr w:type="spellStart"/>
-      <w:r>
-        <w:t>Vercel</w:t>
-      </w:r>
-      <w:proofErr w:type="spellEnd"/>
-      <w:r>
-        <w:t>.</w:t>
-      </w:r>
+      </w:pPr>
     </w:p>
     <w:p>
       <w:pPr>
         <w:pStyle w:val="PargrafodaLista"/>
-      </w:pPr>
-      <w:r>
-        <w:rPr>
-          <w:b/>
-          <w:bCs/>
-        </w:rPr>
-        <w:t>3. ESTRUTURA DA PÁGINA PRINCIPAL (LAYOUT ATUAL)</w:t>
-      </w:r>
-      <w:r>
-        <w:br/>
-        <w:t>A interface foi projetada em um sistema de 3 colunas principais em desktop, com as seguintes proporções e regras visuais:</w:t>
-      </w:r>
+        <w:ind w:left="1440"/>
+      </w:pPr>
     </w:p>
     <w:p>
       <w:pPr>
         <w:pStyle w:val="PargrafodaLista"/>
-        <w:numPr>
-          <w:ilvl w:val="0"/>
-          <w:numId w:val="9"/>
-        </w:numPr>
-      </w:pPr>
-      <w:r>
-        <w:rPr>
-          <w:b/>
-          <w:bCs/>
-        </w:rPr>
-        <w:lastRenderedPageBreak/>
-        <w:t>Coluna Esquerda:</w:t>
-      </w:r>
-      <w:r>
-        <w:t xml:space="preserve"> Fachada da loja física expandida em +30% na largura horizontal para destaque visual.</w:t>
-      </w:r>
-    </w:p>
-    <w:p>
-      <w:pPr>
-        <w:pStyle w:val="PargrafodaLista"/>
-        <w:numPr>
-          <w:ilvl w:val="0"/>
-          <w:numId w:val="9"/>
-        </w:numPr>
-      </w:pPr>
-      <w:r>
-        <w:rPr>
-          <w:b/>
-          <w:bCs/>
-        </w:rPr>
-        <w:t>Coluna Central:</w:t>
-      </w:r>
-      <w:r>
-        <w:t xml:space="preserve"> Formulário amarelo de identificação do cliente (com campos condicionais para PF/PJ, Nome, Endereço, etc.), reduzido em -30% na largura horizontal para evitar sobreposições. Inclui o botão "Ver Catálogo de Produtos".</w:t>
-      </w:r>
-    </w:p>
-    <w:p>
-      <w:pPr>
-        <w:pStyle w:val="PargrafodaLista"/>
-        <w:numPr>
-          <w:ilvl w:val="0"/>
-          <w:numId w:val="9"/>
-        </w:numPr>
-      </w:pPr>
-      <w:r>
-        <w:rPr>
-          <w:b/>
-          <w:bCs/>
-        </w:rPr>
-        <w:t>Coluna Direita:</w:t>
-      </w:r>
-      <w:r>
-        <w:t xml:space="preserve"> Painel "Seu Orçamento" fixado permanentemente na lateral direita (sem comportamento de arrastar). Dedica </w:t>
-      </w:r>
-      <w:r>
-        <w:rPr>
-          <w:b/>
-          <w:bCs/>
-        </w:rPr>
-        <w:t>100% do seu espaço vertical</w:t>
-      </w:r>
-      <w:r>
-        <w:t xml:space="preserve"> para a exibição limpa da lista atual de produtos e valores selecionados pelo cliente. Suas fontes dinâmicas e o texto fixo de aviso legal ("Os preços são do catálogo do dia...") usam tamanhos discretos (</w:t>
-      </w:r>
-      <w:proofErr w:type="spellStart"/>
-      <w:r>
-        <w:t>text-sm</w:t>
-      </w:r>
-      <w:proofErr w:type="spellEnd"/>
-      <w:r>
-        <w:t xml:space="preserve"> e </w:t>
-      </w:r>
-      <w:proofErr w:type="spellStart"/>
-      <w:r>
-        <w:t>text-xs</w:t>
-      </w:r>
-      <w:proofErr w:type="spellEnd"/>
-      <w:r>
-        <w:t>).</w:t>
-      </w:r>
-    </w:p>
-    <w:p>
-      <w:pPr>
-        <w:pStyle w:val="PargrafodaLista"/>
-        <w:numPr>
-          <w:ilvl w:val="0"/>
-          <w:numId w:val="9"/>
-        </w:numPr>
-      </w:pPr>
-      <w:r>
-        <w:rPr>
-          <w:b/>
-          <w:bCs/>
-        </w:rPr>
-        <w:t>Rodapé (</w:t>
-      </w:r>
-      <w:proofErr w:type="spellStart"/>
-      <w:r>
-        <w:rPr>
-          <w:b/>
-          <w:bCs/>
-        </w:rPr>
-        <w:t>Footer</w:t>
-      </w:r>
-      <w:proofErr w:type="spellEnd"/>
-      <w:r>
-        <w:rPr>
-          <w:b/>
-          <w:bCs/>
-        </w:rPr>
-        <w:t>):</w:t>
-      </w:r>
-      <w:r>
-        <w:t xml:space="preserve"> Ocupa toda a largura da base (w-full), contendo os dados institucionais recuperados (Endereço, CNPJ, Telefones, WhatsApp e o botão com link "Como chegar").</w:t>
-      </w:r>
-    </w:p>
-    <w:p>
-      <w:pPr>
-        <w:pStyle w:val="PargrafodaLista"/>
-      </w:pPr>
-      <w:r>
-        <w:rPr>
-          <w:b/>
-          <w:bCs/>
-        </w:rPr>
-        <w:t>4. FUNCIONALIDADES CORE E COMPORTAMENTOS</w:t>
-      </w:r>
-    </w:p>
-    <w:p>
-      <w:pPr>
-        <w:pStyle w:val="PargrafodaLista"/>
-        <w:numPr>
-          <w:ilvl w:val="0"/>
-          <w:numId w:val="10"/>
-        </w:numPr>
-      </w:pPr>
-      <w:r>
-        <w:rPr>
-          <w:b/>
-          <w:bCs/>
-        </w:rPr>
-        <w:t xml:space="preserve">Menu </w:t>
-      </w:r>
-      <w:proofErr w:type="spellStart"/>
-      <w:r>
-        <w:rPr>
-          <w:b/>
-          <w:bCs/>
-        </w:rPr>
-        <w:t>Pull</w:t>
-      </w:r>
-      <w:proofErr w:type="spellEnd"/>
-      <w:r>
-        <w:rPr>
-          <w:b/>
-          <w:bCs/>
-        </w:rPr>
-        <w:t>-Down "Meus Orçamentos":</w:t>
-      </w:r>
-      <w:r>
-        <w:t xml:space="preserve"> Localizado no menu superior (Header), substituiu o antigo link ocioso. Contém a </w:t>
-      </w:r>
-      <w:proofErr w:type="spellStart"/>
-      <w:r>
-        <w:t>subopção</w:t>
-      </w:r>
-      <w:proofErr w:type="spellEnd"/>
-      <w:r>
-        <w:t xml:space="preserve"> </w:t>
-      </w:r>
-      <w:r>
-        <w:rPr>
-          <w:b/>
-          <w:bCs/>
-        </w:rPr>
-        <w:t>"Histórico de Orçamentos"</w:t>
-      </w:r>
-      <w:r>
-        <w:t>.</w:t>
-      </w:r>
-    </w:p>
-    <w:p>
-      <w:pPr>
-        <w:pStyle w:val="PargrafodaLista"/>
-        <w:numPr>
-          <w:ilvl w:val="0"/>
-          <w:numId w:val="10"/>
-        </w:numPr>
-      </w:pPr>
-      <w:r>
-        <w:rPr>
-          <w:b/>
-          <w:bCs/>
-        </w:rPr>
-        <w:t>Modal de Histórico (</w:t>
-      </w:r>
-      <w:proofErr w:type="spellStart"/>
-      <w:r>
-        <w:rPr>
-          <w:b/>
-          <w:bCs/>
-        </w:rPr>
-        <w:t>LocalStorage</w:t>
-      </w:r>
-      <w:proofErr w:type="spellEnd"/>
-      <w:r>
-        <w:rPr>
-          <w:b/>
-          <w:bCs/>
-        </w:rPr>
-        <w:t>):</w:t>
-      </w:r>
-      <w:r>
-        <w:t xml:space="preserve"> Ao clicar no histórico do menu superior, abre-se um modal elegante e centralizado que lê os dados salvos no </w:t>
-      </w:r>
-      <w:proofErr w:type="spellStart"/>
-      <w:r>
-        <w:t>localStorage</w:t>
-      </w:r>
-      <w:proofErr w:type="spellEnd"/>
-      <w:r>
-        <w:t xml:space="preserve"> do navegador do cliente. Cada linha exibe os dados de orçamentos anteriores com duas ações estritas: </w:t>
-      </w:r>
-      <w:r>
-        <w:rPr>
-          <w:b/>
-          <w:bCs/>
-        </w:rPr>
-        <w:t>"Visualizar"</w:t>
-      </w:r>
-      <w:r>
-        <w:t xml:space="preserve"> e </w:t>
-      </w:r>
-      <w:r>
-        <w:rPr>
-          <w:b/>
-          <w:bCs/>
-        </w:rPr>
-        <w:t>"Editar/Recarregar"</w:t>
-      </w:r>
-      <w:r>
-        <w:t xml:space="preserve"> (que reinjeta os produtos e dados antigos no carrinho principal para edição, fechando o modal).</w:t>
-      </w:r>
-    </w:p>
-    <w:p>
-      <w:pPr>
-        <w:pStyle w:val="PargrafodaLista"/>
-        <w:numPr>
-          <w:ilvl w:val="0"/>
-          <w:numId w:val="10"/>
-        </w:numPr>
-      </w:pPr>
-      <w:r>
-        <w:rPr>
-          <w:b/>
-          <w:bCs/>
-        </w:rPr>
-        <w:t>Catálogo Flutuante:</w:t>
-      </w:r>
-      <w:r>
-        <w:t xml:space="preserve"> O modal do "Catálogo de Produtos" possui comportamento flutuante e sistema Drag </w:t>
-      </w:r>
-      <w:proofErr w:type="spellStart"/>
-      <w:r>
-        <w:t>and</w:t>
-      </w:r>
-      <w:proofErr w:type="spellEnd"/>
-      <w:r>
-        <w:t xml:space="preserve"> </w:t>
-      </w:r>
-      <w:proofErr w:type="spellStart"/>
-      <w:r>
-        <w:t>Drop</w:t>
-      </w:r>
-      <w:proofErr w:type="spellEnd"/>
-      <w:r>
-        <w:t xml:space="preserve"> (arrastável), permitindo movimentação livre pela tela.</w:t>
-      </w:r>
-    </w:p>
-    <w:p>
-      <w:pPr>
-        <w:pStyle w:val="PargrafodaLista"/>
-        <w:numPr>
-          <w:ilvl w:val="0"/>
-          <w:numId w:val="10"/>
-        </w:numPr>
-      </w:pPr>
-      <w:r>
-        <w:rPr>
-          <w:b/>
-          <w:bCs/>
-        </w:rPr>
-        <w:t>Área Restrita:</w:t>
-      </w:r>
-      <w:r>
-        <w:t xml:space="preserve"> Seção protegida por senha de administrador para gerenciamento interno de produtos.</w:t>
-      </w:r>
-    </w:p>
-    <w:p>
-      <w:pPr>
-        <w:pStyle w:val="PargrafodaLista"/>
-      </w:pPr>
-      <w:r>
-        <w:rPr>
-          <w:b/>
-          <w:bCs/>
-        </w:rPr>
-        <w:t>PONTO ATUAL DO PROJETO:</w:t>
-      </w:r>
-      <w:r>
-        <w:br/>
-        <w:t xml:space="preserve">O layout de 3 colunas (com rebalanceamento de 30%), a expansão total do painel "Seu Orçamento" na direita, o novo menu </w:t>
-      </w:r>
-      <w:proofErr w:type="spellStart"/>
-      <w:r>
-        <w:t>pull-down</w:t>
-      </w:r>
-      <w:proofErr w:type="spellEnd"/>
-      <w:r>
-        <w:t xml:space="preserve"> com modal de histórico via </w:t>
-      </w:r>
-      <w:proofErr w:type="spellStart"/>
-      <w:r>
-        <w:t>localStorage</w:t>
-      </w:r>
-      <w:proofErr w:type="spellEnd"/>
-      <w:r>
-        <w:t xml:space="preserve">, o catálogo arrastável e a automação de </w:t>
-      </w:r>
-      <w:proofErr w:type="spellStart"/>
-      <w:r>
-        <w:t>deploy</w:t>
-      </w:r>
-      <w:proofErr w:type="spellEnd"/>
-      <w:r>
-        <w:t xml:space="preserve"> estão 100% implementados, consolidados e publicados na </w:t>
-      </w:r>
-      <w:proofErr w:type="spellStart"/>
-      <w:r>
-        <w:t>Vercel</w:t>
-      </w:r>
-      <w:proofErr w:type="spellEnd"/>
-      <w:r>
-        <w:t>.</w:t>
-      </w:r>
-    </w:p>
-    <w:p>
-      <w:pPr>
-        <w:pStyle w:val="PargrafodaLista"/>
-      </w:pPr>
-      <w:r>
-        <w:t>Aguarde minhas próximas instruções para saber qual funcionalidade, correção ou nova seção iremos desenvolver a partir deste ponto.</w:t>
-      </w:r>
-    </w:p>
-    <w:p>
-      <w:pPr>
-        <w:pStyle w:val="PargrafodaLista"/>
-      </w:pPr>
-      <w:r>
-        <w:pict w14:anchorId="0FEBC54F">
-          <v:rect id="_x0000_i1025" style="width:0;height:1.5pt" o:hralign="center" o:hrstd="t" o:hr="t" fillcolor="#a0a0a0" stroked="f"/>
-        </w:pict>
-      </w:r>
-    </w:p>
-    <w:p>
-      <w:pPr>
-        <w:pStyle w:val="PargrafodaLista"/>
-      </w:pPr>
-      <w:r>
-        <w:t>Bom descanso e até amanhã! O projeto deu um salto gigante hoje.</w:t>
-      </w:r>
-    </w:p>
-    <w:p>
-      <w:pPr>
-        <w:pStyle w:val="PargrafodaLista"/>
-      </w:pPr>
-    </w:p>
-    <w:p>
-      <w:pPr>
-        <w:pStyle w:val="PargrafodaLista"/>
-      </w:pPr>
-      <w:r>
-        <w:t xml:space="preserve">============================== </w:t>
-      </w:r>
-      <w:r>
-        <w:t>Vamos refinar a lógica de gravação e exibição do "Histórico de Orçamentos" para usar o CPF/CNPJ como chave de controle:</w:t>
-      </w:r>
-    </w:p>
-    <w:p>
-      <w:pPr>
-        <w:pStyle w:val="PargrafodaLista"/>
-      </w:pPr>
-    </w:p>
-    <w:p>
-      <w:pPr>
-        <w:pStyle w:val="PargrafodaLista"/>
-      </w:pPr>
-      <w:r>
-        <w:lastRenderedPageBreak/>
-        <w:t xml:space="preserve">1. Ao salvar um orçamento no </w:t>
-      </w:r>
-      <w:proofErr w:type="spellStart"/>
-      <w:r>
-        <w:t>localStorage</w:t>
-      </w:r>
-      <w:proofErr w:type="spellEnd"/>
-      <w:r>
-        <w:t>, certifique-se de vincular o registro ao CPF ou CNPJ preenchido no formulário amarelo naquele momento.</w:t>
-      </w:r>
-    </w:p>
-    <w:p>
-      <w:pPr>
-        <w:pStyle w:val="PargrafodaLista"/>
-      </w:pPr>
-      <w:r>
-        <w:t xml:space="preserve">2. Modifique o modal "Meus Orçamentos": ele deve verificar qual CPF ou CNPJ está digitado no formulário amarelo. </w:t>
-      </w:r>
-    </w:p>
-    <w:p>
-      <w:pPr>
-        <w:pStyle w:val="PargrafodaLista"/>
-      </w:pPr>
-      <w:r>
-        <w:t xml:space="preserve">   - Se houver um documento digitado, filtre a lista e exiba APENAS os orçamentos históricos que pertencem a esse CPF/CNPJ.</w:t>
-      </w:r>
-    </w:p>
-    <w:p>
-      <w:pPr>
-        <w:pStyle w:val="PargrafodaLista"/>
-      </w:pPr>
-      <w:r>
-        <w:t xml:space="preserve">   - Se o campo de documento estiver vazio, exiba uma mensagem amigável solicitando: "Por favor, digite seu CPF ou CNPJ no formulário para consultar seu histórico de orçamentos."</w:t>
-      </w:r>
-    </w:p>
-    <w:p>
-      <w:pPr>
-        <w:pStyle w:val="PargrafodaLista"/>
-      </w:pPr>
-      <w:r>
-        <w:t>3. Após concluir a alteração, abra o terminal e envie as atualizações para a nuvem:</w:t>
-      </w:r>
-    </w:p>
-    <w:p>
-      <w:pPr>
-        <w:pStyle w:val="PargrafodaLista"/>
-      </w:pPr>
-      <w:r>
-        <w:t xml:space="preserve">   </w:t>
-      </w:r>
-      <w:proofErr w:type="spellStart"/>
-      <w:r>
-        <w:t>git</w:t>
-      </w:r>
-      <w:proofErr w:type="spellEnd"/>
-      <w:r>
-        <w:t xml:space="preserve"> </w:t>
-      </w:r>
-      <w:proofErr w:type="spellStart"/>
-      <w:r>
-        <w:t>add</w:t>
-      </w:r>
-      <w:proofErr w:type="spellEnd"/>
-      <w:r>
-        <w:t xml:space="preserve"> .</w:t>
-      </w:r>
-    </w:p>
-    <w:p>
-      <w:pPr>
-        <w:pStyle w:val="PargrafodaLista"/>
-      </w:pPr>
-      <w:r>
-        <w:t xml:space="preserve">   </w:t>
-      </w:r>
-      <w:proofErr w:type="spellStart"/>
-      <w:r>
-        <w:t>git</w:t>
-      </w:r>
-      <w:proofErr w:type="spellEnd"/>
-      <w:r>
-        <w:t xml:space="preserve"> </w:t>
-      </w:r>
-      <w:proofErr w:type="spellStart"/>
-      <w:r>
-        <w:t>commit</w:t>
-      </w:r>
-      <w:proofErr w:type="spellEnd"/>
-      <w:r>
-        <w:t xml:space="preserve"> -m "</w:t>
-      </w:r>
-      <w:proofErr w:type="spellStart"/>
-      <w:r>
-        <w:t>fix</w:t>
-      </w:r>
-      <w:proofErr w:type="spellEnd"/>
-      <w:r>
-        <w:t>: atrela e filtra o histórico de orçamentos estritamente por CPF/CNPJ"</w:t>
-      </w:r>
-    </w:p>
-    <w:p>
-      <w:pPr>
-        <w:pStyle w:val="PargrafodaLista"/>
-      </w:pPr>
-      <w:r>
-        <w:t xml:space="preserve">   </w:t>
-      </w:r>
-      <w:proofErr w:type="spellStart"/>
-      <w:r>
-        <w:t>git</w:t>
-      </w:r>
-      <w:proofErr w:type="spellEnd"/>
-      <w:r>
-        <w:t xml:space="preserve"> </w:t>
-      </w:r>
-      <w:proofErr w:type="spellStart"/>
-      <w:r>
-        <w:t>push</w:t>
-      </w:r>
-      <w:proofErr w:type="spellEnd"/>
-      <w:r>
-        <w:t xml:space="preserve"> </w:t>
-      </w:r>
-      <w:proofErr w:type="spellStart"/>
-      <w:r>
-        <w:t>origin</w:t>
-      </w:r>
-      <w:proofErr w:type="spellEnd"/>
-      <w:r>
-        <w:t xml:space="preserve"> </w:t>
-      </w:r>
-      <w:proofErr w:type="spellStart"/>
-      <w:r>
-        <w:t>main</w:t>
-      </w:r>
-      <w:proofErr w:type="spellEnd"/>
+        <w:ind w:left="1440"/>
+      </w:pPr>
     </w:p>
     <w:sectPr>
       <w:pgSz w:w="11906" w:h="16838"/>
@@ -1122,6 +1365,155 @@
 <file path=word/numbering.xml><?xml version="1.0" encoding="utf-8"?>
 <w:numbering xmlns:wpc="http://schemas.microsoft.com/office/word/2010/wordprocessingCanvas" xmlns:cx="http://schemas.microsoft.com/office/drawing/2014/chartex" xmlns:cx1="http://schemas.microsoft.com/office/drawing/2015/9/8/chartex" xmlns:cx2="http://schemas.microsoft.com/office/drawing/2015/10/21/chartex" xmlns:cx3="http://schemas.microsoft.com/office/drawing/2016/5/9/chartex" xmlns:cx4="http://schemas.microsoft.com/office/drawing/2016/5/10/chartex" xmlns:cx5="http://schemas.microsoft.com/office/drawing/2016/5/11/chartex" xmlns:cx6="http://schemas.microsoft.com/office/drawing/2016/5/12/chartex" xmlns:cx7="http://schemas.microsoft.com/office/drawing/2016/5/13/chartex" xmlns:cx8="http://schemas.microsoft.com/office/drawing/2016/5/14/chartex" xmlns:mc="http://schemas.openxmlformats.org/markup-compatibility/2006" xmlns:aink="http://schemas.microsoft.com/office/drawing/2016/ink" xmlns:am3d="http://schemas.microsoft.com/office/drawing/2017/model3d" xmlns:o="urn:schemas-microsoft-com:office:office" xmlns:oel="http://schemas.microsoft.com/office/2019/extlst" xmlns:r="http://schemas.openxmlformats.org/officeDocument/2006/relationships" xmlns:m="http://schemas.openxmlformats.org/officeDocument/2006/math" xmlns:v="urn:schemas-microsoft-com:vml" xmlns:wp14="http://schemas.microsoft.com/office/word/2010/wordprocessingDrawing" xmlns:wp="http://schemas.openxmlformats.org/drawingml/2006/wordprocessingDrawing" xmlns:w10="urn:schemas-microsoft-com:office:word" xmlns:w="http://schemas.openxmlformats.org/wordprocessingml/2006/main" xmlns:w14="http://schemas.microsoft.com/office/word/2010/wordml" xmlns:w15="http://schemas.microsoft.com/office/word/2012/wordml" xmlns:w16cex="http://schemas.microsoft.com/office/word/2018/wordml/cex" xmlns:w16cid="http://schemas.microsoft.com/office/word/2016/wordml/cid" xmlns:w16="http://schemas.microsoft.com/office/word/2018/wordml" xmlns:w16du="http://schemas.microsoft.com/office/word/2023/wordml/word16du" xmlns:w16sdtdh="http://schemas.microsoft.com/office/word/2020/wordml/sdtdatahash" xmlns:w16sdtfl="http://schemas.microsoft.com/office/word/2024/wordml/sdtformatlock" xmlns:w16se="http://schemas.microsoft.com/office/word/2015/wordml/symex" xmlns:wpg="http://schemas.microsoft.com/office/word/2010/wordprocessingGroup" xmlns:wpi="http://schemas.microsoft.com/office/word/2010/wordprocessingInk" xmlns:wne="http://schemas.microsoft.com/office/word/2006/wordml" xmlns:wps="http://schemas.microsoft.com/office/word/2010/wordprocessingShape" mc:Ignorable="w14 w15 w16se w16cid w16 w16cex w16sdtdh w16sdtfl w16du wp14">
   <w:abstractNum w:abstractNumId="0" w15:restartNumberingAfterBreak="0">
+    <w:nsid w:val="030F735A"/>
+    <w:multiLevelType w:val="multilevel"/>
+    <w:tmpl w:val="2AF2E494"/>
+    <w:lvl w:ilvl="0">
+      <w:start w:val="1"/>
+      <w:numFmt w:val="bullet"/>
+      <w:lvlText w:val=""/>
+      <w:lvlJc w:val="left"/>
+      <w:pPr>
+        <w:tabs>
+          <w:tab w:val="num" w:pos="720"/>
+        </w:tabs>
+        <w:ind w:left="720" w:hanging="360"/>
+      </w:pPr>
+      <w:rPr>
+        <w:rFonts w:ascii="Symbol" w:hAnsi="Symbol" w:hint="default"/>
+        <w:sz w:val="20"/>
+      </w:rPr>
+    </w:lvl>
+    <w:lvl w:ilvl="1" w:tentative="1">
+      <w:start w:val="1"/>
+      <w:numFmt w:val="bullet"/>
+      <w:lvlText w:val="o"/>
+      <w:lvlJc w:val="left"/>
+      <w:pPr>
+        <w:tabs>
+          <w:tab w:val="num" w:pos="1440"/>
+        </w:tabs>
+        <w:ind w:left="1440" w:hanging="360"/>
+      </w:pPr>
+      <w:rPr>
+        <w:rFonts w:ascii="Courier New" w:hAnsi="Courier New" w:hint="default"/>
+        <w:sz w:val="20"/>
+      </w:rPr>
+    </w:lvl>
+    <w:lvl w:ilvl="2" w:tentative="1">
+      <w:start w:val="1"/>
+      <w:numFmt w:val="bullet"/>
+      <w:lvlText w:val=""/>
+      <w:lvlJc w:val="left"/>
+      <w:pPr>
+        <w:tabs>
+          <w:tab w:val="num" w:pos="2160"/>
+        </w:tabs>
+        <w:ind w:left="2160" w:hanging="360"/>
+      </w:pPr>
+      <w:rPr>
+        <w:rFonts w:ascii="Wingdings" w:hAnsi="Wingdings" w:hint="default"/>
+        <w:sz w:val="20"/>
+      </w:rPr>
+    </w:lvl>
+    <w:lvl w:ilvl="3" w:tentative="1">
+      <w:start w:val="1"/>
+      <w:numFmt w:val="bullet"/>
+      <w:lvlText w:val=""/>
+      <w:lvlJc w:val="left"/>
+      <w:pPr>
+        <w:tabs>
+          <w:tab w:val="num" w:pos="2880"/>
+        </w:tabs>
+        <w:ind w:left="2880" w:hanging="360"/>
+      </w:pPr>
+      <w:rPr>
+        <w:rFonts w:ascii="Wingdings" w:hAnsi="Wingdings" w:hint="default"/>
+        <w:sz w:val="20"/>
+      </w:rPr>
+    </w:lvl>
+    <w:lvl w:ilvl="4" w:tentative="1">
+      <w:start w:val="1"/>
+      <w:numFmt w:val="bullet"/>
+      <w:lvlText w:val=""/>
+      <w:lvlJc w:val="left"/>
+      <w:pPr>
+        <w:tabs>
+          <w:tab w:val="num" w:pos="3600"/>
+        </w:tabs>
+        <w:ind w:left="3600" w:hanging="360"/>
+      </w:pPr>
+      <w:rPr>
+        <w:rFonts w:ascii="Wingdings" w:hAnsi="Wingdings" w:hint="default"/>
+        <w:sz w:val="20"/>
+      </w:rPr>
+    </w:lvl>
+    <w:lvl w:ilvl="5" w:tentative="1">
+      <w:start w:val="1"/>
+      <w:numFmt w:val="bullet"/>
+      <w:lvlText w:val=""/>
+      <w:lvlJc w:val="left"/>
+      <w:pPr>
+        <w:tabs>
+          <w:tab w:val="num" w:pos="4320"/>
+        </w:tabs>
+        <w:ind w:left="4320" w:hanging="360"/>
+      </w:pPr>
+      <w:rPr>
+        <w:rFonts w:ascii="Wingdings" w:hAnsi="Wingdings" w:hint="default"/>
+        <w:sz w:val="20"/>
+      </w:rPr>
+    </w:lvl>
+    <w:lvl w:ilvl="6" w:tentative="1">
+      <w:start w:val="1"/>
+      <w:numFmt w:val="bullet"/>
+      <w:lvlText w:val=""/>
+      <w:lvlJc w:val="left"/>
+      <w:pPr>
+        <w:tabs>
+          <w:tab w:val="num" w:pos="5040"/>
+        </w:tabs>
+        <w:ind w:left="5040" w:hanging="360"/>
+      </w:pPr>
+      <w:rPr>
+        <w:rFonts w:ascii="Wingdings" w:hAnsi="Wingdings" w:hint="default"/>
+        <w:sz w:val="20"/>
+      </w:rPr>
+    </w:lvl>
+    <w:lvl w:ilvl="7" w:tentative="1">
+      <w:start w:val="1"/>
+      <w:numFmt w:val="bullet"/>
+      <w:lvlText w:val=""/>
+      <w:lvlJc w:val="left"/>
+      <w:pPr>
+        <w:tabs>
+          <w:tab w:val="num" w:pos="5760"/>
+        </w:tabs>
+        <w:ind w:left="5760" w:hanging="360"/>
+      </w:pPr>
+      <w:rPr>
+        <w:rFonts w:ascii="Wingdings" w:hAnsi="Wingdings" w:hint="default"/>
+        <w:sz w:val="20"/>
+      </w:rPr>
+    </w:lvl>
+    <w:lvl w:ilvl="8" w:tentative="1">
+      <w:start w:val="1"/>
+      <w:numFmt w:val="bullet"/>
+      <w:lvlText w:val=""/>
+      <w:lvlJc w:val="left"/>
+      <w:pPr>
+        <w:tabs>
+          <w:tab w:val="num" w:pos="6480"/>
+        </w:tabs>
+        <w:ind w:left="6480" w:hanging="360"/>
+      </w:pPr>
+      <w:rPr>
+        <w:rFonts w:ascii="Wingdings" w:hAnsi="Wingdings" w:hint="default"/>
+        <w:sz w:val="20"/>
+      </w:rPr>
+    </w:lvl>
+  </w:abstractNum>
+  <w:abstractNum w:abstractNumId="1" w15:restartNumberingAfterBreak="0">
     <w:nsid w:val="03214134"/>
     <w:multiLevelType w:val="hybridMultilevel"/>
     <w:tmpl w:val="FE9E8392"/>
@@ -1210,7 +1602,7 @@
       </w:pPr>
     </w:lvl>
   </w:abstractNum>
-  <w:abstractNum w:abstractNumId="1" w15:restartNumberingAfterBreak="0">
+  <w:abstractNum w:abstractNumId="2" w15:restartNumberingAfterBreak="0">
     <w:nsid w:val="04765FE3"/>
     <w:multiLevelType w:val="multilevel"/>
     <w:tmpl w:val="BB2CFC5C"/>
@@ -1359,7 +1751,7 @@
       </w:rPr>
     </w:lvl>
   </w:abstractNum>
-  <w:abstractNum w:abstractNumId="2" w15:restartNumberingAfterBreak="0">
+  <w:abstractNum w:abstractNumId="3" w15:restartNumberingAfterBreak="0">
     <w:nsid w:val="20B57917"/>
     <w:multiLevelType w:val="hybridMultilevel"/>
     <w:tmpl w:val="AFA85686"/>
@@ -1448,7 +1840,301 @@
       </w:pPr>
     </w:lvl>
   </w:abstractNum>
-  <w:abstractNum w:abstractNumId="3" w15:restartNumberingAfterBreak="0">
+  <w:abstractNum w:abstractNumId="4" w15:restartNumberingAfterBreak="0">
+    <w:nsid w:val="254C1C04"/>
+    <w:multiLevelType w:val="multilevel"/>
+    <w:tmpl w:val="56DA7B38"/>
+    <w:lvl w:ilvl="0">
+      <w:start w:val="1"/>
+      <w:numFmt w:val="bullet"/>
+      <w:lvlText w:val=""/>
+      <w:lvlJc w:val="left"/>
+      <w:pPr>
+        <w:tabs>
+          <w:tab w:val="num" w:pos="720"/>
+        </w:tabs>
+        <w:ind w:left="720" w:hanging="360"/>
+      </w:pPr>
+      <w:rPr>
+        <w:rFonts w:ascii="Symbol" w:hAnsi="Symbol" w:hint="default"/>
+        <w:sz w:val="20"/>
+      </w:rPr>
+    </w:lvl>
+    <w:lvl w:ilvl="1">
+      <w:start w:val="1"/>
+      <w:numFmt w:val="decimal"/>
+      <w:lvlText w:val="%2)"/>
+      <w:lvlJc w:val="left"/>
+      <w:pPr>
+        <w:ind w:left="1440" w:hanging="360"/>
+      </w:pPr>
+      <w:rPr>
+        <w:rFonts w:hint="default"/>
+      </w:rPr>
+    </w:lvl>
+    <w:lvl w:ilvl="2" w:tentative="1">
+      <w:start w:val="1"/>
+      <w:numFmt w:val="bullet"/>
+      <w:lvlText w:val=""/>
+      <w:lvlJc w:val="left"/>
+      <w:pPr>
+        <w:tabs>
+          <w:tab w:val="num" w:pos="2160"/>
+        </w:tabs>
+        <w:ind w:left="2160" w:hanging="360"/>
+      </w:pPr>
+      <w:rPr>
+        <w:rFonts w:ascii="Wingdings" w:hAnsi="Wingdings" w:hint="default"/>
+        <w:sz w:val="20"/>
+      </w:rPr>
+    </w:lvl>
+    <w:lvl w:ilvl="3" w:tentative="1">
+      <w:start w:val="1"/>
+      <w:numFmt w:val="bullet"/>
+      <w:lvlText w:val=""/>
+      <w:lvlJc w:val="left"/>
+      <w:pPr>
+        <w:tabs>
+          <w:tab w:val="num" w:pos="2880"/>
+        </w:tabs>
+        <w:ind w:left="2880" w:hanging="360"/>
+      </w:pPr>
+      <w:rPr>
+        <w:rFonts w:ascii="Wingdings" w:hAnsi="Wingdings" w:hint="default"/>
+        <w:sz w:val="20"/>
+      </w:rPr>
+    </w:lvl>
+    <w:lvl w:ilvl="4" w:tentative="1">
+      <w:start w:val="1"/>
+      <w:numFmt w:val="bullet"/>
+      <w:lvlText w:val=""/>
+      <w:lvlJc w:val="left"/>
+      <w:pPr>
+        <w:tabs>
+          <w:tab w:val="num" w:pos="3600"/>
+        </w:tabs>
+        <w:ind w:left="3600" w:hanging="360"/>
+      </w:pPr>
+      <w:rPr>
+        <w:rFonts w:ascii="Wingdings" w:hAnsi="Wingdings" w:hint="default"/>
+        <w:sz w:val="20"/>
+      </w:rPr>
+    </w:lvl>
+    <w:lvl w:ilvl="5" w:tentative="1">
+      <w:start w:val="1"/>
+      <w:numFmt w:val="bullet"/>
+      <w:lvlText w:val=""/>
+      <w:lvlJc w:val="left"/>
+      <w:pPr>
+        <w:tabs>
+          <w:tab w:val="num" w:pos="4320"/>
+        </w:tabs>
+        <w:ind w:left="4320" w:hanging="360"/>
+      </w:pPr>
+      <w:rPr>
+        <w:rFonts w:ascii="Wingdings" w:hAnsi="Wingdings" w:hint="default"/>
+        <w:sz w:val="20"/>
+      </w:rPr>
+    </w:lvl>
+    <w:lvl w:ilvl="6" w:tentative="1">
+      <w:start w:val="1"/>
+      <w:numFmt w:val="bullet"/>
+      <w:lvlText w:val=""/>
+      <w:lvlJc w:val="left"/>
+      <w:pPr>
+        <w:tabs>
+          <w:tab w:val="num" w:pos="5040"/>
+        </w:tabs>
+        <w:ind w:left="5040" w:hanging="360"/>
+      </w:pPr>
+      <w:rPr>
+        <w:rFonts w:ascii="Wingdings" w:hAnsi="Wingdings" w:hint="default"/>
+        <w:sz w:val="20"/>
+      </w:rPr>
+    </w:lvl>
+    <w:lvl w:ilvl="7" w:tentative="1">
+      <w:start w:val="1"/>
+      <w:numFmt w:val="bullet"/>
+      <w:lvlText w:val=""/>
+      <w:lvlJc w:val="left"/>
+      <w:pPr>
+        <w:tabs>
+          <w:tab w:val="num" w:pos="5760"/>
+        </w:tabs>
+        <w:ind w:left="5760" w:hanging="360"/>
+      </w:pPr>
+      <w:rPr>
+        <w:rFonts w:ascii="Wingdings" w:hAnsi="Wingdings" w:hint="default"/>
+        <w:sz w:val="20"/>
+      </w:rPr>
+    </w:lvl>
+    <w:lvl w:ilvl="8" w:tentative="1">
+      <w:start w:val="1"/>
+      <w:numFmt w:val="bullet"/>
+      <w:lvlText w:val=""/>
+      <w:lvlJc w:val="left"/>
+      <w:pPr>
+        <w:tabs>
+          <w:tab w:val="num" w:pos="6480"/>
+        </w:tabs>
+        <w:ind w:left="6480" w:hanging="360"/>
+      </w:pPr>
+      <w:rPr>
+        <w:rFonts w:ascii="Wingdings" w:hAnsi="Wingdings" w:hint="default"/>
+        <w:sz w:val="20"/>
+      </w:rPr>
+    </w:lvl>
+  </w:abstractNum>
+  <w:abstractNum w:abstractNumId="5" w15:restartNumberingAfterBreak="0">
+    <w:nsid w:val="269259D7"/>
+    <w:multiLevelType w:val="multilevel"/>
+    <w:tmpl w:val="C57CBD1A"/>
+    <w:lvl w:ilvl="0">
+      <w:start w:val="1"/>
+      <w:numFmt w:val="bullet"/>
+      <w:lvlText w:val=""/>
+      <w:lvlJc w:val="left"/>
+      <w:pPr>
+        <w:tabs>
+          <w:tab w:val="num" w:pos="720"/>
+        </w:tabs>
+        <w:ind w:left="720" w:hanging="360"/>
+      </w:pPr>
+      <w:rPr>
+        <w:rFonts w:ascii="Symbol" w:hAnsi="Symbol" w:hint="default"/>
+        <w:sz w:val="20"/>
+      </w:rPr>
+    </w:lvl>
+    <w:lvl w:ilvl="1" w:tentative="1">
+      <w:start w:val="1"/>
+      <w:numFmt w:val="bullet"/>
+      <w:lvlText w:val="o"/>
+      <w:lvlJc w:val="left"/>
+      <w:pPr>
+        <w:tabs>
+          <w:tab w:val="num" w:pos="1440"/>
+        </w:tabs>
+        <w:ind w:left="1440" w:hanging="360"/>
+      </w:pPr>
+      <w:rPr>
+        <w:rFonts w:ascii="Courier New" w:hAnsi="Courier New" w:hint="default"/>
+        <w:sz w:val="20"/>
+      </w:rPr>
+    </w:lvl>
+    <w:lvl w:ilvl="2" w:tentative="1">
+      <w:start w:val="1"/>
+      <w:numFmt w:val="bullet"/>
+      <w:lvlText w:val=""/>
+      <w:lvlJc w:val="left"/>
+      <w:pPr>
+        <w:tabs>
+          <w:tab w:val="num" w:pos="2160"/>
+        </w:tabs>
+        <w:ind w:left="2160" w:hanging="360"/>
+      </w:pPr>
+      <w:rPr>
+        <w:rFonts w:ascii="Wingdings" w:hAnsi="Wingdings" w:hint="default"/>
+        <w:sz w:val="20"/>
+      </w:rPr>
+    </w:lvl>
+    <w:lvl w:ilvl="3" w:tentative="1">
+      <w:start w:val="1"/>
+      <w:numFmt w:val="bullet"/>
+      <w:lvlText w:val=""/>
+      <w:lvlJc w:val="left"/>
+      <w:pPr>
+        <w:tabs>
+          <w:tab w:val="num" w:pos="2880"/>
+        </w:tabs>
+        <w:ind w:left="2880" w:hanging="360"/>
+      </w:pPr>
+      <w:rPr>
+        <w:rFonts w:ascii="Wingdings" w:hAnsi="Wingdings" w:hint="default"/>
+        <w:sz w:val="20"/>
+      </w:rPr>
+    </w:lvl>
+    <w:lvl w:ilvl="4" w:tentative="1">
+      <w:start w:val="1"/>
+      <w:numFmt w:val="bullet"/>
+      <w:lvlText w:val=""/>
+      <w:lvlJc w:val="left"/>
+      <w:pPr>
+        <w:tabs>
+          <w:tab w:val="num" w:pos="3600"/>
+        </w:tabs>
+        <w:ind w:left="3600" w:hanging="360"/>
+      </w:pPr>
+      <w:rPr>
+        <w:rFonts w:ascii="Wingdings" w:hAnsi="Wingdings" w:hint="default"/>
+        <w:sz w:val="20"/>
+      </w:rPr>
+    </w:lvl>
+    <w:lvl w:ilvl="5" w:tentative="1">
+      <w:start w:val="1"/>
+      <w:numFmt w:val="bullet"/>
+      <w:lvlText w:val=""/>
+      <w:lvlJc w:val="left"/>
+      <w:pPr>
+        <w:tabs>
+          <w:tab w:val="num" w:pos="4320"/>
+        </w:tabs>
+        <w:ind w:left="4320" w:hanging="360"/>
+      </w:pPr>
+      <w:rPr>
+        <w:rFonts w:ascii="Wingdings" w:hAnsi="Wingdings" w:hint="default"/>
+        <w:sz w:val="20"/>
+      </w:rPr>
+    </w:lvl>
+    <w:lvl w:ilvl="6" w:tentative="1">
+      <w:start w:val="1"/>
+      <w:numFmt w:val="bullet"/>
+      <w:lvlText w:val=""/>
+      <w:lvlJc w:val="left"/>
+      <w:pPr>
+        <w:tabs>
+          <w:tab w:val="num" w:pos="5040"/>
+        </w:tabs>
+        <w:ind w:left="5040" w:hanging="360"/>
+      </w:pPr>
+      <w:rPr>
+        <w:rFonts w:ascii="Wingdings" w:hAnsi="Wingdings" w:hint="default"/>
+        <w:sz w:val="20"/>
+      </w:rPr>
+    </w:lvl>
+    <w:lvl w:ilvl="7" w:tentative="1">
+      <w:start w:val="1"/>
+      <w:numFmt w:val="bullet"/>
+      <w:lvlText w:val=""/>
+      <w:lvlJc w:val="left"/>
+      <w:pPr>
+        <w:tabs>
+          <w:tab w:val="num" w:pos="5760"/>
+        </w:tabs>
+        <w:ind w:left="5760" w:hanging="360"/>
+      </w:pPr>
+      <w:rPr>
+        <w:rFonts w:ascii="Wingdings" w:hAnsi="Wingdings" w:hint="default"/>
+        <w:sz w:val="20"/>
+      </w:rPr>
+    </w:lvl>
+    <w:lvl w:ilvl="8" w:tentative="1">
+      <w:start w:val="1"/>
+      <w:numFmt w:val="bullet"/>
+      <w:lvlText w:val=""/>
+      <w:lvlJc w:val="left"/>
+      <w:pPr>
+        <w:tabs>
+          <w:tab w:val="num" w:pos="6480"/>
+        </w:tabs>
+        <w:ind w:left="6480" w:hanging="360"/>
+      </w:pPr>
+      <w:rPr>
+        <w:rFonts w:ascii="Wingdings" w:hAnsi="Wingdings" w:hint="default"/>
+        <w:sz w:val="20"/>
+      </w:rPr>
+    </w:lvl>
+  </w:abstractNum>
+  <w:abstractNum w:abstractNumId="6" w15:restartNumberingAfterBreak="0">
     <w:nsid w:val="2D0960C6"/>
     <w:multiLevelType w:val="hybridMultilevel"/>
     <w:tmpl w:val="4508B070"/>
@@ -1537,7 +2223,7 @@
       </w:pPr>
     </w:lvl>
   </w:abstractNum>
-  <w:abstractNum w:abstractNumId="4" w15:restartNumberingAfterBreak="0">
+  <w:abstractNum w:abstractNumId="7" w15:restartNumberingAfterBreak="0">
     <w:nsid w:val="3A8F41DF"/>
     <w:multiLevelType w:val="multilevel"/>
     <w:tmpl w:val="8A94E16C"/>
@@ -1686,10 +2372,10 @@
       </w:rPr>
     </w:lvl>
   </w:abstractNum>
-  <w:abstractNum w:abstractNumId="5" w15:restartNumberingAfterBreak="0">
+  <w:abstractNum w:abstractNumId="8" w15:restartNumberingAfterBreak="0">
     <w:nsid w:val="3B8F2A92"/>
     <w:multiLevelType w:val="multilevel"/>
-    <w:tmpl w:val="CDD623DA"/>
+    <w:tmpl w:val="8D8A6F8A"/>
     <w:lvl w:ilvl="0">
       <w:start w:val="1"/>
       <w:numFmt w:val="bullet"/>
@@ -1706,20 +2392,16 @@
         <w:sz w:val="20"/>
       </w:rPr>
     </w:lvl>
-    <w:lvl w:ilvl="1" w:tentative="1">
-      <w:start w:val="1"/>
-      <w:numFmt w:val="bullet"/>
-      <w:lvlText w:val="o"/>
-      <w:lvlJc w:val="left"/>
-      <w:pPr>
-        <w:tabs>
-          <w:tab w:val="num" w:pos="1440"/>
-        </w:tabs>
+    <w:lvl w:ilvl="1">
+      <w:start w:val="1"/>
+      <w:numFmt w:val="decimal"/>
+      <w:lvlText w:val="%2)"/>
+      <w:lvlJc w:val="left"/>
+      <w:pPr>
         <w:ind w:left="1440" w:hanging="360"/>
       </w:pPr>
       <w:rPr>
-        <w:rFonts w:ascii="Courier New" w:hAnsi="Courier New" w:hint="default"/>
-        <w:sz w:val="20"/>
+        <w:rFonts w:hint="default"/>
       </w:rPr>
     </w:lvl>
     <w:lvl w:ilvl="2" w:tentative="1">
@@ -1835,7 +2517,7 @@
       </w:rPr>
     </w:lvl>
   </w:abstractNum>
-  <w:abstractNum w:abstractNumId="6" w15:restartNumberingAfterBreak="0">
+  <w:abstractNum w:abstractNumId="9" w15:restartNumberingAfterBreak="0">
     <w:nsid w:val="3C3737E7"/>
     <w:multiLevelType w:val="hybridMultilevel"/>
     <w:tmpl w:val="50A0703C"/>
@@ -1924,7 +2606,7 @@
       </w:pPr>
     </w:lvl>
   </w:abstractNum>
-  <w:abstractNum w:abstractNumId="7" w15:restartNumberingAfterBreak="0">
+  <w:abstractNum w:abstractNumId="10" w15:restartNumberingAfterBreak="0">
     <w:nsid w:val="3F956B8E"/>
     <w:multiLevelType w:val="hybridMultilevel"/>
     <w:tmpl w:val="19BA73F2"/>
@@ -2013,7 +2695,7 @@
       </w:pPr>
     </w:lvl>
   </w:abstractNum>
-  <w:abstractNum w:abstractNumId="8" w15:restartNumberingAfterBreak="0">
+  <w:abstractNum w:abstractNumId="11" w15:restartNumberingAfterBreak="0">
     <w:nsid w:val="40814AA8"/>
     <w:multiLevelType w:val="multilevel"/>
     <w:tmpl w:val="96A4B72E"/>
@@ -2162,7 +2844,454 @@
       </w:rPr>
     </w:lvl>
   </w:abstractNum>
-  <w:abstractNum w:abstractNumId="9" w15:restartNumberingAfterBreak="0">
+  <w:abstractNum w:abstractNumId="12" w15:restartNumberingAfterBreak="0">
+    <w:nsid w:val="490E6039"/>
+    <w:multiLevelType w:val="multilevel"/>
+    <w:tmpl w:val="81540BB2"/>
+    <w:lvl w:ilvl="0">
+      <w:start w:val="1"/>
+      <w:numFmt w:val="bullet"/>
+      <w:lvlText w:val=""/>
+      <w:lvlJc w:val="left"/>
+      <w:pPr>
+        <w:tabs>
+          <w:tab w:val="num" w:pos="720"/>
+        </w:tabs>
+        <w:ind w:left="720" w:hanging="360"/>
+      </w:pPr>
+      <w:rPr>
+        <w:rFonts w:ascii="Symbol" w:hAnsi="Symbol" w:hint="default"/>
+        <w:sz w:val="20"/>
+      </w:rPr>
+    </w:lvl>
+    <w:lvl w:ilvl="1" w:tentative="1">
+      <w:start w:val="1"/>
+      <w:numFmt w:val="bullet"/>
+      <w:lvlText w:val="o"/>
+      <w:lvlJc w:val="left"/>
+      <w:pPr>
+        <w:tabs>
+          <w:tab w:val="num" w:pos="1440"/>
+        </w:tabs>
+        <w:ind w:left="1440" w:hanging="360"/>
+      </w:pPr>
+      <w:rPr>
+        <w:rFonts w:ascii="Courier New" w:hAnsi="Courier New" w:hint="default"/>
+        <w:sz w:val="20"/>
+      </w:rPr>
+    </w:lvl>
+    <w:lvl w:ilvl="2" w:tentative="1">
+      <w:start w:val="1"/>
+      <w:numFmt w:val="bullet"/>
+      <w:lvlText w:val=""/>
+      <w:lvlJc w:val="left"/>
+      <w:pPr>
+        <w:tabs>
+          <w:tab w:val="num" w:pos="2160"/>
+        </w:tabs>
+        <w:ind w:left="2160" w:hanging="360"/>
+      </w:pPr>
+      <w:rPr>
+        <w:rFonts w:ascii="Wingdings" w:hAnsi="Wingdings" w:hint="default"/>
+        <w:sz w:val="20"/>
+      </w:rPr>
+    </w:lvl>
+    <w:lvl w:ilvl="3" w:tentative="1">
+      <w:start w:val="1"/>
+      <w:numFmt w:val="bullet"/>
+      <w:lvlText w:val=""/>
+      <w:lvlJc w:val="left"/>
+      <w:pPr>
+        <w:tabs>
+          <w:tab w:val="num" w:pos="2880"/>
+        </w:tabs>
+        <w:ind w:left="2880" w:hanging="360"/>
+      </w:pPr>
+      <w:rPr>
+        <w:rFonts w:ascii="Wingdings" w:hAnsi="Wingdings" w:hint="default"/>
+        <w:sz w:val="20"/>
+      </w:rPr>
+    </w:lvl>
+    <w:lvl w:ilvl="4" w:tentative="1">
+      <w:start w:val="1"/>
+      <w:numFmt w:val="bullet"/>
+      <w:lvlText w:val=""/>
+      <w:lvlJc w:val="left"/>
+      <w:pPr>
+        <w:tabs>
+          <w:tab w:val="num" w:pos="3600"/>
+        </w:tabs>
+        <w:ind w:left="3600" w:hanging="360"/>
+      </w:pPr>
+      <w:rPr>
+        <w:rFonts w:ascii="Wingdings" w:hAnsi="Wingdings" w:hint="default"/>
+        <w:sz w:val="20"/>
+      </w:rPr>
+    </w:lvl>
+    <w:lvl w:ilvl="5" w:tentative="1">
+      <w:start w:val="1"/>
+      <w:numFmt w:val="bullet"/>
+      <w:lvlText w:val=""/>
+      <w:lvlJc w:val="left"/>
+      <w:pPr>
+        <w:tabs>
+          <w:tab w:val="num" w:pos="4320"/>
+        </w:tabs>
+        <w:ind w:left="4320" w:hanging="360"/>
+      </w:pPr>
+      <w:rPr>
+        <w:rFonts w:ascii="Wingdings" w:hAnsi="Wingdings" w:hint="default"/>
+        <w:sz w:val="20"/>
+      </w:rPr>
+    </w:lvl>
+    <w:lvl w:ilvl="6" w:tentative="1">
+      <w:start w:val="1"/>
+      <w:numFmt w:val="bullet"/>
+      <w:lvlText w:val=""/>
+      <w:lvlJc w:val="left"/>
+      <w:pPr>
+        <w:tabs>
+          <w:tab w:val="num" w:pos="5040"/>
+        </w:tabs>
+        <w:ind w:left="5040" w:hanging="360"/>
+      </w:pPr>
+      <w:rPr>
+        <w:rFonts w:ascii="Wingdings" w:hAnsi="Wingdings" w:hint="default"/>
+        <w:sz w:val="20"/>
+      </w:rPr>
+    </w:lvl>
+    <w:lvl w:ilvl="7" w:tentative="1">
+      <w:start w:val="1"/>
+      <w:numFmt w:val="bullet"/>
+      <w:lvlText w:val=""/>
+      <w:lvlJc w:val="left"/>
+      <w:pPr>
+        <w:tabs>
+          <w:tab w:val="num" w:pos="5760"/>
+        </w:tabs>
+        <w:ind w:left="5760" w:hanging="360"/>
+      </w:pPr>
+      <w:rPr>
+        <w:rFonts w:ascii="Wingdings" w:hAnsi="Wingdings" w:hint="default"/>
+        <w:sz w:val="20"/>
+      </w:rPr>
+    </w:lvl>
+    <w:lvl w:ilvl="8" w:tentative="1">
+      <w:start w:val="1"/>
+      <w:numFmt w:val="bullet"/>
+      <w:lvlText w:val=""/>
+      <w:lvlJc w:val="left"/>
+      <w:pPr>
+        <w:tabs>
+          <w:tab w:val="num" w:pos="6480"/>
+        </w:tabs>
+        <w:ind w:left="6480" w:hanging="360"/>
+      </w:pPr>
+      <w:rPr>
+        <w:rFonts w:ascii="Wingdings" w:hAnsi="Wingdings" w:hint="default"/>
+        <w:sz w:val="20"/>
+      </w:rPr>
+    </w:lvl>
+  </w:abstractNum>
+  <w:abstractNum w:abstractNumId="13" w15:restartNumberingAfterBreak="0">
+    <w:nsid w:val="4CC27E5E"/>
+    <w:multiLevelType w:val="multilevel"/>
+    <w:tmpl w:val="62F6ECE8"/>
+    <w:lvl w:ilvl="0">
+      <w:start w:val="1"/>
+      <w:numFmt w:val="bullet"/>
+      <w:lvlText w:val=""/>
+      <w:lvlJc w:val="left"/>
+      <w:pPr>
+        <w:tabs>
+          <w:tab w:val="num" w:pos="720"/>
+        </w:tabs>
+        <w:ind w:left="720" w:hanging="360"/>
+      </w:pPr>
+      <w:rPr>
+        <w:rFonts w:ascii="Symbol" w:hAnsi="Symbol" w:hint="default"/>
+        <w:sz w:val="20"/>
+      </w:rPr>
+    </w:lvl>
+    <w:lvl w:ilvl="1" w:tentative="1">
+      <w:start w:val="1"/>
+      <w:numFmt w:val="bullet"/>
+      <w:lvlText w:val="o"/>
+      <w:lvlJc w:val="left"/>
+      <w:pPr>
+        <w:tabs>
+          <w:tab w:val="num" w:pos="1440"/>
+        </w:tabs>
+        <w:ind w:left="1440" w:hanging="360"/>
+      </w:pPr>
+      <w:rPr>
+        <w:rFonts w:ascii="Courier New" w:hAnsi="Courier New" w:hint="default"/>
+        <w:sz w:val="20"/>
+      </w:rPr>
+    </w:lvl>
+    <w:lvl w:ilvl="2" w:tentative="1">
+      <w:start w:val="1"/>
+      <w:numFmt w:val="bullet"/>
+      <w:lvlText w:val=""/>
+      <w:lvlJc w:val="left"/>
+      <w:pPr>
+        <w:tabs>
+          <w:tab w:val="num" w:pos="2160"/>
+        </w:tabs>
+        <w:ind w:left="2160" w:hanging="360"/>
+      </w:pPr>
+      <w:rPr>
+        <w:rFonts w:ascii="Wingdings" w:hAnsi="Wingdings" w:hint="default"/>
+        <w:sz w:val="20"/>
+      </w:rPr>
+    </w:lvl>
+    <w:lvl w:ilvl="3" w:tentative="1">
+      <w:start w:val="1"/>
+      <w:numFmt w:val="bullet"/>
+      <w:lvlText w:val=""/>
+      <w:lvlJc w:val="left"/>
+      <w:pPr>
+        <w:tabs>
+          <w:tab w:val="num" w:pos="2880"/>
+        </w:tabs>
+        <w:ind w:left="2880" w:hanging="360"/>
+      </w:pPr>
+      <w:rPr>
+        <w:rFonts w:ascii="Wingdings" w:hAnsi="Wingdings" w:hint="default"/>
+        <w:sz w:val="20"/>
+      </w:rPr>
+    </w:lvl>
+    <w:lvl w:ilvl="4" w:tentative="1">
+      <w:start w:val="1"/>
+      <w:numFmt w:val="bullet"/>
+      <w:lvlText w:val=""/>
+      <w:lvlJc w:val="left"/>
+      <w:pPr>
+        <w:tabs>
+          <w:tab w:val="num" w:pos="3600"/>
+        </w:tabs>
+        <w:ind w:left="3600" w:hanging="360"/>
+      </w:pPr>
+      <w:rPr>
+        <w:rFonts w:ascii="Wingdings" w:hAnsi="Wingdings" w:hint="default"/>
+        <w:sz w:val="20"/>
+      </w:rPr>
+    </w:lvl>
+    <w:lvl w:ilvl="5" w:tentative="1">
+      <w:start w:val="1"/>
+      <w:numFmt w:val="bullet"/>
+      <w:lvlText w:val=""/>
+      <w:lvlJc w:val="left"/>
+      <w:pPr>
+        <w:tabs>
+          <w:tab w:val="num" w:pos="4320"/>
+        </w:tabs>
+        <w:ind w:left="4320" w:hanging="360"/>
+      </w:pPr>
+      <w:rPr>
+        <w:rFonts w:ascii="Wingdings" w:hAnsi="Wingdings" w:hint="default"/>
+        <w:sz w:val="20"/>
+      </w:rPr>
+    </w:lvl>
+    <w:lvl w:ilvl="6" w:tentative="1">
+      <w:start w:val="1"/>
+      <w:numFmt w:val="bullet"/>
+      <w:lvlText w:val=""/>
+      <w:lvlJc w:val="left"/>
+      <w:pPr>
+        <w:tabs>
+          <w:tab w:val="num" w:pos="5040"/>
+        </w:tabs>
+        <w:ind w:left="5040" w:hanging="360"/>
+      </w:pPr>
+      <w:rPr>
+        <w:rFonts w:ascii="Wingdings" w:hAnsi="Wingdings" w:hint="default"/>
+        <w:sz w:val="20"/>
+      </w:rPr>
+    </w:lvl>
+    <w:lvl w:ilvl="7" w:tentative="1">
+      <w:start w:val="1"/>
+      <w:numFmt w:val="bullet"/>
+      <w:lvlText w:val=""/>
+      <w:lvlJc w:val="left"/>
+      <w:pPr>
+        <w:tabs>
+          <w:tab w:val="num" w:pos="5760"/>
+        </w:tabs>
+        <w:ind w:left="5760" w:hanging="360"/>
+      </w:pPr>
+      <w:rPr>
+        <w:rFonts w:ascii="Wingdings" w:hAnsi="Wingdings" w:hint="default"/>
+        <w:sz w:val="20"/>
+      </w:rPr>
+    </w:lvl>
+    <w:lvl w:ilvl="8" w:tentative="1">
+      <w:start w:val="1"/>
+      <w:numFmt w:val="bullet"/>
+      <w:lvlText w:val=""/>
+      <w:lvlJc w:val="left"/>
+      <w:pPr>
+        <w:tabs>
+          <w:tab w:val="num" w:pos="6480"/>
+        </w:tabs>
+        <w:ind w:left="6480" w:hanging="360"/>
+      </w:pPr>
+      <w:rPr>
+        <w:rFonts w:ascii="Wingdings" w:hAnsi="Wingdings" w:hint="default"/>
+        <w:sz w:val="20"/>
+      </w:rPr>
+    </w:lvl>
+  </w:abstractNum>
+  <w:abstractNum w:abstractNumId="14" w15:restartNumberingAfterBreak="0">
+    <w:nsid w:val="57077651"/>
+    <w:multiLevelType w:val="multilevel"/>
+    <w:tmpl w:val="990CFAF8"/>
+    <w:lvl w:ilvl="0">
+      <w:start w:val="1"/>
+      <w:numFmt w:val="bullet"/>
+      <w:lvlText w:val=""/>
+      <w:lvlJc w:val="left"/>
+      <w:pPr>
+        <w:tabs>
+          <w:tab w:val="num" w:pos="720"/>
+        </w:tabs>
+        <w:ind w:left="720" w:hanging="360"/>
+      </w:pPr>
+      <w:rPr>
+        <w:rFonts w:ascii="Symbol" w:hAnsi="Symbol" w:hint="default"/>
+        <w:sz w:val="20"/>
+      </w:rPr>
+    </w:lvl>
+    <w:lvl w:ilvl="1">
+      <w:start w:val="1"/>
+      <w:numFmt w:val="bullet"/>
+      <w:lvlText w:val="o"/>
+      <w:lvlJc w:val="left"/>
+      <w:pPr>
+        <w:tabs>
+          <w:tab w:val="num" w:pos="1440"/>
+        </w:tabs>
+        <w:ind w:left="1440" w:hanging="360"/>
+      </w:pPr>
+      <w:rPr>
+        <w:rFonts w:ascii="Courier New" w:hAnsi="Courier New" w:hint="default"/>
+        <w:sz w:val="20"/>
+      </w:rPr>
+    </w:lvl>
+    <w:lvl w:ilvl="2" w:tentative="1">
+      <w:start w:val="1"/>
+      <w:numFmt w:val="bullet"/>
+      <w:lvlText w:val=""/>
+      <w:lvlJc w:val="left"/>
+      <w:pPr>
+        <w:tabs>
+          <w:tab w:val="num" w:pos="2160"/>
+        </w:tabs>
+        <w:ind w:left="2160" w:hanging="360"/>
+      </w:pPr>
+      <w:rPr>
+        <w:rFonts w:ascii="Wingdings" w:hAnsi="Wingdings" w:hint="default"/>
+        <w:sz w:val="20"/>
+      </w:rPr>
+    </w:lvl>
+    <w:lvl w:ilvl="3" w:tentative="1">
+      <w:start w:val="1"/>
+      <w:numFmt w:val="bullet"/>
+      <w:lvlText w:val=""/>
+      <w:lvlJc w:val="left"/>
+      <w:pPr>
+        <w:tabs>
+          <w:tab w:val="num" w:pos="2880"/>
+        </w:tabs>
+        <w:ind w:left="2880" w:hanging="360"/>
+      </w:pPr>
+      <w:rPr>
+        <w:rFonts w:ascii="Wingdings" w:hAnsi="Wingdings" w:hint="default"/>
+        <w:sz w:val="20"/>
+      </w:rPr>
+    </w:lvl>
+    <w:lvl w:ilvl="4" w:tentative="1">
+      <w:start w:val="1"/>
+      <w:numFmt w:val="bullet"/>
+      <w:lvlText w:val=""/>
+      <w:lvlJc w:val="left"/>
+      <w:pPr>
+        <w:tabs>
+          <w:tab w:val="num" w:pos="3600"/>
+        </w:tabs>
+        <w:ind w:left="3600" w:hanging="360"/>
+      </w:pPr>
+      <w:rPr>
+        <w:rFonts w:ascii="Wingdings" w:hAnsi="Wingdings" w:hint="default"/>
+        <w:sz w:val="20"/>
+      </w:rPr>
+    </w:lvl>
+    <w:lvl w:ilvl="5" w:tentative="1">
+      <w:start w:val="1"/>
+      <w:numFmt w:val="bullet"/>
+      <w:lvlText w:val=""/>
+      <w:lvlJc w:val="left"/>
+      <w:pPr>
+        <w:tabs>
+          <w:tab w:val="num" w:pos="4320"/>
+        </w:tabs>
+        <w:ind w:left="4320" w:hanging="360"/>
+      </w:pPr>
+      <w:rPr>
+        <w:rFonts w:ascii="Wingdings" w:hAnsi="Wingdings" w:hint="default"/>
+        <w:sz w:val="20"/>
+      </w:rPr>
+    </w:lvl>
+    <w:lvl w:ilvl="6" w:tentative="1">
+      <w:start w:val="1"/>
+      <w:numFmt w:val="bullet"/>
+      <w:lvlText w:val=""/>
+      <w:lvlJc w:val="left"/>
+      <w:pPr>
+        <w:tabs>
+          <w:tab w:val="num" w:pos="5040"/>
+        </w:tabs>
+        <w:ind w:left="5040" w:hanging="360"/>
+      </w:pPr>
+      <w:rPr>
+        <w:rFonts w:ascii="Wingdings" w:hAnsi="Wingdings" w:hint="default"/>
+        <w:sz w:val="20"/>
+      </w:rPr>
+    </w:lvl>
+    <w:lvl w:ilvl="7" w:tentative="1">
+      <w:start w:val="1"/>
+      <w:numFmt w:val="bullet"/>
+      <w:lvlText w:val=""/>
+      <w:lvlJc w:val="left"/>
+      <w:pPr>
+        <w:tabs>
+          <w:tab w:val="num" w:pos="5760"/>
+        </w:tabs>
+        <w:ind w:left="5760" w:hanging="360"/>
+      </w:pPr>
+      <w:rPr>
+        <w:rFonts w:ascii="Wingdings" w:hAnsi="Wingdings" w:hint="default"/>
+        <w:sz w:val="20"/>
+      </w:rPr>
+    </w:lvl>
+    <w:lvl w:ilvl="8" w:tentative="1">
+      <w:start w:val="1"/>
+      <w:numFmt w:val="bullet"/>
+      <w:lvlText w:val=""/>
+      <w:lvlJc w:val="left"/>
+      <w:pPr>
+        <w:tabs>
+          <w:tab w:val="num" w:pos="6480"/>
+        </w:tabs>
+        <w:ind w:left="6480" w:hanging="360"/>
+      </w:pPr>
+      <w:rPr>
+        <w:rFonts w:ascii="Wingdings" w:hAnsi="Wingdings" w:hint="default"/>
+        <w:sz w:val="20"/>
+      </w:rPr>
+    </w:lvl>
+  </w:abstractNum>
+  <w:abstractNum w:abstractNumId="15" w15:restartNumberingAfterBreak="0">
     <w:nsid w:val="571A3C7E"/>
     <w:multiLevelType w:val="hybridMultilevel"/>
     <w:tmpl w:val="8F2E537C"/>
@@ -2251,35 +3380,1275 @@
       </w:pPr>
     </w:lvl>
   </w:abstractNum>
+  <w:abstractNum w:abstractNumId="16" w15:restartNumberingAfterBreak="0">
+    <w:nsid w:val="57BD2965"/>
+    <w:multiLevelType w:val="multilevel"/>
+    <w:tmpl w:val="83501C30"/>
+    <w:lvl w:ilvl="0">
+      <w:start w:val="1"/>
+      <w:numFmt w:val="bullet"/>
+      <w:lvlText w:val=""/>
+      <w:lvlJc w:val="left"/>
+      <w:pPr>
+        <w:tabs>
+          <w:tab w:val="num" w:pos="720"/>
+        </w:tabs>
+        <w:ind w:left="720" w:hanging="360"/>
+      </w:pPr>
+      <w:rPr>
+        <w:rFonts w:ascii="Symbol" w:hAnsi="Symbol" w:hint="default"/>
+        <w:sz w:val="20"/>
+      </w:rPr>
+    </w:lvl>
+    <w:lvl w:ilvl="1" w:tentative="1">
+      <w:start w:val="1"/>
+      <w:numFmt w:val="bullet"/>
+      <w:lvlText w:val="o"/>
+      <w:lvlJc w:val="left"/>
+      <w:pPr>
+        <w:tabs>
+          <w:tab w:val="num" w:pos="1440"/>
+        </w:tabs>
+        <w:ind w:left="1440" w:hanging="360"/>
+      </w:pPr>
+      <w:rPr>
+        <w:rFonts w:ascii="Courier New" w:hAnsi="Courier New" w:hint="default"/>
+        <w:sz w:val="20"/>
+      </w:rPr>
+    </w:lvl>
+    <w:lvl w:ilvl="2" w:tentative="1">
+      <w:start w:val="1"/>
+      <w:numFmt w:val="bullet"/>
+      <w:lvlText w:val=""/>
+      <w:lvlJc w:val="left"/>
+      <w:pPr>
+        <w:tabs>
+          <w:tab w:val="num" w:pos="2160"/>
+        </w:tabs>
+        <w:ind w:left="2160" w:hanging="360"/>
+      </w:pPr>
+      <w:rPr>
+        <w:rFonts w:ascii="Wingdings" w:hAnsi="Wingdings" w:hint="default"/>
+        <w:sz w:val="20"/>
+      </w:rPr>
+    </w:lvl>
+    <w:lvl w:ilvl="3" w:tentative="1">
+      <w:start w:val="1"/>
+      <w:numFmt w:val="bullet"/>
+      <w:lvlText w:val=""/>
+      <w:lvlJc w:val="left"/>
+      <w:pPr>
+        <w:tabs>
+          <w:tab w:val="num" w:pos="2880"/>
+        </w:tabs>
+        <w:ind w:left="2880" w:hanging="360"/>
+      </w:pPr>
+      <w:rPr>
+        <w:rFonts w:ascii="Wingdings" w:hAnsi="Wingdings" w:hint="default"/>
+        <w:sz w:val="20"/>
+      </w:rPr>
+    </w:lvl>
+    <w:lvl w:ilvl="4" w:tentative="1">
+      <w:start w:val="1"/>
+      <w:numFmt w:val="bullet"/>
+      <w:lvlText w:val=""/>
+      <w:lvlJc w:val="left"/>
+      <w:pPr>
+        <w:tabs>
+          <w:tab w:val="num" w:pos="3600"/>
+        </w:tabs>
+        <w:ind w:left="3600" w:hanging="360"/>
+      </w:pPr>
+      <w:rPr>
+        <w:rFonts w:ascii="Wingdings" w:hAnsi="Wingdings" w:hint="default"/>
+        <w:sz w:val="20"/>
+      </w:rPr>
+    </w:lvl>
+    <w:lvl w:ilvl="5" w:tentative="1">
+      <w:start w:val="1"/>
+      <w:numFmt w:val="bullet"/>
+      <w:lvlText w:val=""/>
+      <w:lvlJc w:val="left"/>
+      <w:pPr>
+        <w:tabs>
+          <w:tab w:val="num" w:pos="4320"/>
+        </w:tabs>
+        <w:ind w:left="4320" w:hanging="360"/>
+      </w:pPr>
+      <w:rPr>
+        <w:rFonts w:ascii="Wingdings" w:hAnsi="Wingdings" w:hint="default"/>
+        <w:sz w:val="20"/>
+      </w:rPr>
+    </w:lvl>
+    <w:lvl w:ilvl="6" w:tentative="1">
+      <w:start w:val="1"/>
+      <w:numFmt w:val="bullet"/>
+      <w:lvlText w:val=""/>
+      <w:lvlJc w:val="left"/>
+      <w:pPr>
+        <w:tabs>
+          <w:tab w:val="num" w:pos="5040"/>
+        </w:tabs>
+        <w:ind w:left="5040" w:hanging="360"/>
+      </w:pPr>
+      <w:rPr>
+        <w:rFonts w:ascii="Wingdings" w:hAnsi="Wingdings" w:hint="default"/>
+        <w:sz w:val="20"/>
+      </w:rPr>
+    </w:lvl>
+    <w:lvl w:ilvl="7" w:tentative="1">
+      <w:start w:val="1"/>
+      <w:numFmt w:val="bullet"/>
+      <w:lvlText w:val=""/>
+      <w:lvlJc w:val="left"/>
+      <w:pPr>
+        <w:tabs>
+          <w:tab w:val="num" w:pos="5760"/>
+        </w:tabs>
+        <w:ind w:left="5760" w:hanging="360"/>
+      </w:pPr>
+      <w:rPr>
+        <w:rFonts w:ascii="Wingdings" w:hAnsi="Wingdings" w:hint="default"/>
+        <w:sz w:val="20"/>
+      </w:rPr>
+    </w:lvl>
+    <w:lvl w:ilvl="8" w:tentative="1">
+      <w:start w:val="1"/>
+      <w:numFmt w:val="bullet"/>
+      <w:lvlText w:val=""/>
+      <w:lvlJc w:val="left"/>
+      <w:pPr>
+        <w:tabs>
+          <w:tab w:val="num" w:pos="6480"/>
+        </w:tabs>
+        <w:ind w:left="6480" w:hanging="360"/>
+      </w:pPr>
+      <w:rPr>
+        <w:rFonts w:ascii="Wingdings" w:hAnsi="Wingdings" w:hint="default"/>
+        <w:sz w:val="20"/>
+      </w:rPr>
+    </w:lvl>
+  </w:abstractNum>
+  <w:abstractNum w:abstractNumId="17" w15:restartNumberingAfterBreak="0">
+    <w:nsid w:val="5D4A34A6"/>
+    <w:multiLevelType w:val="hybridMultilevel"/>
+    <w:tmpl w:val="63401DCE"/>
+    <w:lvl w:ilvl="0" w:tplc="04160011">
+      <w:start w:val="1"/>
+      <w:numFmt w:val="decimal"/>
+      <w:lvlText w:val="%1)"/>
+      <w:lvlJc w:val="left"/>
+      <w:pPr>
+        <w:ind w:left="720" w:hanging="360"/>
+      </w:pPr>
+      <w:rPr>
+        <w:rFonts w:hint="default"/>
+      </w:rPr>
+    </w:lvl>
+    <w:lvl w:ilvl="1" w:tplc="04160019" w:tentative="1">
+      <w:start w:val="1"/>
+      <w:numFmt w:val="lowerLetter"/>
+      <w:lvlText w:val="%2."/>
+      <w:lvlJc w:val="left"/>
+      <w:pPr>
+        <w:ind w:left="1440" w:hanging="360"/>
+      </w:pPr>
+    </w:lvl>
+    <w:lvl w:ilvl="2" w:tplc="0416001B" w:tentative="1">
+      <w:start w:val="1"/>
+      <w:numFmt w:val="lowerRoman"/>
+      <w:lvlText w:val="%3."/>
+      <w:lvlJc w:val="right"/>
+      <w:pPr>
+        <w:ind w:left="2160" w:hanging="180"/>
+      </w:pPr>
+    </w:lvl>
+    <w:lvl w:ilvl="3" w:tplc="0416000F" w:tentative="1">
+      <w:start w:val="1"/>
+      <w:numFmt w:val="decimal"/>
+      <w:lvlText w:val="%4."/>
+      <w:lvlJc w:val="left"/>
+      <w:pPr>
+        <w:ind w:left="2880" w:hanging="360"/>
+      </w:pPr>
+    </w:lvl>
+    <w:lvl w:ilvl="4" w:tplc="04160019" w:tentative="1">
+      <w:start w:val="1"/>
+      <w:numFmt w:val="lowerLetter"/>
+      <w:lvlText w:val="%5."/>
+      <w:lvlJc w:val="left"/>
+      <w:pPr>
+        <w:ind w:left="3600" w:hanging="360"/>
+      </w:pPr>
+    </w:lvl>
+    <w:lvl w:ilvl="5" w:tplc="0416001B" w:tentative="1">
+      <w:start w:val="1"/>
+      <w:numFmt w:val="lowerRoman"/>
+      <w:lvlText w:val="%6."/>
+      <w:lvlJc w:val="right"/>
+      <w:pPr>
+        <w:ind w:left="4320" w:hanging="180"/>
+      </w:pPr>
+    </w:lvl>
+    <w:lvl w:ilvl="6" w:tplc="0416000F" w:tentative="1">
+      <w:start w:val="1"/>
+      <w:numFmt w:val="decimal"/>
+      <w:lvlText w:val="%7."/>
+      <w:lvlJc w:val="left"/>
+      <w:pPr>
+        <w:ind w:left="5040" w:hanging="360"/>
+      </w:pPr>
+    </w:lvl>
+    <w:lvl w:ilvl="7" w:tplc="04160019" w:tentative="1">
+      <w:start w:val="1"/>
+      <w:numFmt w:val="lowerLetter"/>
+      <w:lvlText w:val="%8."/>
+      <w:lvlJc w:val="left"/>
+      <w:pPr>
+        <w:ind w:left="5760" w:hanging="360"/>
+      </w:pPr>
+    </w:lvl>
+    <w:lvl w:ilvl="8" w:tplc="0416001B" w:tentative="1">
+      <w:start w:val="1"/>
+      <w:numFmt w:val="lowerRoman"/>
+      <w:lvlText w:val="%9."/>
+      <w:lvlJc w:val="right"/>
+      <w:pPr>
+        <w:ind w:left="6480" w:hanging="180"/>
+      </w:pPr>
+    </w:lvl>
+  </w:abstractNum>
+  <w:abstractNum w:abstractNumId="18" w15:restartNumberingAfterBreak="0">
+    <w:nsid w:val="62051A92"/>
+    <w:multiLevelType w:val="multilevel"/>
+    <w:tmpl w:val="02F01BC6"/>
+    <w:lvl w:ilvl="0">
+      <w:start w:val="1"/>
+      <w:numFmt w:val="bullet"/>
+      <w:lvlText w:val=""/>
+      <w:lvlJc w:val="left"/>
+      <w:pPr>
+        <w:tabs>
+          <w:tab w:val="num" w:pos="720"/>
+        </w:tabs>
+        <w:ind w:left="720" w:hanging="360"/>
+      </w:pPr>
+      <w:rPr>
+        <w:rFonts w:ascii="Symbol" w:hAnsi="Symbol" w:hint="default"/>
+        <w:sz w:val="20"/>
+      </w:rPr>
+    </w:lvl>
+    <w:lvl w:ilvl="1" w:tentative="1">
+      <w:start w:val="1"/>
+      <w:numFmt w:val="bullet"/>
+      <w:lvlText w:val="o"/>
+      <w:lvlJc w:val="left"/>
+      <w:pPr>
+        <w:tabs>
+          <w:tab w:val="num" w:pos="1440"/>
+        </w:tabs>
+        <w:ind w:left="1440" w:hanging="360"/>
+      </w:pPr>
+      <w:rPr>
+        <w:rFonts w:ascii="Courier New" w:hAnsi="Courier New" w:hint="default"/>
+        <w:sz w:val="20"/>
+      </w:rPr>
+    </w:lvl>
+    <w:lvl w:ilvl="2" w:tentative="1">
+      <w:start w:val="1"/>
+      <w:numFmt w:val="bullet"/>
+      <w:lvlText w:val=""/>
+      <w:lvlJc w:val="left"/>
+      <w:pPr>
+        <w:tabs>
+          <w:tab w:val="num" w:pos="2160"/>
+        </w:tabs>
+        <w:ind w:left="2160" w:hanging="360"/>
+      </w:pPr>
+      <w:rPr>
+        <w:rFonts w:ascii="Wingdings" w:hAnsi="Wingdings" w:hint="default"/>
+        <w:sz w:val="20"/>
+      </w:rPr>
+    </w:lvl>
+    <w:lvl w:ilvl="3" w:tentative="1">
+      <w:start w:val="1"/>
+      <w:numFmt w:val="bullet"/>
+      <w:lvlText w:val=""/>
+      <w:lvlJc w:val="left"/>
+      <w:pPr>
+        <w:tabs>
+          <w:tab w:val="num" w:pos="2880"/>
+        </w:tabs>
+        <w:ind w:left="2880" w:hanging="360"/>
+      </w:pPr>
+      <w:rPr>
+        <w:rFonts w:ascii="Wingdings" w:hAnsi="Wingdings" w:hint="default"/>
+        <w:sz w:val="20"/>
+      </w:rPr>
+    </w:lvl>
+    <w:lvl w:ilvl="4" w:tentative="1">
+      <w:start w:val="1"/>
+      <w:numFmt w:val="bullet"/>
+      <w:lvlText w:val=""/>
+      <w:lvlJc w:val="left"/>
+      <w:pPr>
+        <w:tabs>
+          <w:tab w:val="num" w:pos="3600"/>
+        </w:tabs>
+        <w:ind w:left="3600" w:hanging="360"/>
+      </w:pPr>
+      <w:rPr>
+        <w:rFonts w:ascii="Wingdings" w:hAnsi="Wingdings" w:hint="default"/>
+        <w:sz w:val="20"/>
+      </w:rPr>
+    </w:lvl>
+    <w:lvl w:ilvl="5" w:tentative="1">
+      <w:start w:val="1"/>
+      <w:numFmt w:val="bullet"/>
+      <w:lvlText w:val=""/>
+      <w:lvlJc w:val="left"/>
+      <w:pPr>
+        <w:tabs>
+          <w:tab w:val="num" w:pos="4320"/>
+        </w:tabs>
+        <w:ind w:left="4320" w:hanging="360"/>
+      </w:pPr>
+      <w:rPr>
+        <w:rFonts w:ascii="Wingdings" w:hAnsi="Wingdings" w:hint="default"/>
+        <w:sz w:val="20"/>
+      </w:rPr>
+    </w:lvl>
+    <w:lvl w:ilvl="6" w:tentative="1">
+      <w:start w:val="1"/>
+      <w:numFmt w:val="bullet"/>
+      <w:lvlText w:val=""/>
+      <w:lvlJc w:val="left"/>
+      <w:pPr>
+        <w:tabs>
+          <w:tab w:val="num" w:pos="5040"/>
+        </w:tabs>
+        <w:ind w:left="5040" w:hanging="360"/>
+      </w:pPr>
+      <w:rPr>
+        <w:rFonts w:ascii="Wingdings" w:hAnsi="Wingdings" w:hint="default"/>
+        <w:sz w:val="20"/>
+      </w:rPr>
+    </w:lvl>
+    <w:lvl w:ilvl="7" w:tentative="1">
+      <w:start w:val="1"/>
+      <w:numFmt w:val="bullet"/>
+      <w:lvlText w:val=""/>
+      <w:lvlJc w:val="left"/>
+      <w:pPr>
+        <w:tabs>
+          <w:tab w:val="num" w:pos="5760"/>
+        </w:tabs>
+        <w:ind w:left="5760" w:hanging="360"/>
+      </w:pPr>
+      <w:rPr>
+        <w:rFonts w:ascii="Wingdings" w:hAnsi="Wingdings" w:hint="default"/>
+        <w:sz w:val="20"/>
+      </w:rPr>
+    </w:lvl>
+    <w:lvl w:ilvl="8" w:tentative="1">
+      <w:start w:val="1"/>
+      <w:numFmt w:val="bullet"/>
+      <w:lvlText w:val=""/>
+      <w:lvlJc w:val="left"/>
+      <w:pPr>
+        <w:tabs>
+          <w:tab w:val="num" w:pos="6480"/>
+        </w:tabs>
+        <w:ind w:left="6480" w:hanging="360"/>
+      </w:pPr>
+      <w:rPr>
+        <w:rFonts w:ascii="Wingdings" w:hAnsi="Wingdings" w:hint="default"/>
+        <w:sz w:val="20"/>
+      </w:rPr>
+    </w:lvl>
+  </w:abstractNum>
+  <w:abstractNum w:abstractNumId="19" w15:restartNumberingAfterBreak="0">
+    <w:nsid w:val="63BC7229"/>
+    <w:multiLevelType w:val="multilevel"/>
+    <w:tmpl w:val="A15A7DEC"/>
+    <w:lvl w:ilvl="0">
+      <w:start w:val="1"/>
+      <w:numFmt w:val="bullet"/>
+      <w:lvlText w:val=""/>
+      <w:lvlJc w:val="left"/>
+      <w:pPr>
+        <w:tabs>
+          <w:tab w:val="num" w:pos="720"/>
+        </w:tabs>
+        <w:ind w:left="720" w:hanging="360"/>
+      </w:pPr>
+      <w:rPr>
+        <w:rFonts w:ascii="Symbol" w:hAnsi="Symbol" w:hint="default"/>
+        <w:sz w:val="20"/>
+      </w:rPr>
+    </w:lvl>
+    <w:lvl w:ilvl="1">
+      <w:start w:val="1"/>
+      <w:numFmt w:val="bullet"/>
+      <w:lvlText w:val="o"/>
+      <w:lvlJc w:val="left"/>
+      <w:pPr>
+        <w:tabs>
+          <w:tab w:val="num" w:pos="1440"/>
+        </w:tabs>
+        <w:ind w:left="1440" w:hanging="360"/>
+      </w:pPr>
+      <w:rPr>
+        <w:rFonts w:ascii="Courier New" w:hAnsi="Courier New" w:hint="default"/>
+        <w:sz w:val="20"/>
+      </w:rPr>
+    </w:lvl>
+    <w:lvl w:ilvl="2" w:tentative="1">
+      <w:start w:val="1"/>
+      <w:numFmt w:val="bullet"/>
+      <w:lvlText w:val=""/>
+      <w:lvlJc w:val="left"/>
+      <w:pPr>
+        <w:tabs>
+          <w:tab w:val="num" w:pos="2160"/>
+        </w:tabs>
+        <w:ind w:left="2160" w:hanging="360"/>
+      </w:pPr>
+      <w:rPr>
+        <w:rFonts w:ascii="Wingdings" w:hAnsi="Wingdings" w:hint="default"/>
+        <w:sz w:val="20"/>
+      </w:rPr>
+    </w:lvl>
+    <w:lvl w:ilvl="3" w:tentative="1">
+      <w:start w:val="1"/>
+      <w:numFmt w:val="bullet"/>
+      <w:lvlText w:val=""/>
+      <w:lvlJc w:val="left"/>
+      <w:pPr>
+        <w:tabs>
+          <w:tab w:val="num" w:pos="2880"/>
+        </w:tabs>
+        <w:ind w:left="2880" w:hanging="360"/>
+      </w:pPr>
+      <w:rPr>
+        <w:rFonts w:ascii="Wingdings" w:hAnsi="Wingdings" w:hint="default"/>
+        <w:sz w:val="20"/>
+      </w:rPr>
+    </w:lvl>
+    <w:lvl w:ilvl="4" w:tentative="1">
+      <w:start w:val="1"/>
+      <w:numFmt w:val="bullet"/>
+      <w:lvlText w:val=""/>
+      <w:lvlJc w:val="left"/>
+      <w:pPr>
+        <w:tabs>
+          <w:tab w:val="num" w:pos="3600"/>
+        </w:tabs>
+        <w:ind w:left="3600" w:hanging="360"/>
+      </w:pPr>
+      <w:rPr>
+        <w:rFonts w:ascii="Wingdings" w:hAnsi="Wingdings" w:hint="default"/>
+        <w:sz w:val="20"/>
+      </w:rPr>
+    </w:lvl>
+    <w:lvl w:ilvl="5" w:tentative="1">
+      <w:start w:val="1"/>
+      <w:numFmt w:val="bullet"/>
+      <w:lvlText w:val=""/>
+      <w:lvlJc w:val="left"/>
+      <w:pPr>
+        <w:tabs>
+          <w:tab w:val="num" w:pos="4320"/>
+        </w:tabs>
+        <w:ind w:left="4320" w:hanging="360"/>
+      </w:pPr>
+      <w:rPr>
+        <w:rFonts w:ascii="Wingdings" w:hAnsi="Wingdings" w:hint="default"/>
+        <w:sz w:val="20"/>
+      </w:rPr>
+    </w:lvl>
+    <w:lvl w:ilvl="6" w:tentative="1">
+      <w:start w:val="1"/>
+      <w:numFmt w:val="bullet"/>
+      <w:lvlText w:val=""/>
+      <w:lvlJc w:val="left"/>
+      <w:pPr>
+        <w:tabs>
+          <w:tab w:val="num" w:pos="5040"/>
+        </w:tabs>
+        <w:ind w:left="5040" w:hanging="360"/>
+      </w:pPr>
+      <w:rPr>
+        <w:rFonts w:ascii="Wingdings" w:hAnsi="Wingdings" w:hint="default"/>
+        <w:sz w:val="20"/>
+      </w:rPr>
+    </w:lvl>
+    <w:lvl w:ilvl="7" w:tentative="1">
+      <w:start w:val="1"/>
+      <w:numFmt w:val="bullet"/>
+      <w:lvlText w:val=""/>
+      <w:lvlJc w:val="left"/>
+      <w:pPr>
+        <w:tabs>
+          <w:tab w:val="num" w:pos="5760"/>
+        </w:tabs>
+        <w:ind w:left="5760" w:hanging="360"/>
+      </w:pPr>
+      <w:rPr>
+        <w:rFonts w:ascii="Wingdings" w:hAnsi="Wingdings" w:hint="default"/>
+        <w:sz w:val="20"/>
+      </w:rPr>
+    </w:lvl>
+    <w:lvl w:ilvl="8" w:tentative="1">
+      <w:start w:val="1"/>
+      <w:numFmt w:val="bullet"/>
+      <w:lvlText w:val=""/>
+      <w:lvlJc w:val="left"/>
+      <w:pPr>
+        <w:tabs>
+          <w:tab w:val="num" w:pos="6480"/>
+        </w:tabs>
+        <w:ind w:left="6480" w:hanging="360"/>
+      </w:pPr>
+      <w:rPr>
+        <w:rFonts w:ascii="Wingdings" w:hAnsi="Wingdings" w:hint="default"/>
+        <w:sz w:val="20"/>
+      </w:rPr>
+    </w:lvl>
+  </w:abstractNum>
+  <w:abstractNum w:abstractNumId="20" w15:restartNumberingAfterBreak="0">
+    <w:nsid w:val="655F48F7"/>
+    <w:multiLevelType w:val="multilevel"/>
+    <w:tmpl w:val="EFA8C986"/>
+    <w:lvl w:ilvl="0">
+      <w:start w:val="1"/>
+      <w:numFmt w:val="bullet"/>
+      <w:lvlText w:val=""/>
+      <w:lvlJc w:val="left"/>
+      <w:pPr>
+        <w:tabs>
+          <w:tab w:val="num" w:pos="720"/>
+        </w:tabs>
+        <w:ind w:left="720" w:hanging="360"/>
+      </w:pPr>
+      <w:rPr>
+        <w:rFonts w:ascii="Symbol" w:hAnsi="Symbol" w:hint="default"/>
+        <w:sz w:val="20"/>
+      </w:rPr>
+    </w:lvl>
+    <w:lvl w:ilvl="1">
+      <w:start w:val="1"/>
+      <w:numFmt w:val="bullet"/>
+      <w:lvlText w:val="o"/>
+      <w:lvlJc w:val="left"/>
+      <w:pPr>
+        <w:tabs>
+          <w:tab w:val="num" w:pos="1440"/>
+        </w:tabs>
+        <w:ind w:left="1440" w:hanging="360"/>
+      </w:pPr>
+      <w:rPr>
+        <w:rFonts w:ascii="Courier New" w:hAnsi="Courier New" w:hint="default"/>
+        <w:sz w:val="20"/>
+      </w:rPr>
+    </w:lvl>
+    <w:lvl w:ilvl="2" w:tentative="1">
+      <w:start w:val="1"/>
+      <w:numFmt w:val="bullet"/>
+      <w:lvlText w:val=""/>
+      <w:lvlJc w:val="left"/>
+      <w:pPr>
+        <w:tabs>
+          <w:tab w:val="num" w:pos="2160"/>
+        </w:tabs>
+        <w:ind w:left="2160" w:hanging="360"/>
+      </w:pPr>
+      <w:rPr>
+        <w:rFonts w:ascii="Wingdings" w:hAnsi="Wingdings" w:hint="default"/>
+        <w:sz w:val="20"/>
+      </w:rPr>
+    </w:lvl>
+    <w:lvl w:ilvl="3" w:tentative="1">
+      <w:start w:val="1"/>
+      <w:numFmt w:val="bullet"/>
+      <w:lvlText w:val=""/>
+      <w:lvlJc w:val="left"/>
+      <w:pPr>
+        <w:tabs>
+          <w:tab w:val="num" w:pos="2880"/>
+        </w:tabs>
+        <w:ind w:left="2880" w:hanging="360"/>
+      </w:pPr>
+      <w:rPr>
+        <w:rFonts w:ascii="Wingdings" w:hAnsi="Wingdings" w:hint="default"/>
+        <w:sz w:val="20"/>
+      </w:rPr>
+    </w:lvl>
+    <w:lvl w:ilvl="4" w:tentative="1">
+      <w:start w:val="1"/>
+      <w:numFmt w:val="bullet"/>
+      <w:lvlText w:val=""/>
+      <w:lvlJc w:val="left"/>
+      <w:pPr>
+        <w:tabs>
+          <w:tab w:val="num" w:pos="3600"/>
+        </w:tabs>
+        <w:ind w:left="3600" w:hanging="360"/>
+      </w:pPr>
+      <w:rPr>
+        <w:rFonts w:ascii="Wingdings" w:hAnsi="Wingdings" w:hint="default"/>
+        <w:sz w:val="20"/>
+      </w:rPr>
+    </w:lvl>
+    <w:lvl w:ilvl="5" w:tentative="1">
+      <w:start w:val="1"/>
+      <w:numFmt w:val="bullet"/>
+      <w:lvlText w:val=""/>
+      <w:lvlJc w:val="left"/>
+      <w:pPr>
+        <w:tabs>
+          <w:tab w:val="num" w:pos="4320"/>
+        </w:tabs>
+        <w:ind w:left="4320" w:hanging="360"/>
+      </w:pPr>
+      <w:rPr>
+        <w:rFonts w:ascii="Wingdings" w:hAnsi="Wingdings" w:hint="default"/>
+        <w:sz w:val="20"/>
+      </w:rPr>
+    </w:lvl>
+    <w:lvl w:ilvl="6" w:tentative="1">
+      <w:start w:val="1"/>
+      <w:numFmt w:val="bullet"/>
+      <w:lvlText w:val=""/>
+      <w:lvlJc w:val="left"/>
+      <w:pPr>
+        <w:tabs>
+          <w:tab w:val="num" w:pos="5040"/>
+        </w:tabs>
+        <w:ind w:left="5040" w:hanging="360"/>
+      </w:pPr>
+      <w:rPr>
+        <w:rFonts w:ascii="Wingdings" w:hAnsi="Wingdings" w:hint="default"/>
+        <w:sz w:val="20"/>
+      </w:rPr>
+    </w:lvl>
+    <w:lvl w:ilvl="7" w:tentative="1">
+      <w:start w:val="1"/>
+      <w:numFmt w:val="bullet"/>
+      <w:lvlText w:val=""/>
+      <w:lvlJc w:val="left"/>
+      <w:pPr>
+        <w:tabs>
+          <w:tab w:val="num" w:pos="5760"/>
+        </w:tabs>
+        <w:ind w:left="5760" w:hanging="360"/>
+      </w:pPr>
+      <w:rPr>
+        <w:rFonts w:ascii="Wingdings" w:hAnsi="Wingdings" w:hint="default"/>
+        <w:sz w:val="20"/>
+      </w:rPr>
+    </w:lvl>
+    <w:lvl w:ilvl="8" w:tentative="1">
+      <w:start w:val="1"/>
+      <w:numFmt w:val="bullet"/>
+      <w:lvlText w:val=""/>
+      <w:lvlJc w:val="left"/>
+      <w:pPr>
+        <w:tabs>
+          <w:tab w:val="num" w:pos="6480"/>
+        </w:tabs>
+        <w:ind w:left="6480" w:hanging="360"/>
+      </w:pPr>
+      <w:rPr>
+        <w:rFonts w:ascii="Wingdings" w:hAnsi="Wingdings" w:hint="default"/>
+        <w:sz w:val="20"/>
+      </w:rPr>
+    </w:lvl>
+  </w:abstractNum>
+  <w:abstractNum w:abstractNumId="21" w15:restartNumberingAfterBreak="0">
+    <w:nsid w:val="672D71EB"/>
+    <w:multiLevelType w:val="multilevel"/>
+    <w:tmpl w:val="204C74F2"/>
+    <w:lvl w:ilvl="0">
+      <w:start w:val="1"/>
+      <w:numFmt w:val="bullet"/>
+      <w:lvlText w:val=""/>
+      <w:lvlJc w:val="left"/>
+      <w:pPr>
+        <w:tabs>
+          <w:tab w:val="num" w:pos="720"/>
+        </w:tabs>
+        <w:ind w:left="720" w:hanging="360"/>
+      </w:pPr>
+      <w:rPr>
+        <w:rFonts w:ascii="Symbol" w:hAnsi="Symbol" w:hint="default"/>
+        <w:sz w:val="20"/>
+      </w:rPr>
+    </w:lvl>
+    <w:lvl w:ilvl="1">
+      <w:start w:val="1"/>
+      <w:numFmt w:val="bullet"/>
+      <w:lvlText w:val="o"/>
+      <w:lvlJc w:val="left"/>
+      <w:pPr>
+        <w:tabs>
+          <w:tab w:val="num" w:pos="1440"/>
+        </w:tabs>
+        <w:ind w:left="1440" w:hanging="360"/>
+      </w:pPr>
+      <w:rPr>
+        <w:rFonts w:ascii="Courier New" w:hAnsi="Courier New" w:hint="default"/>
+        <w:sz w:val="20"/>
+      </w:rPr>
+    </w:lvl>
+    <w:lvl w:ilvl="2" w:tentative="1">
+      <w:start w:val="1"/>
+      <w:numFmt w:val="bullet"/>
+      <w:lvlText w:val=""/>
+      <w:lvlJc w:val="left"/>
+      <w:pPr>
+        <w:tabs>
+          <w:tab w:val="num" w:pos="2160"/>
+        </w:tabs>
+        <w:ind w:left="2160" w:hanging="360"/>
+      </w:pPr>
+      <w:rPr>
+        <w:rFonts w:ascii="Wingdings" w:hAnsi="Wingdings" w:hint="default"/>
+        <w:sz w:val="20"/>
+      </w:rPr>
+    </w:lvl>
+    <w:lvl w:ilvl="3" w:tentative="1">
+      <w:start w:val="1"/>
+      <w:numFmt w:val="bullet"/>
+      <w:lvlText w:val=""/>
+      <w:lvlJc w:val="left"/>
+      <w:pPr>
+        <w:tabs>
+          <w:tab w:val="num" w:pos="2880"/>
+        </w:tabs>
+        <w:ind w:left="2880" w:hanging="360"/>
+      </w:pPr>
+      <w:rPr>
+        <w:rFonts w:ascii="Wingdings" w:hAnsi="Wingdings" w:hint="default"/>
+        <w:sz w:val="20"/>
+      </w:rPr>
+    </w:lvl>
+    <w:lvl w:ilvl="4" w:tentative="1">
+      <w:start w:val="1"/>
+      <w:numFmt w:val="bullet"/>
+      <w:lvlText w:val=""/>
+      <w:lvlJc w:val="left"/>
+      <w:pPr>
+        <w:tabs>
+          <w:tab w:val="num" w:pos="3600"/>
+        </w:tabs>
+        <w:ind w:left="3600" w:hanging="360"/>
+      </w:pPr>
+      <w:rPr>
+        <w:rFonts w:ascii="Wingdings" w:hAnsi="Wingdings" w:hint="default"/>
+        <w:sz w:val="20"/>
+      </w:rPr>
+    </w:lvl>
+    <w:lvl w:ilvl="5" w:tentative="1">
+      <w:start w:val="1"/>
+      <w:numFmt w:val="bullet"/>
+      <w:lvlText w:val=""/>
+      <w:lvlJc w:val="left"/>
+      <w:pPr>
+        <w:tabs>
+          <w:tab w:val="num" w:pos="4320"/>
+        </w:tabs>
+        <w:ind w:left="4320" w:hanging="360"/>
+      </w:pPr>
+      <w:rPr>
+        <w:rFonts w:ascii="Wingdings" w:hAnsi="Wingdings" w:hint="default"/>
+        <w:sz w:val="20"/>
+      </w:rPr>
+    </w:lvl>
+    <w:lvl w:ilvl="6" w:tentative="1">
+      <w:start w:val="1"/>
+      <w:numFmt w:val="bullet"/>
+      <w:lvlText w:val=""/>
+      <w:lvlJc w:val="left"/>
+      <w:pPr>
+        <w:tabs>
+          <w:tab w:val="num" w:pos="5040"/>
+        </w:tabs>
+        <w:ind w:left="5040" w:hanging="360"/>
+      </w:pPr>
+      <w:rPr>
+        <w:rFonts w:ascii="Wingdings" w:hAnsi="Wingdings" w:hint="default"/>
+        <w:sz w:val="20"/>
+      </w:rPr>
+    </w:lvl>
+    <w:lvl w:ilvl="7" w:tentative="1">
+      <w:start w:val="1"/>
+      <w:numFmt w:val="bullet"/>
+      <w:lvlText w:val=""/>
+      <w:lvlJc w:val="left"/>
+      <w:pPr>
+        <w:tabs>
+          <w:tab w:val="num" w:pos="5760"/>
+        </w:tabs>
+        <w:ind w:left="5760" w:hanging="360"/>
+      </w:pPr>
+      <w:rPr>
+        <w:rFonts w:ascii="Wingdings" w:hAnsi="Wingdings" w:hint="default"/>
+        <w:sz w:val="20"/>
+      </w:rPr>
+    </w:lvl>
+    <w:lvl w:ilvl="8" w:tentative="1">
+      <w:start w:val="1"/>
+      <w:numFmt w:val="bullet"/>
+      <w:lvlText w:val=""/>
+      <w:lvlJc w:val="left"/>
+      <w:pPr>
+        <w:tabs>
+          <w:tab w:val="num" w:pos="6480"/>
+        </w:tabs>
+        <w:ind w:left="6480" w:hanging="360"/>
+      </w:pPr>
+      <w:rPr>
+        <w:rFonts w:ascii="Wingdings" w:hAnsi="Wingdings" w:hint="default"/>
+        <w:sz w:val="20"/>
+      </w:rPr>
+    </w:lvl>
+  </w:abstractNum>
+  <w:abstractNum w:abstractNumId="22" w15:restartNumberingAfterBreak="0">
+    <w:nsid w:val="76016271"/>
+    <w:multiLevelType w:val="multilevel"/>
+    <w:tmpl w:val="9466935A"/>
+    <w:lvl w:ilvl="0">
+      <w:start w:val="1"/>
+      <w:numFmt w:val="bullet"/>
+      <w:lvlText w:val=""/>
+      <w:lvlJc w:val="left"/>
+      <w:pPr>
+        <w:tabs>
+          <w:tab w:val="num" w:pos="720"/>
+        </w:tabs>
+        <w:ind w:left="720" w:hanging="360"/>
+      </w:pPr>
+      <w:rPr>
+        <w:rFonts w:ascii="Symbol" w:hAnsi="Symbol" w:hint="default"/>
+        <w:sz w:val="20"/>
+      </w:rPr>
+    </w:lvl>
+    <w:lvl w:ilvl="1">
+      <w:start w:val="1"/>
+      <w:numFmt w:val="decimal"/>
+      <w:lvlText w:val="%2."/>
+      <w:lvlJc w:val="left"/>
+      <w:pPr>
+        <w:tabs>
+          <w:tab w:val="num" w:pos="1440"/>
+        </w:tabs>
+        <w:ind w:left="1440" w:hanging="360"/>
+      </w:pPr>
+    </w:lvl>
+    <w:lvl w:ilvl="2" w:tentative="1">
+      <w:start w:val="1"/>
+      <w:numFmt w:val="bullet"/>
+      <w:lvlText w:val=""/>
+      <w:lvlJc w:val="left"/>
+      <w:pPr>
+        <w:tabs>
+          <w:tab w:val="num" w:pos="2160"/>
+        </w:tabs>
+        <w:ind w:left="2160" w:hanging="360"/>
+      </w:pPr>
+      <w:rPr>
+        <w:rFonts w:ascii="Wingdings" w:hAnsi="Wingdings" w:hint="default"/>
+        <w:sz w:val="20"/>
+      </w:rPr>
+    </w:lvl>
+    <w:lvl w:ilvl="3" w:tentative="1">
+      <w:start w:val="1"/>
+      <w:numFmt w:val="bullet"/>
+      <w:lvlText w:val=""/>
+      <w:lvlJc w:val="left"/>
+      <w:pPr>
+        <w:tabs>
+          <w:tab w:val="num" w:pos="2880"/>
+        </w:tabs>
+        <w:ind w:left="2880" w:hanging="360"/>
+      </w:pPr>
+      <w:rPr>
+        <w:rFonts w:ascii="Wingdings" w:hAnsi="Wingdings" w:hint="default"/>
+        <w:sz w:val="20"/>
+      </w:rPr>
+    </w:lvl>
+    <w:lvl w:ilvl="4" w:tentative="1">
+      <w:start w:val="1"/>
+      <w:numFmt w:val="bullet"/>
+      <w:lvlText w:val=""/>
+      <w:lvlJc w:val="left"/>
+      <w:pPr>
+        <w:tabs>
+          <w:tab w:val="num" w:pos="3600"/>
+        </w:tabs>
+        <w:ind w:left="3600" w:hanging="360"/>
+      </w:pPr>
+      <w:rPr>
+        <w:rFonts w:ascii="Wingdings" w:hAnsi="Wingdings" w:hint="default"/>
+        <w:sz w:val="20"/>
+      </w:rPr>
+    </w:lvl>
+    <w:lvl w:ilvl="5" w:tentative="1">
+      <w:start w:val="1"/>
+      <w:numFmt w:val="bullet"/>
+      <w:lvlText w:val=""/>
+      <w:lvlJc w:val="left"/>
+      <w:pPr>
+        <w:tabs>
+          <w:tab w:val="num" w:pos="4320"/>
+        </w:tabs>
+        <w:ind w:left="4320" w:hanging="360"/>
+      </w:pPr>
+      <w:rPr>
+        <w:rFonts w:ascii="Wingdings" w:hAnsi="Wingdings" w:hint="default"/>
+        <w:sz w:val="20"/>
+      </w:rPr>
+    </w:lvl>
+    <w:lvl w:ilvl="6" w:tentative="1">
+      <w:start w:val="1"/>
+      <w:numFmt w:val="bullet"/>
+      <w:lvlText w:val=""/>
+      <w:lvlJc w:val="left"/>
+      <w:pPr>
+        <w:tabs>
+          <w:tab w:val="num" w:pos="5040"/>
+        </w:tabs>
+        <w:ind w:left="5040" w:hanging="360"/>
+      </w:pPr>
+      <w:rPr>
+        <w:rFonts w:ascii="Wingdings" w:hAnsi="Wingdings" w:hint="default"/>
+        <w:sz w:val="20"/>
+      </w:rPr>
+    </w:lvl>
+    <w:lvl w:ilvl="7" w:tentative="1">
+      <w:start w:val="1"/>
+      <w:numFmt w:val="bullet"/>
+      <w:lvlText w:val=""/>
+      <w:lvlJc w:val="left"/>
+      <w:pPr>
+        <w:tabs>
+          <w:tab w:val="num" w:pos="5760"/>
+        </w:tabs>
+        <w:ind w:left="5760" w:hanging="360"/>
+      </w:pPr>
+      <w:rPr>
+        <w:rFonts w:ascii="Wingdings" w:hAnsi="Wingdings" w:hint="default"/>
+        <w:sz w:val="20"/>
+      </w:rPr>
+    </w:lvl>
+    <w:lvl w:ilvl="8" w:tentative="1">
+      <w:start w:val="1"/>
+      <w:numFmt w:val="bullet"/>
+      <w:lvlText w:val=""/>
+      <w:lvlJc w:val="left"/>
+      <w:pPr>
+        <w:tabs>
+          <w:tab w:val="num" w:pos="6480"/>
+        </w:tabs>
+        <w:ind w:left="6480" w:hanging="360"/>
+      </w:pPr>
+      <w:rPr>
+        <w:rFonts w:ascii="Wingdings" w:hAnsi="Wingdings" w:hint="default"/>
+        <w:sz w:val="20"/>
+      </w:rPr>
+    </w:lvl>
+  </w:abstractNum>
+  <w:abstractNum w:abstractNumId="23" w15:restartNumberingAfterBreak="0">
+    <w:nsid w:val="78703237"/>
+    <w:multiLevelType w:val="multilevel"/>
+    <w:tmpl w:val="2968044C"/>
+    <w:lvl w:ilvl="0">
+      <w:start w:val="1"/>
+      <w:numFmt w:val="bullet"/>
+      <w:lvlText w:val=""/>
+      <w:lvlJc w:val="left"/>
+      <w:pPr>
+        <w:tabs>
+          <w:tab w:val="num" w:pos="720"/>
+        </w:tabs>
+        <w:ind w:left="720" w:hanging="360"/>
+      </w:pPr>
+      <w:rPr>
+        <w:rFonts w:ascii="Symbol" w:hAnsi="Symbol" w:hint="default"/>
+        <w:sz w:val="20"/>
+      </w:rPr>
+    </w:lvl>
+    <w:lvl w:ilvl="1">
+      <w:start w:val="1"/>
+      <w:numFmt w:val="bullet"/>
+      <w:lvlText w:val="o"/>
+      <w:lvlJc w:val="left"/>
+      <w:pPr>
+        <w:tabs>
+          <w:tab w:val="num" w:pos="1440"/>
+        </w:tabs>
+        <w:ind w:left="1440" w:hanging="360"/>
+      </w:pPr>
+      <w:rPr>
+        <w:rFonts w:ascii="Courier New" w:hAnsi="Courier New" w:hint="default"/>
+        <w:sz w:val="20"/>
+      </w:rPr>
+    </w:lvl>
+    <w:lvl w:ilvl="2" w:tentative="1">
+      <w:start w:val="1"/>
+      <w:numFmt w:val="bullet"/>
+      <w:lvlText w:val=""/>
+      <w:lvlJc w:val="left"/>
+      <w:pPr>
+        <w:tabs>
+          <w:tab w:val="num" w:pos="2160"/>
+        </w:tabs>
+        <w:ind w:left="2160" w:hanging="360"/>
+      </w:pPr>
+      <w:rPr>
+        <w:rFonts w:ascii="Wingdings" w:hAnsi="Wingdings" w:hint="default"/>
+        <w:sz w:val="20"/>
+      </w:rPr>
+    </w:lvl>
+    <w:lvl w:ilvl="3" w:tentative="1">
+      <w:start w:val="1"/>
+      <w:numFmt w:val="bullet"/>
+      <w:lvlText w:val=""/>
+      <w:lvlJc w:val="left"/>
+      <w:pPr>
+        <w:tabs>
+          <w:tab w:val="num" w:pos="2880"/>
+        </w:tabs>
+        <w:ind w:left="2880" w:hanging="360"/>
+      </w:pPr>
+      <w:rPr>
+        <w:rFonts w:ascii="Wingdings" w:hAnsi="Wingdings" w:hint="default"/>
+        <w:sz w:val="20"/>
+      </w:rPr>
+    </w:lvl>
+    <w:lvl w:ilvl="4" w:tentative="1">
+      <w:start w:val="1"/>
+      <w:numFmt w:val="bullet"/>
+      <w:lvlText w:val=""/>
+      <w:lvlJc w:val="left"/>
+      <w:pPr>
+        <w:tabs>
+          <w:tab w:val="num" w:pos="3600"/>
+        </w:tabs>
+        <w:ind w:left="3600" w:hanging="360"/>
+      </w:pPr>
+      <w:rPr>
+        <w:rFonts w:ascii="Wingdings" w:hAnsi="Wingdings" w:hint="default"/>
+        <w:sz w:val="20"/>
+      </w:rPr>
+    </w:lvl>
+    <w:lvl w:ilvl="5" w:tentative="1">
+      <w:start w:val="1"/>
+      <w:numFmt w:val="bullet"/>
+      <w:lvlText w:val=""/>
+      <w:lvlJc w:val="left"/>
+      <w:pPr>
+        <w:tabs>
+          <w:tab w:val="num" w:pos="4320"/>
+        </w:tabs>
+        <w:ind w:left="4320" w:hanging="360"/>
+      </w:pPr>
+      <w:rPr>
+        <w:rFonts w:ascii="Wingdings" w:hAnsi="Wingdings" w:hint="default"/>
+        <w:sz w:val="20"/>
+      </w:rPr>
+    </w:lvl>
+    <w:lvl w:ilvl="6" w:tentative="1">
+      <w:start w:val="1"/>
+      <w:numFmt w:val="bullet"/>
+      <w:lvlText w:val=""/>
+      <w:lvlJc w:val="left"/>
+      <w:pPr>
+        <w:tabs>
+          <w:tab w:val="num" w:pos="5040"/>
+        </w:tabs>
+        <w:ind w:left="5040" w:hanging="360"/>
+      </w:pPr>
+      <w:rPr>
+        <w:rFonts w:ascii="Wingdings" w:hAnsi="Wingdings" w:hint="default"/>
+        <w:sz w:val="20"/>
+      </w:rPr>
+    </w:lvl>
+    <w:lvl w:ilvl="7" w:tentative="1">
+      <w:start w:val="1"/>
+      <w:numFmt w:val="bullet"/>
+      <w:lvlText w:val=""/>
+      <w:lvlJc w:val="left"/>
+      <w:pPr>
+        <w:tabs>
+          <w:tab w:val="num" w:pos="5760"/>
+        </w:tabs>
+        <w:ind w:left="5760" w:hanging="360"/>
+      </w:pPr>
+      <w:rPr>
+        <w:rFonts w:ascii="Wingdings" w:hAnsi="Wingdings" w:hint="default"/>
+        <w:sz w:val="20"/>
+      </w:rPr>
+    </w:lvl>
+    <w:lvl w:ilvl="8" w:tentative="1">
+      <w:start w:val="1"/>
+      <w:numFmt w:val="bullet"/>
+      <w:lvlText w:val=""/>
+      <w:lvlJc w:val="left"/>
+      <w:pPr>
+        <w:tabs>
+          <w:tab w:val="num" w:pos="6480"/>
+        </w:tabs>
+        <w:ind w:left="6480" w:hanging="360"/>
+      </w:pPr>
+      <w:rPr>
+        <w:rFonts w:ascii="Wingdings" w:hAnsi="Wingdings" w:hint="default"/>
+        <w:sz w:val="20"/>
+      </w:rPr>
+    </w:lvl>
+  </w:abstractNum>
   <w:num w:numId="1" w16cid:durableId="2110393538">
+    <w:abstractNumId w:val="6"/>
+  </w:num>
+  <w:num w:numId="2" w16cid:durableId="906382625">
+    <w:abstractNumId w:val="9"/>
+  </w:num>
+  <w:num w:numId="3" w16cid:durableId="1895853702">
+    <w:abstractNumId w:val="15"/>
+  </w:num>
+  <w:num w:numId="4" w16cid:durableId="1257983223">
+    <w:abstractNumId w:val="7"/>
+  </w:num>
+  <w:num w:numId="5" w16cid:durableId="1159269155">
+    <w:abstractNumId w:val="1"/>
+  </w:num>
+  <w:num w:numId="6" w16cid:durableId="802188752">
+    <w:abstractNumId w:val="10"/>
+  </w:num>
+  <w:num w:numId="7" w16cid:durableId="1673294507">
     <w:abstractNumId w:val="3"/>
   </w:num>
-  <w:num w:numId="2" w16cid:durableId="906382625">
-    <w:abstractNumId w:val="6"/>
+  <w:num w:numId="8" w16cid:durableId="270280957">
+    <w:abstractNumId w:val="2"/>
   </w:num>
-  <w:num w:numId="3" w16cid:durableId="1895853702">
-    <w:abstractNumId w:val="9"/>
+  <w:num w:numId="9" w16cid:durableId="1378966432">
+    <w:abstractNumId w:val="8"/>
   </w:num>
-  <w:num w:numId="4" w16cid:durableId="1257983223">
+  <w:num w:numId="10" w16cid:durableId="1729956909">
+    <w:abstractNumId w:val="11"/>
+  </w:num>
+  <w:num w:numId="11" w16cid:durableId="1312100323">
+    <w:abstractNumId w:val="16"/>
+  </w:num>
+  <w:num w:numId="12" w16cid:durableId="195699482">
+    <w:abstractNumId w:val="5"/>
+  </w:num>
+  <w:num w:numId="13" w16cid:durableId="608507810">
+    <w:abstractNumId w:val="19"/>
+  </w:num>
+  <w:num w:numId="14" w16cid:durableId="1521896127">
+    <w:abstractNumId w:val="20"/>
+  </w:num>
+  <w:num w:numId="15" w16cid:durableId="1988512428">
+    <w:abstractNumId w:val="12"/>
+  </w:num>
+  <w:num w:numId="16" w16cid:durableId="1576236452">
+    <w:abstractNumId w:val="0"/>
+  </w:num>
+  <w:num w:numId="17" w16cid:durableId="651447953">
+    <w:abstractNumId w:val="23"/>
+  </w:num>
+  <w:num w:numId="18" w16cid:durableId="1069041037">
+    <w:abstractNumId w:val="14"/>
+  </w:num>
+  <w:num w:numId="19" w16cid:durableId="1202212578">
+    <w:abstractNumId w:val="14"/>
+    <w:lvlOverride w:ilvl="1">
+      <w:lvl w:ilvl="1">
+        <w:numFmt w:val="decimal"/>
+        <w:lvlText w:val="%2."/>
+        <w:lvlJc w:val="left"/>
+      </w:lvl>
+    </w:lvlOverride>
+  </w:num>
+  <w:num w:numId="20" w16cid:durableId="563948798">
+    <w:abstractNumId w:val="13"/>
+  </w:num>
+  <w:num w:numId="21" w16cid:durableId="1899704315">
+    <w:abstractNumId w:val="18"/>
+  </w:num>
+  <w:num w:numId="22" w16cid:durableId="1785684280">
+    <w:abstractNumId w:val="21"/>
+  </w:num>
+  <w:num w:numId="23" w16cid:durableId="973485167">
+    <w:abstractNumId w:val="22"/>
+  </w:num>
+  <w:num w:numId="24" w16cid:durableId="906190143">
+    <w:abstractNumId w:val="22"/>
+    <w:lvlOverride w:ilvl="1">
+      <w:lvl w:ilvl="1">
+        <w:numFmt w:val="bullet"/>
+        <w:lvlText w:val="o"/>
+        <w:lvlJc w:val="left"/>
+        <w:pPr>
+          <w:tabs>
+            <w:tab w:val="num" w:pos="1440"/>
+          </w:tabs>
+          <w:ind w:left="1440" w:hanging="360"/>
+        </w:pPr>
+        <w:rPr>
+          <w:rFonts w:ascii="Courier New" w:hAnsi="Courier New" w:hint="default"/>
+          <w:sz w:val="20"/>
+        </w:rPr>
+      </w:lvl>
+    </w:lvlOverride>
+  </w:num>
+  <w:num w:numId="25" w16cid:durableId="77530316">
+    <w:abstractNumId w:val="22"/>
+    <w:lvlOverride w:ilvl="1">
+      <w:lvl w:ilvl="1">
+        <w:numFmt w:val="bullet"/>
+        <w:lvlText w:val="o"/>
+        <w:lvlJc w:val="left"/>
+        <w:pPr>
+          <w:tabs>
+            <w:tab w:val="num" w:pos="1440"/>
+          </w:tabs>
+          <w:ind w:left="1440" w:hanging="360"/>
+        </w:pPr>
+        <w:rPr>
+          <w:rFonts w:ascii="Courier New" w:hAnsi="Courier New" w:hint="default"/>
+          <w:sz w:val="20"/>
+        </w:rPr>
+      </w:lvl>
+    </w:lvlOverride>
+  </w:num>
+  <w:num w:numId="26" w16cid:durableId="191457600">
+    <w:abstractNumId w:val="22"/>
+    <w:lvlOverride w:ilvl="1">
+      <w:lvl w:ilvl="1">
+        <w:numFmt w:val="bullet"/>
+        <w:lvlText w:val="o"/>
+        <w:lvlJc w:val="left"/>
+        <w:pPr>
+          <w:tabs>
+            <w:tab w:val="num" w:pos="1440"/>
+          </w:tabs>
+          <w:ind w:left="1440" w:hanging="360"/>
+        </w:pPr>
+        <w:rPr>
+          <w:rFonts w:ascii="Courier New" w:hAnsi="Courier New" w:hint="default"/>
+          <w:sz w:val="20"/>
+        </w:rPr>
+      </w:lvl>
+    </w:lvlOverride>
+  </w:num>
+  <w:num w:numId="27" w16cid:durableId="866676565">
     <w:abstractNumId w:val="4"/>
   </w:num>
-  <w:num w:numId="5" w16cid:durableId="1159269155">
-    <w:abstractNumId w:val="0"/>
-  </w:num>
-  <w:num w:numId="6" w16cid:durableId="802188752">
-    <w:abstractNumId w:val="7"/>
-  </w:num>
-  <w:num w:numId="7" w16cid:durableId="1673294507">
-    <w:abstractNumId w:val="2"/>
-  </w:num>
-  <w:num w:numId="8" w16cid:durableId="270280957">
-    <w:abstractNumId w:val="1"/>
-  </w:num>
-  <w:num w:numId="9" w16cid:durableId="1378966432">
-    <w:abstractNumId w:val="5"/>
-  </w:num>
-  <w:num w:numId="10" w16cid:durableId="1729956909">
-    <w:abstractNumId w:val="8"/>
+  <w:num w:numId="28" w16cid:durableId="1315454877">
+    <w:abstractNumId w:val="17"/>
   </w:num>
 </w:numbering>
 </file>
@@ -2887,7 +5256,6 @@
   <w:style w:type="character" w:default="1" w:styleId="Fontepargpadro">
     <w:name w:val="Default Paragraph Font"/>
     <w:uiPriority w:val="1"/>
-    <w:semiHidden/>
     <w:unhideWhenUsed/>
   </w:style>
   <w:style w:type="table" w:default="1" w:styleId="Tabelanormal">

</xml_diff>